<commit_message>
course report/slides: add course-content mapping (MoleculeNet/DeepChem caliber) + scope note; re-export both PDFs from current docx/pptx
Assisted-by: Claude
</commit_message>
<xml_diff>
--- a/report/课程实验报告_BACE.docx
+++ b/report/课程实验报告_BACE.docx
@@ -552,6 +552,532 @@
     </w:p>
     <w:p>
       <w:pPr>
+        <w:spacing w:after="100" w:line="300"/>
+        <w:jc w:val="both"/>
+      </w:pPr>
+      <w:r>
+        <w:rPr>
+          <w:b/>
+          <w:bCs/>
+        </w:rPr>
+        <w:t xml:space="preserve">课程内容对应：</w:t>
+      </w:r>
+      <w:r>
+        <w:t xml:space="preserve">本项目遵循课程第五讲 MoleculeNet/DeepChem 的作业口径（BACE / SMILES / 1513 / 回归 / MAE + Pearson R），完成“数据整理→模型构建→训练→分析”的完整链路；实现上用 RDKit + scikit-learn / Chemprop / HuggingFace Transformers 在同一数据任务上复现。各课程环节与本项目的对应关系如下表。</w:t>
+      </w:r>
+    </w:p>
+    <w:tbl>
+      <w:tblPr>
+        <w:tblW w:type="dxa" w:w="9360"/>
+        <w:tblBorders>
+          <w:top w:val="single" w:color="auto" w:sz="4"/>
+          <w:left w:val="single" w:color="auto" w:sz="4"/>
+          <w:bottom w:val="single" w:color="auto" w:sz="4"/>
+          <w:right w:val="single" w:color="auto" w:sz="4"/>
+          <w:insideH w:val="single" w:color="auto" w:sz="4"/>
+          <w:insideV w:val="single" w:color="auto" w:sz="4"/>
+        </w:tblBorders>
+      </w:tblPr>
+      <w:tblGrid>
+        <w:gridCol w:w="2200"/>
+        <w:gridCol w:w="7160"/>
+      </w:tblGrid>
+      <w:tr>
+        <w:trPr>
+          <w:tblHeader/>
+        </w:trPr>
+        <w:tc>
+          <w:tcPr>
+            <w:tcW w:type="dxa" w:w="2200"/>
+            <w:tcBorders>
+              <w:top w:val="single" w:color="BBBBBB" w:sz="1"/>
+              <w:left w:val="single" w:color="BBBBBB" w:sz="1"/>
+              <w:bottom w:val="single" w:color="BBBBBB" w:sz="1"/>
+              <w:right w:val="single" w:color="BBBBBB" w:sz="1"/>
+            </w:tcBorders>
+            <w:shd w:fill="1F3864" w:val="clear"/>
+            <w:tcMar>
+              <w:top w:type="dxa" w:w="60"/>
+              <w:left w:type="dxa" w:w="90"/>
+              <w:bottom w:type="dxa" w:w="60"/>
+              <w:right w:type="dxa" w:w="90"/>
+            </w:tcMar>
+          </w:tcPr>
+          <w:p>
+            <w:pPr>
+              <w:jc w:val="left"/>
+            </w:pPr>
+            <w:r>
+              <w:rPr>
+                <w:rFonts w:ascii="Times New Roman" w:cs="Times New Roman" w:eastAsia="Noto Serif CJK SC" w:hAnsi="Times New Roman"/>
+                <w:b/>
+                <w:bCs/>
+                <w:color w:val="FFFFFF"/>
+                <w:sz w:val="18"/>
+                <w:szCs w:val="18"/>
+              </w:rPr>
+              <w:t xml:space="preserve">课程环节</w:t>
+            </w:r>
+          </w:p>
+        </w:tc>
+        <w:tc>
+          <w:tcPr>
+            <w:tcW w:type="dxa" w:w="7160"/>
+            <w:tcBorders>
+              <w:top w:val="single" w:color="BBBBBB" w:sz="1"/>
+              <w:left w:val="single" w:color="BBBBBB" w:sz="1"/>
+              <w:bottom w:val="single" w:color="BBBBBB" w:sz="1"/>
+              <w:right w:val="single" w:color="BBBBBB" w:sz="1"/>
+            </w:tcBorders>
+            <w:shd w:fill="1F3864" w:val="clear"/>
+            <w:tcMar>
+              <w:top w:type="dxa" w:w="60"/>
+              <w:left w:type="dxa" w:w="90"/>
+              <w:bottom w:type="dxa" w:w="60"/>
+              <w:right w:type="dxa" w:w="90"/>
+            </w:tcMar>
+          </w:tcPr>
+          <w:p>
+            <w:pPr>
+              <w:jc w:val="center"/>
+            </w:pPr>
+            <w:r>
+              <w:rPr>
+                <w:rFonts w:ascii="Times New Roman" w:cs="Times New Roman" w:eastAsia="Noto Serif CJK SC" w:hAnsi="Times New Roman"/>
+                <w:b/>
+                <w:bCs/>
+                <w:color w:val="FFFFFF"/>
+                <w:sz w:val="18"/>
+                <w:szCs w:val="18"/>
+              </w:rPr>
+              <w:t xml:space="preserve">本项目对应内容</w:t>
+            </w:r>
+          </w:p>
+        </w:tc>
+      </w:tr>
+      <w:tr>
+        <w:tc>
+          <w:tcPr>
+            <w:tcW w:type="dxa" w:w="2200"/>
+            <w:tcBorders>
+              <w:top w:val="single" w:color="BBBBBB" w:sz="1"/>
+              <w:left w:val="single" w:color="BBBBBB" w:sz="1"/>
+              <w:bottom w:val="single" w:color="BBBBBB" w:sz="1"/>
+              <w:right w:val="single" w:color="BBBBBB" w:sz="1"/>
+            </w:tcBorders>
+            <w:shd w:fill="FFFFFF" w:val="clear"/>
+            <w:tcMar>
+              <w:top w:type="dxa" w:w="60"/>
+              <w:left w:type="dxa" w:w="90"/>
+              <w:bottom w:type="dxa" w:w="60"/>
+              <w:right w:type="dxa" w:w="90"/>
+            </w:tcMar>
+          </w:tcPr>
+          <w:p>
+            <w:pPr>
+              <w:jc w:val="left"/>
+            </w:pPr>
+            <w:r>
+              <w:rPr>
+                <w:rFonts w:ascii="Times New Roman" w:cs="Times New Roman" w:eastAsia="Noto Serif CJK SC" w:hAnsi="Times New Roman"/>
+                <w:b w:val="false"/>
+                <w:bCs w:val="false"/>
+                <w:color w:val="000000"/>
+                <w:sz w:val="18"/>
+                <w:szCs w:val="18"/>
+              </w:rPr>
+              <w:t xml:space="preserve">数据整理</w:t>
+            </w:r>
+          </w:p>
+        </w:tc>
+        <w:tc>
+          <w:tcPr>
+            <w:tcW w:type="dxa" w:w="7160"/>
+            <w:tcBorders>
+              <w:top w:val="single" w:color="BBBBBB" w:sz="1"/>
+              <w:left w:val="single" w:color="BBBBBB" w:sz="1"/>
+              <w:bottom w:val="single" w:color="BBBBBB" w:sz="1"/>
+              <w:right w:val="single" w:color="BBBBBB" w:sz="1"/>
+            </w:tcBorders>
+            <w:shd w:fill="FFFFFF" w:val="clear"/>
+            <w:tcMar>
+              <w:top w:type="dxa" w:w="60"/>
+              <w:left w:type="dxa" w:w="90"/>
+              <w:bottom w:type="dxa" w:w="60"/>
+              <w:right w:type="dxa" w:w="90"/>
+            </w:tcMar>
+          </w:tcPr>
+          <w:p>
+            <w:pPr>
+              <w:jc w:val="center"/>
+            </w:pPr>
+            <w:r>
+              <w:rPr>
+                <w:rFonts w:ascii="Times New Roman" w:cs="Times New Roman" w:eastAsia="Noto Serif CJK SC" w:hAnsi="Times New Roman"/>
+                <w:b w:val="false"/>
+                <w:bCs w:val="false"/>
+                <w:color w:val="000000"/>
+                <w:sz w:val="18"/>
+                <w:szCs w:val="18"/>
+              </w:rPr>
+              <w:t xml:space="preserve">清洗漏斗 / 去重 / Murcko 骨架与泄漏审计（图 1–2）</w:t>
+            </w:r>
+          </w:p>
+        </w:tc>
+      </w:tr>
+      <w:tr>
+        <w:tc>
+          <w:tcPr>
+            <w:tcW w:type="dxa" w:w="2200"/>
+            <w:tcBorders>
+              <w:top w:val="single" w:color="BBBBBB" w:sz="1"/>
+              <w:left w:val="single" w:color="BBBBBB" w:sz="1"/>
+              <w:bottom w:val="single" w:color="BBBBBB" w:sz="1"/>
+              <w:right w:val="single" w:color="BBBBBB" w:sz="1"/>
+            </w:tcBorders>
+            <w:shd w:fill="EEF3FA" w:val="clear"/>
+            <w:tcMar>
+              <w:top w:type="dxa" w:w="60"/>
+              <w:left w:type="dxa" w:w="90"/>
+              <w:bottom w:type="dxa" w:w="60"/>
+              <w:right w:type="dxa" w:w="90"/>
+            </w:tcMar>
+          </w:tcPr>
+          <w:p>
+            <w:pPr>
+              <w:jc w:val="left"/>
+            </w:pPr>
+            <w:r>
+              <w:rPr>
+                <w:rFonts w:ascii="Times New Roman" w:cs="Times New Roman" w:eastAsia="Noto Serif CJK SC" w:hAnsi="Times New Roman"/>
+                <w:b w:val="false"/>
+                <w:bCs w:val="false"/>
+                <w:color w:val="000000"/>
+                <w:sz w:val="18"/>
+                <w:szCs w:val="18"/>
+              </w:rPr>
+              <w:t xml:space="preserve">分子表征</w:t>
+            </w:r>
+          </w:p>
+        </w:tc>
+        <w:tc>
+          <w:tcPr>
+            <w:tcW w:type="dxa" w:w="7160"/>
+            <w:tcBorders>
+              <w:top w:val="single" w:color="BBBBBB" w:sz="1"/>
+              <w:left w:val="single" w:color="BBBBBB" w:sz="1"/>
+              <w:bottom w:val="single" w:color="BBBBBB" w:sz="1"/>
+              <w:right w:val="single" w:color="BBBBBB" w:sz="1"/>
+            </w:tcBorders>
+            <w:shd w:fill="EEF3FA" w:val="clear"/>
+            <w:tcMar>
+              <w:top w:type="dxa" w:w="60"/>
+              <w:left w:type="dxa" w:w="90"/>
+              <w:bottom w:type="dxa" w:w="60"/>
+              <w:right w:type="dxa" w:w="90"/>
+            </w:tcMar>
+          </w:tcPr>
+          <w:p>
+            <w:pPr>
+              <w:jc w:val="center"/>
+            </w:pPr>
+            <w:r>
+              <w:rPr>
+                <w:rFonts w:ascii="Times New Roman" w:cs="Times New Roman" w:eastAsia="Noto Serif CJK SC" w:hAnsi="Times New Roman"/>
+                <w:b w:val="false"/>
+                <w:bCs w:val="false"/>
+                <w:color w:val="000000"/>
+                <w:sz w:val="18"/>
+                <w:szCs w:val="18"/>
+              </w:rPr>
+              <w:t xml:space="preserve">Morgan 指纹 + RDKit 物化描述符 + 多指纹消融（结果 §6）</w:t>
+            </w:r>
+          </w:p>
+        </w:tc>
+      </w:tr>
+      <w:tr>
+        <w:tc>
+          <w:tcPr>
+            <w:tcW w:type="dxa" w:w="2200"/>
+            <w:tcBorders>
+              <w:top w:val="single" w:color="BBBBBB" w:sz="1"/>
+              <w:left w:val="single" w:color="BBBBBB" w:sz="1"/>
+              <w:bottom w:val="single" w:color="BBBBBB" w:sz="1"/>
+              <w:right w:val="single" w:color="BBBBBB" w:sz="1"/>
+            </w:tcBorders>
+            <w:shd w:fill="FFFFFF" w:val="clear"/>
+            <w:tcMar>
+              <w:top w:type="dxa" w:w="60"/>
+              <w:left w:type="dxa" w:w="90"/>
+              <w:bottom w:type="dxa" w:w="60"/>
+              <w:right w:type="dxa" w:w="90"/>
+            </w:tcMar>
+          </w:tcPr>
+          <w:p>
+            <w:pPr>
+              <w:jc w:val="left"/>
+            </w:pPr>
+            <w:r>
+              <w:rPr>
+                <w:rFonts w:ascii="Times New Roman" w:cs="Times New Roman" w:eastAsia="Noto Serif CJK SC" w:hAnsi="Times New Roman"/>
+                <w:b w:val="false"/>
+                <w:bCs w:val="false"/>
+                <w:color w:val="000000"/>
+                <w:sz w:val="18"/>
+                <w:szCs w:val="18"/>
+              </w:rPr>
+              <w:t xml:space="preserve">模型构建</w:t>
+            </w:r>
+          </w:p>
+        </w:tc>
+        <w:tc>
+          <w:tcPr>
+            <w:tcW w:type="dxa" w:w="7160"/>
+            <w:tcBorders>
+              <w:top w:val="single" w:color="BBBBBB" w:sz="1"/>
+              <w:left w:val="single" w:color="BBBBBB" w:sz="1"/>
+              <w:bottom w:val="single" w:color="BBBBBB" w:sz="1"/>
+              <w:right w:val="single" w:color="BBBBBB" w:sz="1"/>
+            </w:tcBorders>
+            <w:shd w:fill="FFFFFF" w:val="clear"/>
+            <w:tcMar>
+              <w:top w:type="dxa" w:w="60"/>
+              <w:left w:type="dxa" w:w="90"/>
+              <w:bottom w:type="dxa" w:w="60"/>
+              <w:right w:type="dxa" w:w="90"/>
+            </w:tcMar>
+          </w:tcPr>
+          <w:p>
+            <w:pPr>
+              <w:jc w:val="center"/>
+            </w:pPr>
+            <w:r>
+              <w:rPr>
+                <w:rFonts w:ascii="Times New Roman" w:cs="Times New Roman" w:eastAsia="Noto Serif CJK SC" w:hAnsi="Times New Roman"/>
+                <w:b w:val="false"/>
+                <w:bCs w:val="false"/>
+                <w:color w:val="000000"/>
+                <w:sz w:val="18"/>
+                <w:szCs w:val="18"/>
+              </w:rPr>
+              <w:t xml:space="preserve">策略一：传统 ML（RF/GBM/SVR/Ridge）+ 基础模型（MolFormer/ChemFM/TabPFN）；策略二：Chemprop D-MPNN 图网络</w:t>
+            </w:r>
+          </w:p>
+        </w:tc>
+      </w:tr>
+      <w:tr>
+        <w:tc>
+          <w:tcPr>
+            <w:tcW w:type="dxa" w:w="2200"/>
+            <w:tcBorders>
+              <w:top w:val="single" w:color="BBBBBB" w:sz="1"/>
+              <w:left w:val="single" w:color="BBBBBB" w:sz="1"/>
+              <w:bottom w:val="single" w:color="BBBBBB" w:sz="1"/>
+              <w:right w:val="single" w:color="BBBBBB" w:sz="1"/>
+            </w:tcBorders>
+            <w:shd w:fill="EEF3FA" w:val="clear"/>
+            <w:tcMar>
+              <w:top w:type="dxa" w:w="60"/>
+              <w:left w:type="dxa" w:w="90"/>
+              <w:bottom w:type="dxa" w:w="60"/>
+              <w:right w:type="dxa" w:w="90"/>
+            </w:tcMar>
+          </w:tcPr>
+          <w:p>
+            <w:pPr>
+              <w:jc w:val="left"/>
+            </w:pPr>
+            <w:r>
+              <w:rPr>
+                <w:rFonts w:ascii="Times New Roman" w:cs="Times New Roman" w:eastAsia="Noto Serif CJK SC" w:hAnsi="Times New Roman"/>
+                <w:b w:val="false"/>
+                <w:bCs w:val="false"/>
+                <w:color w:val="000000"/>
+                <w:sz w:val="18"/>
+                <w:szCs w:val="18"/>
+              </w:rPr>
+              <w:t xml:space="preserve">训练与评估</w:t>
+            </w:r>
+          </w:p>
+        </w:tc>
+        <w:tc>
+          <w:tcPr>
+            <w:tcW w:type="dxa" w:w="7160"/>
+            <w:tcBorders>
+              <w:top w:val="single" w:color="BBBBBB" w:sz="1"/>
+              <w:left w:val="single" w:color="BBBBBB" w:sz="1"/>
+              <w:bottom w:val="single" w:color="BBBBBB" w:sz="1"/>
+              <w:right w:val="single" w:color="BBBBBB" w:sz="1"/>
+            </w:tcBorders>
+            <w:shd w:fill="EEF3FA" w:val="clear"/>
+            <w:tcMar>
+              <w:top w:type="dxa" w:w="60"/>
+              <w:left w:type="dxa" w:w="90"/>
+              <w:bottom w:type="dxa" w:w="60"/>
+              <w:right w:type="dxa" w:w="90"/>
+            </w:tcMar>
+          </w:tcPr>
+          <w:p>
+            <w:pPr>
+              <w:jc w:val="center"/>
+            </w:pPr>
+            <w:r>
+              <w:rPr>
+                <w:rFonts w:ascii="Times New Roman" w:cs="Times New Roman" w:eastAsia="Noto Serif CJK SC" w:hAnsi="Times New Roman"/>
+                <w:b w:val="false"/>
+                <w:bCs w:val="false"/>
+                <w:color w:val="000000"/>
+                <w:sz w:val="18"/>
+                <w:szCs w:val="18"/>
+              </w:rPr>
+              <w:t xml:space="preserve">Optuna 调参 + 5 折 CV + 3 seed；MAE / Pearson R（回归）、ROC-AUC / MCC（分类）、早期富集 EF</w:t>
+            </w:r>
+          </w:p>
+        </w:tc>
+      </w:tr>
+      <w:tr>
+        <w:tc>
+          <w:tcPr>
+            <w:tcW w:type="dxa" w:w="2200"/>
+            <w:tcBorders>
+              <w:top w:val="single" w:color="BBBBBB" w:sz="1"/>
+              <w:left w:val="single" w:color="BBBBBB" w:sz="1"/>
+              <w:bottom w:val="single" w:color="BBBBBB" w:sz="1"/>
+              <w:right w:val="single" w:color="BBBBBB" w:sz="1"/>
+            </w:tcBorders>
+            <w:shd w:fill="FFFFFF" w:val="clear"/>
+            <w:tcMar>
+              <w:top w:type="dxa" w:w="60"/>
+              <w:left w:type="dxa" w:w="90"/>
+              <w:bottom w:type="dxa" w:w="60"/>
+              <w:right w:type="dxa" w:w="90"/>
+            </w:tcMar>
+          </w:tcPr>
+          <w:p>
+            <w:pPr>
+              <w:jc w:val="left"/>
+            </w:pPr>
+            <w:r>
+              <w:rPr>
+                <w:rFonts w:ascii="Times New Roman" w:cs="Times New Roman" w:eastAsia="Noto Serif CJK SC" w:hAnsi="Times New Roman"/>
+                <w:b w:val="false"/>
+                <w:bCs w:val="false"/>
+                <w:color w:val="000000"/>
+                <w:sz w:val="18"/>
+                <w:szCs w:val="18"/>
+              </w:rPr>
+              <w:t xml:space="preserve">药物发现应用</w:t>
+            </w:r>
+          </w:p>
+        </w:tc>
+        <w:tc>
+          <w:tcPr>
+            <w:tcW w:type="dxa" w:w="7160"/>
+            <w:tcBorders>
+              <w:top w:val="single" w:color="BBBBBB" w:sz="1"/>
+              <w:left w:val="single" w:color="BBBBBB" w:sz="1"/>
+              <w:bottom w:val="single" w:color="BBBBBB" w:sz="1"/>
+              <w:right w:val="single" w:color="BBBBBB" w:sz="1"/>
+            </w:tcBorders>
+            <w:shd w:fill="FFFFFF" w:val="clear"/>
+            <w:tcMar>
+              <w:top w:type="dxa" w:w="60"/>
+              <w:left w:type="dxa" w:w="90"/>
+              <w:bottom w:type="dxa" w:w="60"/>
+              <w:right w:type="dxa" w:w="90"/>
+            </w:tcMar>
+          </w:tcPr>
+          <w:p>
+            <w:pPr>
+              <w:jc w:val="center"/>
+            </w:pPr>
+            <w:r>
+              <w:rPr>
+                <w:rFonts w:ascii="Times New Roman" w:cs="Times New Roman" w:eastAsia="Noto Serif CJK SC" w:hAnsi="Times New Roman"/>
+                <w:b w:val="false"/>
+                <w:bCs w:val="false"/>
+                <w:color w:val="000000"/>
+                <w:sz w:val="18"/>
+                <w:szCs w:val="18"/>
+              </w:rPr>
+              <w:t xml:space="preserve">β-secretase 4D8C 分子对接（Vina）/ PBCNet2 结构-成对模型 / 活性悬崖分析</w:t>
+            </w:r>
+          </w:p>
+        </w:tc>
+      </w:tr>
+      <w:tr>
+        <w:tc>
+          <w:tcPr>
+            <w:tcW w:type="dxa" w:w="2200"/>
+            <w:tcBorders>
+              <w:top w:val="single" w:color="BBBBBB" w:sz="1"/>
+              <w:left w:val="single" w:color="BBBBBB" w:sz="1"/>
+              <w:bottom w:val="single" w:color="BBBBBB" w:sz="1"/>
+              <w:right w:val="single" w:color="BBBBBB" w:sz="1"/>
+            </w:tcBorders>
+            <w:shd w:fill="EEF3FA" w:val="clear"/>
+            <w:tcMar>
+              <w:top w:type="dxa" w:w="60"/>
+              <w:left w:type="dxa" w:w="90"/>
+              <w:bottom w:type="dxa" w:w="60"/>
+              <w:right w:type="dxa" w:w="90"/>
+            </w:tcMar>
+          </w:tcPr>
+          <w:p>
+            <w:pPr>
+              <w:jc w:val="left"/>
+            </w:pPr>
+            <w:r>
+              <w:rPr>
+                <w:rFonts w:ascii="Times New Roman" w:cs="Times New Roman" w:eastAsia="Noto Serif CJK SC" w:hAnsi="Times New Roman"/>
+                <w:b w:val="false"/>
+                <w:bCs w:val="false"/>
+                <w:color w:val="000000"/>
+                <w:sz w:val="18"/>
+                <w:szCs w:val="18"/>
+              </w:rPr>
+              <w:t xml:space="preserve">可复现性</w:t>
+            </w:r>
+          </w:p>
+        </w:tc>
+        <w:tc>
+          <w:tcPr>
+            <w:tcW w:type="dxa" w:w="7160"/>
+            <w:tcBorders>
+              <w:top w:val="single" w:color="BBBBBB" w:sz="1"/>
+              <w:left w:val="single" w:color="BBBBBB" w:sz="1"/>
+              <w:bottom w:val="single" w:color="BBBBBB" w:sz="1"/>
+              <w:right w:val="single" w:color="BBBBBB" w:sz="1"/>
+            </w:tcBorders>
+            <w:shd w:fill="EEF3FA" w:val="clear"/>
+            <w:tcMar>
+              <w:top w:type="dxa" w:w="60"/>
+              <w:left w:type="dxa" w:w="90"/>
+              <w:bottom w:type="dxa" w:w="60"/>
+              <w:right w:type="dxa" w:w="90"/>
+            </w:tcMar>
+          </w:tcPr>
+          <w:p>
+            <w:pPr>
+              <w:jc w:val="center"/>
+            </w:pPr>
+            <w:r>
+              <w:rPr>
+                <w:rFonts w:ascii="Times New Roman" w:cs="Times New Roman" w:eastAsia="Noto Serif CJK SC" w:hAnsi="Times New Roman"/>
+                <w:b w:val="false"/>
+                <w:bCs w:val="false"/>
+                <w:color w:val="000000"/>
+                <w:sz w:val="18"/>
+                <w:szCs w:val="18"/>
+              </w:rPr>
+              <w:t xml:space="preserve">scaffold split + 泄漏审计 + 阴性对照 + 显著性检验 + conformal/AD 分层</w:t>
+            </w:r>
+          </w:p>
+        </w:tc>
+      </w:tr>
+    </w:tbl>
+    <w:p>
+      <w:pPr>
         <w:pStyle w:val="Heading1"/>
         <w:spacing w:after="130" w:before="260"/>
       </w:pPr>
@@ -6189,6 +6715,22 @@
       </w:r>
       <w:r>
         <w:t xml:space="preserve">(1) 单数据集（BACE），结论外推到其他靶点需验证；(2) 预定义划分存在骨架泄漏，已用 scaffold split 缓解并披露；(3) PBCNet2 的检验受限于 cross-docking 位姿质量、缺少共晶位姿；(4) 低相似度子群样本量小（n=10），相关结论为探索性；(5) 未做前瞻性实验验证。</w:t>
+      </w:r>
+    </w:p>
+    <w:p>
+      <w:pPr>
+        <w:spacing w:after="100" w:line="300"/>
+        <w:jc w:val="both"/>
+      </w:pPr>
+      <w:r>
+        <w:rPr>
+          <w:b/>
+          <w:bCs/>
+        </w:rPr>
+        <w:t xml:space="preserve">研究范围界定：</w:t>
+      </w:r>
+      <w:r>
+        <w:t xml:space="preserve">本实验聚焦先导优化阶段的“活性预测 + 结构复核”，未涉及分子生成、逆合成或新靶标发现——课程允许选择其中一项预测任务，本项目选定并完整实现了 BACE pIC50 活性预测这一项。</w:t>
       </w:r>
     </w:p>
     <w:p>

</xml_diff>

<commit_message>
course report/slides: fix cover author info (学院 计算与智能创新学院 / 专业 计算机科学与技术) + correct course name in slides (drop extra 设计); re-export PDFs
Assisted-by: Claude
</commit_message>
<xml_diff>
--- a/report/课程实验报告_BACE.docx
+++ b/report/课程实验报告_BACE.docx
@@ -354,7 +354,7 @@
         </w:tc>
         <w:tc>
           <w:tcPr>
-            <w:tcW w:type="dxa" w:w="2300"/>
+            <w:tcW w:type="dxa" w:w="2800"/>
             <w:tcBorders>
               <w:top w:val="single" w:color="888888" w:sz="4"/>
               <w:left w:val="single" w:color="888888" w:sz="4"/>
@@ -379,13 +379,13 @@
                 <w:sz w:val="22"/>
                 <w:szCs w:val="22"/>
               </w:rPr>
-              <w:t xml:space="preserve">药学院</w:t>
-            </w:r>
-          </w:p>
-        </w:tc>
-        <w:tc>
-          <w:tcPr>
-            <w:tcW w:type="dxa" w:w="1700"/>
+              <w:t xml:space="preserve">计算与智能创新学院</w:t>
+            </w:r>
+          </w:p>
+        </w:tc>
+        <w:tc>
+          <w:tcPr>
+            <w:tcW w:type="dxa" w:w="1400"/>
             <w:tcBorders>
               <w:top w:val="single" w:color="888888" w:sz="4"/>
               <w:left w:val="single" w:color="888888" w:sz="4"/>
@@ -416,7 +416,7 @@
         </w:tc>
         <w:tc>
           <w:tcPr>
-            <w:tcW w:type="dxa" w:w="2300"/>
+            <w:tcW w:type="dxa" w:w="2100"/>
             <w:tcBorders>
               <w:top w:val="single" w:color="888888" w:sz="4"/>
               <w:left w:val="single" w:color="888888" w:sz="4"/>
@@ -441,7 +441,7 @@
                 <w:sz w:val="22"/>
                 <w:szCs w:val="22"/>
               </w:rPr>
-              <w:t xml:space="preserve">药学</w:t>
+              <w:t xml:space="preserve">计算机科学与技术</w:t>
             </w:r>
           </w:p>
         </w:tc>

</xml_diff>

<commit_message>
integrity pass: soften slide/report claims (drop '第二作者'/'唯一又紧又稳'/'提前标出'/'真实构效信号' -> defensible wording); add ACS AI-use disclosure to manuscript acknowledgement; re-export PDFs
Assisted-by: Claude
</commit_message>
<xml_diff>
--- a/report/课程实验报告_BACE.docx
+++ b/report/课程实验报告_BACE.docx
@@ -3161,7 +3161,7 @@
         <w:jc w:val="both"/>
       </w:pPr>
       <w:r>
-        <w:t xml:space="preserve">误差并非随机：所有模型都“回归到均值”（低估高活性、高估低活性，TabPFN 收缩最小）；误差最大的十分位分子中，19% 落在活性悬崖（其余仅 1%）、16% 为标签冲突骨架（其余 2%），且更偏新骨架与极端活性（图 8）；跨 8 模型共识最难的分子多为大环、碎片样小分子或极端活性（图 9）。调参只缩小误差幅度、不改变“谁难”（大误差集合重叠 76%）。TabPFN 的预测区间宽度可提前标出难分子——58% 的共识难例落在其 90% 区间之外（易预测分子仅 6%，图 10）。</w:t>
+        <w:t xml:space="preserve">误差并非随机：所有模型都“回归到均值”（低估高活性、高估低活性，TabPFN 收缩最小）；误差最大的十分位分子中，19% 落在活性悬崖（其余仅 1%）、16% 为标签冲突骨架（其余 2%），且更偏新骨架与极端活性（图 8）；跨 8 模型共识最难的分子多为大环、碎片样小分子或极端活性（图 9）。调参只缩小误差幅度、不改变“谁难”（大误差集合重叠 76%）。TabPFN 的预测区间宽度可预警高误差风险、支持拒识策略（难例按测试误差事后定义，但区间宽度在预测时即可用）——58% 的共识难例落在其 90% 区间之外（易预测分子仅 6%，图 10）。</w:t>
       </w:r>
     </w:p>
     <w:p>
@@ -3296,7 +3296,7 @@
           <wp:inline distT="0" distB="0" distL="0" distR="0">
             <wp:extent cx="4953000" cy="3829050"/>
             <wp:effectExtent t="0" r="0" b="0" l="0"/>
-            <wp:docPr id="1" name="fig_err_uncertainty_j.png" descr="图 10　TabPFN 不确定性提前标出难分子：拒识最不确定者后保留集 MAE 明显下降；58% 难例落在 90% 区间外" title="图 10　TabPFN 不确定性提前标出难分子：拒识最不确定者后保留集 MAE 明显下降；58% 难例落在 90% 区间外"/>
+            <wp:docPr id="1" name="fig_err_uncertainty_j.png" descr="图 10　TabPFN 不确定性预警高误差风险：拒识最不确定者后保留集 MAE 明显下降；58% 难例落在 90% 区间外" title="图 10　TabPFN 不确定性预警高误差风险：拒识最不确定者后保留集 MAE 明显下降；58% 难例落在 90% 区间外"/>
             <wp:cNvGraphicFramePr>
               <a:graphicFrameLocks xmlns:a="http://schemas.openxmlformats.org/drawingml/2006/main" noChangeAspect="1"/>
             </wp:cNvGraphicFramePr>
@@ -3344,7 +3344,7 @@
           <w:sz w:val="18"/>
           <w:szCs w:val="18"/>
         </w:rPr>
-        <w:t xml:space="preserve">图 10　TabPFN 不确定性提前标出难分子：拒识最不确定者后保留集 MAE 明显下降；58% 难例落在 90% 区间外</w:t>
+        <w:t xml:space="preserve">图 10　TabPFN 不确定性预警高误差风险：拒识最不确定者后保留集 MAE 明显下降；58% 难例落在 90% 区间外</w:t>
       </w:r>
     </w:p>
     <w:p>
@@ -6643,7 +6643,7 @@
         <w:spacing w:after="60" w:line="300"/>
       </w:pPr>
       <w:r>
-        <w:t xml:space="preserve">误差不是随机的：高度集中在活性悬崖、标签冲突、新骨架与极端活性分子；调参只缩小幅度、不改变“谁难”；不确定性可提前标出这些难分子，使“何时降低预测可信度”变得可操作。</w:t>
+        <w:t xml:space="preserve">误差不是随机的：高度集中在活性悬崖、标签冲突、新骨架与极端活性分子；调参只缩小幅度、不改变“谁难”；不确定性可预警高误差风险、支持拒识策略，使“何时降低预测可信度”变得可操作。</w:t>
       </w:r>
     </w:p>
     <w:p>
@@ -6682,7 +6682,7 @@
         <w:spacing w:after="60" w:line="300"/>
       </w:pPr>
       <w:r>
-        <w:t xml:space="preserve">可解释性显示模型抓到的是真实构效信号：分子大小 / 复杂度与若干增效 / 致弱子结构主导预测，而非记忆噪声（与附录阴性对照相互印证）。</w:t>
+        <w:t xml:space="preserve">可解释性显示模型抓到的是可学习的结构-活性相关信号：分子大小 / 复杂度与若干增效 / 致弱子结构主导预测，而非记忆噪声（与附录阴性对照相互印证）。</w:t>
       </w:r>
     </w:p>
     <w:p>
@@ -6748,7 +6748,7 @@
         <w:jc w:val="both"/>
       </w:pPr>
       <w:r>
-        <w:t xml:space="preserve">在小样本 BACE-1 抑制活性预测上，零调参的表格基础模型 TabPFN 给出最优点估计，并在统计显著性、骨架外推鲁棒性、conformal 条件覆盖三条轴上对新化学的泛化均达第一梯队或最稳；模型误差系统性集中在活性悬崖、标签冲突与新骨架，且可被不确定性提前标出；结构方法（对接、PBCNet2）在 cross-docking 位姿域未能超过配体模型，构成一个界定适用范围的阴性结果。全程以阴性对照、泄漏审计与显著性检验自检，结论既可被质疑也可被辩护。</w:t>
+        <w:t xml:space="preserve">在小样本 BACE-1 抑制活性预测上，零调参的表格基础模型 TabPFN 给出最优点估计，并在统计显著性、骨架外推鲁棒性、conformal 条件覆盖三条轴上对新化学的泛化均达第一梯队或最稳；模型误差系统性集中在活性悬崖、标签冲突与新骨架，且可被不确定性预警（支持拒识策略）；结构方法（对接、PBCNet2）在 cross-docking 位姿域未能超过配体模型，构成一个界定适用范围的阴性结果。全程以阴性对照、泄漏审计与显著性检验自检，结论既可被质疑也可被辩护。</w:t>
       </w:r>
     </w:p>
     <w:p>

</xml_diff>

<commit_message>
report audit: reference orphan 表1/图4 in §1 results; align MolFormer MAE to data-faithful 0.673 (was 0.674, PPT shows 0.673); re-export PDF
Assisted-by: Claude
</commit_message>
<xml_diff>
--- a/report/课程实验报告_BACE.docx
+++ b/report/课程实验报告_BACE.docx
@@ -2835,7 +2835,7 @@
                 <w:sz w:val="18"/>
                 <w:szCs w:val="18"/>
               </w:rPr>
-              <w:t xml:space="preserve">0.674 ± 0.054</w:t>
+              <w:t xml:space="preserve">0.673 ± 0.054</w:t>
             </w:r>
           </w:p>
         </w:tc>
@@ -2881,7 +2881,7 @@
         <w:jc w:val="both"/>
       </w:pPr>
       <w:r>
-        <w:t xml:space="preserve">TabPFN 在 MAE 与 Pearson R 上均为最佳点估计。关于显著性需谨慎区分两类检验：基于 n=303 个测试分子的 Friedman + Nemenyi 临界差异图（图 5）把逐分子误差当作配对块，分子并非独立重复（伪重复），因此本报告只把它当作**描述性可视化**，不作为严格显著性判据。严格的显著性来自两条互补证据：(i) 逐分子配对 bootstrap（10k 重采样 + Bonferroni）给出 ΔMAE 的置信区间，进一步将 RF、GBM 与 TabPFN 分开；(ii) 论文级的折级 Nadeau–Bengio 校正重采样检验（以折而非分子为重复单元，避免伪重复）。两类检验灵敏度不同。综合的严谨表述为：TabPFN 与图网络、化学大模型同属第一梯队，而非全面碾压；MolFormer 全参微调在小数据上方差最大、表现最弱。</w:t>
+        <w:t xml:space="preserve">TabPFN 在 MAE 与 Pearson R 上均为最佳点估计（表 1、图 4）。关于显著性需谨慎区分两类检验：基于 n=303 个测试分子的 Friedman + Nemenyi 临界差异图（图 5）把逐分子误差当作配对块，分子并非独立重复（伪重复），因此本报告只把它当作**描述性可视化**，不作为严格显著性判据。严格的显著性来自两条互补证据：(i) 逐分子配对 bootstrap（10k 重采样 + Bonferroni）给出 ΔMAE 的置信区间，进一步将 RF、GBM 与 TabPFN 分开；(ii) 论文级的折级 Nadeau–Bengio 校正重采样检验（以折而非分子为重复单元，避免伪重复）。两类检验灵敏度不同。综合的严谨表述为：TabPFN 与图网络、化学大模型同属第一梯队，而非全面碾压；MolFormer 全参微调在小数据上方差最大、表现最弱。</w:t>
       </w:r>
     </w:p>
     <w:p>
@@ -3362,7 +3362,7 @@
         <w:jc w:val="both"/>
       </w:pPr>
       <w:r>
-        <w:t xml:space="preserve">预定义划分有约 64% 骨架重叠、会高估泛化。按 Murcko 骨架严格重划（训练/测试无共享骨架）重训全部 8 模型后（图 11）：TabPFN 几乎不退化（MAE 0.498→0.508，仍最低、差距最小），全参微调的 MolFormer 泛化性能明显退化（0.674→1.134）——TabPFN 对新化学的外推在本实验中表现最稳。可信度方面（图 12，名义 90%，仅用验证集校准、全模型同一协议、测试集不参与调 coverage）：各模型边际覆盖率均达标（0.90–0.95），Chemprop 区间最紧；但按相似度分层，8 个模型中有 6 个在低相似度（新骨架）子群覆盖率降至 0.2–0.5（低 AD 子群 n=10，为探索性结果，需更大外部集验证），仅 TabPFN 与 MolFormer 在低 AD 仍接近 0.9（MolFormer 的代价是区间显著更宽，TabPFN 则同时保持紧致）。</w:t>
+        <w:t xml:space="preserve">预定义划分有约 64% 骨架重叠、会高估泛化。按 Murcko 骨架严格重划（训练/测试无共享骨架）重训全部 8 模型后（图 11）：TabPFN 几乎不退化（MAE 0.498→0.508，仍最低、差距最小），全参微调的 MolFormer 泛化性能明显退化（0.673→1.134）——TabPFN 对新化学的外推在本实验中表现最稳。可信度方面（图 12，名义 90%，仅用验证集校准、全模型同一协议、测试集不参与调 coverage）：各模型边际覆盖率均达标（0.90–0.95），Chemprop 区间最紧；但按相似度分层，8 个模型中有 6 个在低相似度（新骨架）子群覆盖率降至 0.2–0.5（低 AD 子群 n=10，为探索性结果，需更大外部集验证），仅 TabPFN 与 MolFormer 在低 AD 仍接近 0.9（MolFormer 的代价是区间显著更宽，TabPFN 则同时保持紧致）。</w:t>
       </w:r>
     </w:p>
     <w:p>
@@ -8474,7 +8474,7 @@
                 <w:sz w:val="18"/>
                 <w:szCs w:val="18"/>
               </w:rPr>
-              <w:t xml:space="preserve">0.674±0.054</w:t>
+              <w:t xml:space="preserve">0.673±0.054</w:t>
             </w:r>
           </w:p>
         </w:tc>

</xml_diff>

<commit_message>
style: professionalize Chinese prose in report and slides
Apply the user's docx review edits and remove informal register from the
course report and presentation:
- replace middle-dot separators (U+00B7) with + and em-dashes with
  context-appropriate punctuation in the report tables and prose
- de-specify the course-mapping intro to a generic course-requirement phrasing
- remove colloquial/gaming-slang flourishes (而非全面碾压 / 通吃 / 刷高 /
  而不是碾压) from the report and slide speaker notes, preserving the precise
  calibration (first-tier, significance results) per the integrity rules
- align a leftover 提前标出 in the closing slide notes to the softened 预警 wording

Rebuild report docx/PDF and slides pptx/PDF. The JCIM manuscript needed no
change (already formal; verified by scan).

Assisted-by: Claude
</commit_message>
<xml_diff>
--- a/report/课程实验报告_BACE.docx
+++ b/report/课程实验报告_BACE.docx
@@ -495,7 +495,7 @@
           <w:sz w:val="20"/>
           <w:szCs w:val="20"/>
         </w:rPr>
-        <w:t xml:space="preserve">—— 小样本 QSAR 下表格基础模型、传统模型与分子基础模型的系统评估</w:t>
+        <w:t xml:space="preserve">小样本 QSAR 下表格基础模型、传统模型与分子基础模型的系统评估</w:t>
       </w:r>
     </w:p>
     <w:p>
@@ -563,7 +563,7 @@
         <w:t xml:space="preserve">课程内容对应：</w:t>
       </w:r>
       <w:r>
-        <w:t xml:space="preserve">本项目遵循课程第五讲 MoleculeNet/DeepChem 的作业口径（BACE / SMILES / 1513 / 回归 / MAE + Pearson R），完成“数据整理→模型构建→训练→分析”的完整链路；实现上用 RDKit + scikit-learn / Chemprop / HuggingFace Transformers 在同一数据任务上复现。各课程环节与本项目的对应关系如下表。</w:t>
+        <w:t xml:space="preserve">本项目遵循课程项目要求，完成“数据整理→模型构建→训练→分析”的完整链路；实现上用 RDKit + scikit-learn / Chemprop / HuggingFace Transformers 在同一数据任务上复现。各课程环节与本项目的对应关系如下表。</w:t>
       </w:r>
     </w:p>
     <w:tbl>
@@ -1149,7 +1149,7 @@
         <w:t xml:space="preserve">策略二：</w:t>
       </w:r>
       <w:r>
-        <w:t xml:space="preserve">Chemprop D-MPNN——原子为节点、化学键为边的有向消息传递图神经网络。</w:t>
+        <w:t xml:space="preserve">Chemprop D-MPNN：原子为节点、化学键为边的有向消息传递图神经网络。</w:t>
       </w:r>
     </w:p>
     <w:p>
@@ -1557,7 +1557,7 @@
         <w:jc w:val="both"/>
       </w:pPr>
       <w:r>
-        <w:t xml:space="preserve">经典模型用 Optuna TPE 贝叶斯调参，目标为 5 折交叉验证折外 MAE；所有标准化塞进 sklearn Pipeline 在折内各自拟合（leak-safe），避免乐观偏差（Cawley &amp; Talbot 2010）。防过拟合分多层：深度模型 best-on-val 早停、ChemFM LoRA 仅训 0.2% 参数、dropout 与梯度裁剪、经典模型 5 折 CV——验证与测试 MAE 未见明显落差，未观察到明显过拟合迹象。深度模型各跑 3 个种子（42/1337/2024）报均值±标准差，测试集仅最终评估一次。</w:t>
+        <w:t xml:space="preserve">经典模型用 Optuna TPE 贝叶斯调参，目标为 5 折交叉验证折外 MAE；所有标准化塞进 sklearn Pipeline 在折内各自拟合（leak-safe），避免乐观偏差（Cawley &amp; Talbot 2010）。防过拟合分多层：深度模型 best-on-val 早停、ChemFM LoRA 仅训 0.2% 参数、dropout 与梯度裁剪、经典模型 5 折 CV；验证与测试 MAE 未见明显落差，未观察到明显过拟合迹象。深度模型各跑 3 个种子（42/1337/2024）报均值±标准差，测试集仅最终评估一次。</w:t>
       </w:r>
     </w:p>
     <w:p>
@@ -1835,7 +1835,7 @@
                 <w:sz w:val="18"/>
                 <w:szCs w:val="18"/>
               </w:rPr>
-              <w:t xml:space="preserve">表格基础模型 · 零调参</w:t>
+              <w:t xml:space="preserve">表格基础模型 + 零调参</w:t>
             </w:r>
           </w:p>
         </w:tc>
@@ -1973,7 +1973,7 @@
                 <w:sz w:val="18"/>
                 <w:szCs w:val="18"/>
               </w:rPr>
-              <w:t xml:space="preserve">策略二 · 图网络</w:t>
+              <w:t xml:space="preserve">策略二 + 图网络</w:t>
             </w:r>
           </w:p>
         </w:tc>
@@ -2111,7 +2111,7 @@
                 <w:sz w:val="18"/>
                 <w:szCs w:val="18"/>
               </w:rPr>
-              <w:t xml:space="preserve">策略一 · 树集成</w:t>
+              <w:t xml:space="preserve">策略一 + 树集成</w:t>
             </w:r>
           </w:p>
         </w:tc>
@@ -2249,7 +2249,7 @@
                 <w:sz w:val="18"/>
                 <w:szCs w:val="18"/>
               </w:rPr>
-              <w:t xml:space="preserve">策略一 · 大模型 LoRA</w:t>
+              <w:t xml:space="preserve">策略一 + 大模型 LoRA</w:t>
             </w:r>
           </w:p>
         </w:tc>
@@ -2387,7 +2387,7 @@
                 <w:sz w:val="18"/>
                 <w:szCs w:val="18"/>
               </w:rPr>
-              <w:t xml:space="preserve">策略一 · 树集成</w:t>
+              <w:t xml:space="preserve">策略一 + 树集成</w:t>
             </w:r>
           </w:p>
         </w:tc>
@@ -2525,7 +2525,7 @@
                 <w:sz w:val="18"/>
                 <w:szCs w:val="18"/>
               </w:rPr>
-              <w:t xml:space="preserve">策略一 · 线性</w:t>
+              <w:t xml:space="preserve">策略一 + 线性</w:t>
             </w:r>
           </w:p>
         </w:tc>
@@ -2663,7 +2663,7 @@
                 <w:sz w:val="18"/>
                 <w:szCs w:val="18"/>
               </w:rPr>
-              <w:t xml:space="preserve">策略一 · 核方法</w:t>
+              <w:t xml:space="preserve">策略一 + 核方法</w:t>
             </w:r>
           </w:p>
         </w:tc>
@@ -2801,7 +2801,7 @@
                 <w:sz w:val="18"/>
                 <w:szCs w:val="18"/>
               </w:rPr>
-              <w:t xml:space="preserve">策略一 · 全参微调</w:t>
+              <w:t xml:space="preserve">策略一 + 全参微调</w:t>
             </w:r>
           </w:p>
         </w:tc>
@@ -2881,7 +2881,7 @@
         <w:jc w:val="both"/>
       </w:pPr>
       <w:r>
-        <w:t xml:space="preserve">TabPFN 在 MAE 与 Pearson R 上均为最佳点估计（表 1、图 4）。关于显著性需谨慎区分两类检验：基于 n=303 个测试分子的 Friedman + Nemenyi 临界差异图（图 5）把逐分子误差当作配对块，分子并非独立重复（伪重复），因此本报告只把它当作**描述性可视化**，不作为严格显著性判据。严格的显著性来自两条互补证据：(i) 逐分子配对 bootstrap（10k 重采样 + Bonferroni）给出 ΔMAE 的置信区间，进一步将 RF、GBM 与 TabPFN 分开；(ii) 论文级的折级 Nadeau–Bengio 校正重采样检验（以折而非分子为重复单元，避免伪重复）。两类检验灵敏度不同。综合的严谨表述为：TabPFN 与图网络、化学大模型同属第一梯队，而非全面碾压；MolFormer 全参微调在小数据上方差最大、表现最弱。</w:t>
+        <w:t xml:space="preserve">TabPFN 在 MAE 与 Pearson R 上均为最佳点估计（表 1、图 4）。关于显著性需谨慎区分两类检验：基于 n=303 个测试分子的 Friedman + Nemenyi 临界差异图（图 5）把逐分子误差当作配对块，分子并非独立重复（伪重复），因此本报告只把它当作**描述性可视化**，不作为严格显著性判据。严格的显著性来自两条互补证据：(i) 逐分子配对 bootstrap（10k 重采样 + Bonferroni）给出 ΔMAE 的置信区间，进一步将 RF、GBM 与 TabPFN 分开；(ii) 论文级的折级 Nadeau–Bengio 校正重采样检验（以折而非分子为重复单元，避免伪重复）。两类检验灵敏度不同。综合的严谨表述为：TabPFN 与图网络、化学大模型同属第一梯队；MolFormer 全参微调在小数据上方差最大、表现最弱。</w:t>
       </w:r>
     </w:p>
     <w:p>
@@ -2955,7 +2955,7 @@
           <wp:inline distT="0" distB="0" distL="0" distR="0">
             <wp:extent cx="5143500" cy="1819275"/>
             <wp:effectExtent t="0" r="0" b="0" l="0"/>
-            <wp:docPr id="1" name="fig_cd_diagram_j.png" descr="图 5　临界差异图（Friedman p=1.3e-5，n=303，仅作描述性可视化——逐分子非独立重复）：横轴为逐分子误差平均秩；严格显著性见配对 bootstrap 与折级 Nadeau–Bengio 检验" title="图 5　临界差异图（Friedman p=1.3e-5，n=303，仅作描述性可视化——逐分子非独立重复）：横轴为逐分子误差平均秩；严格显著性见配对 bootstrap 与折级 Nadeau–Bengio 检验"/>
+            <wp:docPr id="1" name="fig_cd_diagram_j.png" descr="图 5　临界差异图（Friedman p=1.3e-5，n=303，仅作描述性可视化，逐分子非独立重复）：横轴为逐分子误差平均秩；严格显著性见配对 bootstrap 与折级 Nadeau–Bengio 检验" title="图 5　临界差异图（Friedman p=1.3e-5，n=303，仅作描述性可视化，逐分子非独立重复）：横轴为逐分子误差平均秩；严格显著性见配对 bootstrap 与折级 Nadeau–Bengio 检验"/>
             <wp:cNvGraphicFramePr>
               <a:graphicFrameLocks xmlns:a="http://schemas.openxmlformats.org/drawingml/2006/main" noChangeAspect="1"/>
             </wp:cNvGraphicFramePr>
@@ -3003,7 +3003,7 @@
           <w:sz w:val="18"/>
           <w:szCs w:val="18"/>
         </w:rPr>
-        <w:t xml:space="preserve">图 5　临界差异图（Friedman p=1.3e-5，n=303，仅作描述性可视化——逐分子非独立重复）：横轴为逐分子误差平均秩；严格显著性见配对 bootstrap 与折级 Nadeau–Bengio 检验</w:t>
+        <w:t xml:space="preserve">图 5　临界差异图（Friedman p=1.3e-5，n=303，仅作描述性可视化，逐分子非独立重复）：横轴为逐分子误差平均秩；严格显著性见配对 bootstrap 与折级 Nadeau–Bengio 检验</w:t>
       </w:r>
     </w:p>
     <w:p>
@@ -3021,7 +3021,7 @@
         <w:jc w:val="both"/>
       </w:pPr>
       <w:r>
-        <w:t xml:space="preserve">调参的诚实结论（图 6）：对欠正则模型（岭回归默认在 2048 维上几乎失效，R 0.65→0.81）调参大幅受益，对随机森林/梯度提升等“默认即好”的树集成仅边际改善、个别略降——可见调参不必然带来稳定增益。进一步，在本实验预算内，任何 Optuna 预算（梯度提升 80 trial、约 986 秒）都未追上零调参的 TabPFN（约 5 秒、MAE 0.498，图 7）；在该预算的耗时-误差权衡上，零调参的 TabPFN 最优，与小样本 BACE 场景契合。</w:t>
+        <w:t xml:space="preserve">调参的诚实结论（图 6）：对欠正则模型（岭回归默认在 2048 维上几乎失效，R 0.65→0.81）调参大幅受益，对随机森林/梯度提升等“默认即好”的树集成仅边际改善、个别略降，可见调参不必然带来稳定增益。进一步，在本实验预算内，任何 Optuna 预算（梯度提升 80 trial、约 986 秒）都未追上零调参的 TabPFN（约 5 秒、MAE 0.498，图 7）；在该预算的耗时-误差权衡上，零调参的 TabPFN 最优，与小样本 BACE 场景契合。</w:t>
       </w:r>
     </w:p>
     <w:p>
@@ -3161,7 +3161,7 @@
         <w:jc w:val="both"/>
       </w:pPr>
       <w:r>
-        <w:t xml:space="preserve">误差并非随机：所有模型都“回归到均值”（低估高活性、高估低活性，TabPFN 收缩最小）；误差最大的十分位分子中，19% 落在活性悬崖（其余仅 1%）、16% 为标签冲突骨架（其余 2%），且更偏新骨架与极端活性（图 8）；跨 8 模型共识最难的分子多为大环、碎片样小分子或极端活性（图 9）。调参只缩小误差幅度、不改变“谁难”（大误差集合重叠 76%）。TabPFN 的预测区间宽度可预警高误差风险、支持拒识策略（难例按测试误差事后定义，但区间宽度在预测时即可用）——58% 的共识难例落在其 90% 区间之外（易预测分子仅 6%，图 10）。</w:t>
+        <w:t xml:space="preserve">误差并非随机：所有模型都“回归到均值”（低估高活性、高估低活性，TabPFN 收缩最小）；误差最大的十分位分子中，19% 落在活性悬崖（其余仅 1%）、16% 为标签冲突骨架（其余 2%），且更偏新骨架与极端活性（图 8）；跨 8 模型共识最难的分子多为大环、碎片样小分子或极端活性（图 9）。调参只缩小误差幅度、不改变“谁难”（大误差集合重叠 76%）。TabPFN 的预测区间宽度可预警高误差风险、支持拒识策略（难例按测试误差事后定义，但区间宽度在预测时即可用）：58% 的共识难例落在其 90% 区间之外（易预测分子仅 6%，图 10）。</w:t>
       </w:r>
     </w:p>
     <w:p>
@@ -3362,7 +3362,7 @@
         <w:jc w:val="both"/>
       </w:pPr>
       <w:r>
-        <w:t xml:space="preserve">预定义划分有约 64% 骨架重叠、会高估泛化。按 Murcko 骨架严格重划（训练/测试无共享骨架）重训全部 8 模型后（图 11）：TabPFN 几乎不退化（MAE 0.498→0.508，仍最低、差距最小），全参微调的 MolFormer 泛化性能明显退化（0.673→1.134）——TabPFN 对新化学的外推在本实验中表现最稳。可信度方面（图 12，名义 90%，仅用验证集校准、全模型同一协议、测试集不参与调 coverage）：各模型边际覆盖率均达标（0.90–0.95），Chemprop 区间最紧；但按相似度分层，8 个模型中有 6 个在低相似度（新骨架）子群覆盖率降至 0.2–0.5（低 AD 子群 n=10，为探索性结果，需更大外部集验证），仅 TabPFN 与 MolFormer 在低 AD 仍接近 0.9（MolFormer 的代价是区间显著更宽，TabPFN 则同时保持紧致）。</w:t>
+        <w:t xml:space="preserve">预定义划分有约 64% 骨架重叠、会高估泛化。按 Murcko 骨架严格重划（训练/测试无共享骨架）重训全部 8 模型后（图 11）：TabPFN 几乎不退化（MAE 0.498→0.508，仍最低、差距最小），全参微调的 MolFormer 泛化性能明显退化（0.673→1.134）；TabPFN 对新化学的外推在本实验中表现最稳。可信度方面（图 12，名义 90%，仅用验证集校准、全模型同一协议、测试集不参与调 coverage）：各模型边际覆盖率均达标（0.90–0.95），Chemprop 区间最紧；但按相似度分层，8 个模型中有 6 个在低相似度（新骨架）子群覆盖率降至 0.2–0.5（低 AD 子群 n=10，为探索性结果，需更大外部集验证），仅 TabPFN 与 MolFormer 在低 AD 仍接近 0.9（MolFormer 的代价是区间显著更宽，TabPFN 则同时保持紧致）。</w:t>
       </w:r>
     </w:p>
     <w:p>
@@ -3436,7 +3436,7 @@
           <wp:inline distT="0" distB="0" distL="0" distR="0">
             <wp:extent cx="5143500" cy="2019300"/>
             <wp:effectExtent t="0" r="0" b="0" l="0"/>
-            <wp:docPr id="1" name="fig_conformal_benchmark_j.png" descr="图 12　Conformal 全模型基准（名义 90%）：(a) 覆盖率 vs 区间宽度；(b) 按适用域分层的条件覆盖——低 AD 普遍欠覆盖" title="图 12　Conformal 全模型基准（名义 90%）：(a) 覆盖率 vs 区间宽度；(b) 按适用域分层的条件覆盖——低 AD 普遍欠覆盖"/>
+            <wp:docPr id="1" name="fig_conformal_benchmark_j.png" descr="图 12　Conformal 全模型基准（名义 90%）：(a) 覆盖率 vs 区间宽度；(b) 按适用域分层的条件覆盖：低 AD 普遍欠覆盖" title="图 12　Conformal 全模型基准（名义 90%）：(a) 覆盖率 vs 区间宽度；(b) 按适用域分层的条件覆盖：低 AD 普遍欠覆盖"/>
             <wp:cNvGraphicFramePr>
               <a:graphicFrameLocks xmlns:a="http://schemas.openxmlformats.org/drawingml/2006/main" noChangeAspect="1"/>
             </wp:cNvGraphicFramePr>
@@ -3484,7 +3484,7 @@
           <w:sz w:val="18"/>
           <w:szCs w:val="18"/>
         </w:rPr>
-        <w:t xml:space="preserve">图 12　Conformal 全模型基准（名义 90%）：(a) 覆盖率 vs 区间宽度；(b) 按适用域分层的条件覆盖——低 AD 普遍欠覆盖</w:t>
+        <w:t xml:space="preserve">图 12　Conformal 全模型基准（名义 90%）：(a) 覆盖率 vs 区间宽度；(b) 按适用域分层的条件覆盖：低 AD 普遍欠覆盖</w:t>
       </w:r>
     </w:p>
     <w:p>
@@ -3502,7 +3502,7 @@
         <w:jc w:val="both"/>
       </w:pPr>
       <w:r>
-        <w:t xml:space="preserve">将测试集配体用 Vina 对接进 4D8C（图 13）：对接打分与实验活性的相关较弱（Pearson −0.33），且控制分子尺寸后接近 0（偏相关 −0.17）——因为活性配体偏大、Vina 又偏好大配体，是尺寸混淆；监督 QSAR 在同一测试集上相关性更高（R 0.84–0.87），但两者用途不同（对接给的是结合位姿，不作同类性能比较）。共晶配体 BXD 重对接 RMSD 仅 1.13 Å，支持基础对接设置合理。在 161 个活性悬崖对上检验 PBCNet2（指标为相对 ΔpIC50 排序 |Spearman ρ|，已按 ΔΔG 符号对齐）：其排序（0.375，约束位姿复测 0.174）低于配体模型（0.78）——这是一个诚实的阴性结果，可能主要受 cross-docking 位姿质量限制（而非 PBCNet2 本身——它在 FEP 基准上表现优异），界定了结构-成对模型的适用范围（图 14）。需要说明的是，悬崖对之间存在共享配体，pair-level 相关性不应解释为 161 个完全独立样本。</w:t>
+        <w:t xml:space="preserve">将测试集配体用 Vina 对接进 4D8C（图 13）：对接打分与实验活性的相关较弱（Pearson −0.33），且控制分子尺寸后接近 0（偏相关 −0.17），因为活性配体偏大、Vina 又偏好大配体，是尺寸混淆；监督 QSAR 在同一测试集上相关性更高（R 0.84–0.87），但两者用途不同（对接给的是结合位姿，不作同类性能比较）。共晶配体 BXD 重对接 RMSD 仅 1.13 Å，支持基础对接设置合理。在 161 个活性悬崖对上检验 PBCNet2（指标为相对 ΔpIC50 排序 |Spearman ρ|，已按 ΔΔG 符号对齐）：其排序（0.375，约束位姿复测 0.174）低于配体模型（0.78）。这是一个诚实的阴性结果，可能主要受 cross-docking 位姿质量限制（而非 PBCNet2 本身，它在 FEP 基准上表现优异），界定了结构-成对模型的适用范围（图 14）。需要说明的是，悬崖对之间存在共享配体，pair-level 相关性不应解释为 161 个完全独立样本。</w:t>
       </w:r>
     </w:p>
     <w:p>
@@ -3515,7 +3515,7 @@
           <wp:inline distT="0" distB="0" distL="0" distR="0">
             <wp:extent cx="4953000" cy="2019300"/>
             <wp:effectExtent t="0" r="0" b="0" l="0"/>
-            <wp:docPr id="1" name="fig_docking_analysis_j.png" descr="图 13　对接 vs 活性 vs ML：(a) Vina 打分 vs 实验 pIC50（按重原子数着色，尺寸混淆）；(b) |Pearson| 对比——监督 QSAR 相关性更高" title="图 13　对接 vs 活性 vs ML：(a) Vina 打分 vs 实验 pIC50（按重原子数着色，尺寸混淆）；(b) |Pearson| 对比——监督 QSAR 相关性更高"/>
+            <wp:docPr id="1" name="fig_docking_analysis_j.png" descr="图 13　对接 vs 活性 vs ML：(a) Vina 打分 vs 实验 pIC50（按重原子数着色，尺寸混淆）；(b) |Pearson| 对比：监督 QSAR 相关性更高" title="图 13　对接 vs 活性 vs ML：(a) Vina 打分 vs 实验 pIC50（按重原子数着色，尺寸混淆）；(b) |Pearson| 对比：监督 QSAR 相关性更高"/>
             <wp:cNvGraphicFramePr>
               <a:graphicFrameLocks xmlns:a="http://schemas.openxmlformats.org/drawingml/2006/main" noChangeAspect="1"/>
             </wp:cNvGraphicFramePr>
@@ -3563,7 +3563,7 @@
           <w:sz w:val="18"/>
           <w:szCs w:val="18"/>
         </w:rPr>
-        <w:t xml:space="preserve">图 13　对接 vs 活性 vs ML：(a) Vina 打分 vs 实验 pIC50（按重原子数着色，尺寸混淆）；(b) |Pearson| 对比——监督 QSAR 相关性更高</w:t>
+        <w:t xml:space="preserve">图 13　对接 vs 活性 vs ML：(a) Vina 打分 vs 实验 pIC50（按重原子数着色，尺寸混淆）；(b) |Pearson| 对比：监督 QSAR 相关性更高</w:t>
       </w:r>
     </w:p>
     <w:p>
@@ -3642,7 +3642,7 @@
         <w:jc w:val="both"/>
       </w:pPr>
       <w:r>
-        <w:t xml:space="preserve">为排除“基准排名只是 Morgan 指纹的产物”这一可能，固定模型为随机森林、只更换分子表征——覆盖课程第五讲给出的指纹清单（Morgan、Atom Pair、Topological Torsion、MACCS、Avalon）与 RDKit 217 维物化描述符，在同一划分上各跑 3 个种子（表 2、图 15）。Morgan（MAE 0.559）与 Topological Torsion 并列最优，Atom Pair 的 Pearson R 最高（0.847），三者同属第一梯队；低容量的 MACCS（167 位）明显最弱（MAE 0.609）。两点结论：其一，主基准选用 Morgan 合理，它处在表征第一梯队；其二，固定模型下不同表征的 MAE 仅相差约 0.05，远小于模型之间的差距，模型排名并非表征选择的假象。此处未调参的 RF+Morgan（0.559）与基准表中经 Optuna 调参的 RF（0.554）几乎一致，互为印证。</w:t>
+        <w:t xml:space="preserve">为排除“基准排名只是 Morgan 指纹的产物”这一可能，固定模型为随机森林、只更换分子表征，覆盖课程第五讲给出的指纹清单（Morgan、Atom Pair、Topological Torsion、MACCS、Avalon）与 RDKit 217 维物化描述符，在同一划分上各跑 3 个种子（表 2、图 15）。Morgan（MAE 0.559）与 Topological Torsion 并列最优，Atom Pair 的 Pearson R 最高（0.847），三者同属第一梯队；低容量的 MACCS（167 位）明显最弱（MAE 0.609）。两点结论：其一，主基准选用 Morgan 合理，它处在表征第一梯队；其二，固定模型下不同表征的 MAE 仅相差约 0.05，远小于模型之间的差距，模型排名并非表征选择的假象。此处未调参的 RF+Morgan（0.559）与基准表中经 Optuna 调参的 RF（0.554）几乎一致，互为印证。</w:t>
       </w:r>
     </w:p>
     <w:p>
@@ -4658,7 +4658,7 @@
           <wp:inline distT="0" distB="0" distL="0" distR="0">
             <wp:extent cx="4953000" cy="1866900"/>
             <wp:effectExtent t="0" r="0" b="0" l="0"/>
-            <wp:docPr id="1" name="fp_ablation.png" descr="图 15　表征消融（模型固定为随机森林）：(a) 测试 MAE；(b) 测试 Pearson R——Morgan / Atom Pair / Topological Torsion 同属第一梯队，MACCS 最弱" title="图 15　表征消融（模型固定为随机森林）：(a) 测试 MAE；(b) 测试 Pearson R——Morgan / Atom Pair / Topological Torsion 同属第一梯队，MACCS 最弱"/>
+            <wp:docPr id="1" name="fp_ablation.png" descr="图 15　表征消融（模型固定为随机森林）：(a) 测试 MAE；(b) 测试 Pearson R：Morgan / Atom Pair / Topological Torsion 同属第一梯队，MACCS 最弱" title="图 15　表征消融（模型固定为随机森林）：(a) 测试 MAE；(b) 测试 Pearson R：Morgan / Atom Pair / Topological Torsion 同属第一梯队，MACCS 最弱"/>
             <wp:cNvGraphicFramePr>
               <a:graphicFrameLocks xmlns:a="http://schemas.openxmlformats.org/drawingml/2006/main" noChangeAspect="1"/>
             </wp:cNvGraphicFramePr>
@@ -4706,7 +4706,7 @@
           <w:sz w:val="18"/>
           <w:szCs w:val="18"/>
         </w:rPr>
-        <w:t xml:space="preserve">图 15　表征消融（模型固定为随机森林）：(a) 测试 MAE；(b) 测试 Pearson R——Morgan / Atom Pair / Topological Torsion 同属第一梯队，MACCS 最弱</w:t>
+        <w:t xml:space="preserve">图 15　表征消融（模型固定为随机森林）：(a) 测试 MAE；(b) 测试 Pearson R：Morgan / Atom Pair / Topological Torsion 同属第一梯队，MACCS 最弱</w:t>
       </w:r>
     </w:p>
     <w:p>
@@ -4733,7 +4733,7 @@
         <w:jc w:val="both"/>
       </w:pPr>
       <w:r>
-        <w:t xml:space="preserve">为回答“模型究竟学到了什么化学”，对随机森林做两层可解释性分析（均不依赖额外黑箱工具）。其一，在 RDKit 描述符上用置换重要性（permutation importance，测试集 R² 的下降量）排序（图 16）：分子大小 / 连接度类描述符主导（Chi0 居首，与 pIC50 的 Spearman ρ=+0.47；重原子量、分子复杂度 BertzCT 同为正相关），辅以 E-state 电子拓扑指数——表明在该 BACE 同系物系列中，更大、更复杂的分子普遍更强（描述符彼此高度相关，应按“主题”而非单个特征解读）。其二，把随机森林重要性最高的 Morgan 位映射回原子环境并渲染为子结构（图 17）：可定位若干增效 / 致弱基团（如某含氟芳环环境一旦出现，平均 pIC50 下降约 1.73）。该视角呼应课程对“可解释性 + 适用域”的强调，也为先导优化指明取舍方向。</w:t>
+        <w:t xml:space="preserve">为回答“模型究竟学到了什么化学”，对随机森林做两层可解释性分析（均不依赖额外黑箱工具）。其一，在 RDKit 描述符上用置换重要性（permutation importance，测试集 R² 的下降量）排序（图 16）：分子大小 / 连接度类描述符主导（Chi0 居首，与 pIC50 的 Spearman ρ=+0.47；重原子量、分子复杂度 BertzCT 同为正相关），辅以 E-state 电子拓扑指数，表明在该 BACE 同系物系列中，更大、更复杂的分子普遍更强（描述符彼此高度相关，应按“主题”而非单个特征解读）。其二，把随机森林重要性最高的 Morgan 位映射回原子环境并渲染为子结构（图 17）：可定位若干增效 / 致弱基团（如某含氟芳环环境一旦出现，平均 pIC50 下降约 1.73）。该视角呼应课程对“可解释性 + 适用域”的强调，也为先导优化指明取舍方向。</w:t>
       </w:r>
     </w:p>
     <w:p>
@@ -4882,7 +4882,7 @@
         <w:jc w:val="both"/>
       </w:pPr>
       <w:r>
-        <w:t xml:space="preserve">分类轴（表 3、图 18）：以 pIC50≥7（IC50≤100 nM；测试集 43.9% 为活性、类别均衡）二分，用连续预测 pIC50 作打分计算 ROC-AUC / PR-AUC，在阈值 7 处二值化算 F1 / MCC。Chemprop 图网络给出最高 ROC-AUC（0.915）与 MCC（0.650），TabPFN 次之（0.900 / 0.631）。一个值得注意的细节：回归点估计最优的 TabPFN 在分类轴上略逊于 Chemprop——没有单一模型在所有评估轴上通吃，评估口径会改变“谁最好”的结论。</w:t>
+        <w:t xml:space="preserve">分类轴（表 3、图 18）：以 pIC50≥7（IC50≤100 nM；测试集 43.9% 为活性、类别均衡）二分，用连续预测 pIC50 作打分计算 ROC-AUC / PR-AUC，在阈值 7 处二值化算 F1 / MCC。Chemprop 图网络给出最高 ROC-AUC（0.915）与 MCC（0.650），TabPFN 次之（0.900 / 0.631）。一个值得注意的细节：回归点估计最优的 TabPFN 在分类轴上略逊于 Chemprop，没有单一模型在所有评估轴上都最优，评估口径会改变“谁最好”的结论。</w:t>
       </w:r>
     </w:p>
     <w:p>
@@ -6490,7 +6490,7 @@
           <wp:inline distT="0" distB="0" distL="0" distR="0">
             <wp:extent cx="5143500" cy="2124075"/>
             <wp:effectExtent t="0" r="0" b="0" l="0"/>
-            <wp:docPr id="1" name="classification_view.png" descr="图 18　分类视角：(a) 8 个模型的 ROC 曲线（active = pIC50 ≥ 7）；(b) MCC——Chemprop 最高，回归最优的 TabPFN 在分类轴略逊" title="图 18　分类视角：(a) 8 个模型的 ROC 曲线（active = pIC50 ≥ 7）；(b) MCC——Chemprop 最高，回归最优的 TabPFN 在分类轴略逊"/>
+            <wp:docPr id="1" name="classification_view.png" descr="图 18　分类视角：(a) 8 个模型的 ROC 曲线（active = pIC50 ≥ 7）；(b) MCC：Chemprop 最高，回归最优的 TabPFN 在分类轴略逊" title="图 18　分类视角：(a) 8 个模型的 ROC 曲线（active = pIC50 ≥ 7）；(b) MCC：Chemprop 最高，回归最优的 TabPFN 在分类轴略逊"/>
             <wp:cNvGraphicFramePr>
               <a:graphicFrameLocks xmlns:a="http://schemas.openxmlformats.org/drawingml/2006/main" noChangeAspect="1"/>
             </wp:cNvGraphicFramePr>
@@ -6538,7 +6538,7 @@
           <w:sz w:val="18"/>
           <w:szCs w:val="18"/>
         </w:rPr>
-        <w:t xml:space="preserve">图 18　分类视角：(a) 8 个模型的 ROC 曲线（active = pIC50 ≥ 7）；(b) MCC——Chemprop 最高，回归最优的 TabPFN 在分类轴略逊</w:t>
+        <w:t xml:space="preserve">图 18　分类视角：(a) 8 个模型的 ROC 曲线（active = pIC50 ≥ 7）；(b) MCC：Chemprop 最高，回归最优的 TabPFN 在分类轴略逊</w:t>
       </w:r>
     </w:p>
     <w:p>
@@ -6551,7 +6551,7 @@
           <wp:inline distT="0" distB="0" distL="0" distR="0">
             <wp:extent cx="5143500" cy="2124075"/>
             <wp:effectExtent t="0" r="0" b="0" l="0"/>
-            <wp:docPr id="1" name="screening_power.png" descr="图 19　早期富集（高活性 = 最高 10%，pIC50 ≥ 8.04）：(a) 富集曲线；(b) EF@5%——各模型在排序表头富集约 4–7 倍于随机" title="图 19　早期富集（高活性 = 最高 10%，pIC50 ≥ 8.04）：(a) 富集曲线；(b) EF@5%——各模型在排序表头富集约 4–7 倍于随机"/>
+            <wp:docPr id="1" name="screening_power.png" descr="图 19　早期富集（高活性 = 最高 10%，pIC50 ≥ 8.04）：(a) 富集曲线；(b) EF@5%：各模型在排序表头富集约 4–7 倍于随机" title="图 19　早期富集（高活性 = 最高 10%，pIC50 ≥ 8.04）：(a) 富集曲线；(b) EF@5%：各模型在排序表头富集约 4–7 倍于随机"/>
             <wp:cNvGraphicFramePr>
               <a:graphicFrameLocks xmlns:a="http://schemas.openxmlformats.org/drawingml/2006/main" noChangeAspect="1"/>
             </wp:cNvGraphicFramePr>
@@ -6599,7 +6599,7 @@
           <w:sz w:val="18"/>
           <w:szCs w:val="18"/>
         </w:rPr>
-        <w:t xml:space="preserve">图 19　早期富集（高活性 = 最高 10%，pIC50 ≥ 8.04）：(a) 富集曲线；(b) EF@5%——各模型在排序表头富集约 4–7 倍于随机</w:t>
+        <w:t xml:space="preserve">图 19　早期富集（高活性 = 最高 10%，pIC50 ≥ 8.04）：(a) 富集曲线；(b) EF@5%：各模型在排序表头富集约 4–7 倍于随机</w:t>
       </w:r>
     </w:p>
     <w:p>
@@ -6630,7 +6630,7 @@
         <w:spacing w:after="60" w:line="300"/>
       </w:pPr>
       <w:r>
-        <w:t xml:space="preserve">零调参的表格基础模型 TabPFN 在点预测上为最佳点估计，在 scaffold 外推与低 AD 条件覆盖上表现最稳，整体属于第一梯队；它与 Chemprop、RF、ChemFM 同属第一梯队。显著性依检验口径而定：在逐分子配对 bootstrap 与主分析 ρ=1/9 的 Nadeau–Bengio 检验下，TabPFN 显著优于线性/核模型与 RF/GBM；但在保守 ρ=0.25 NB-Holm 校正下，仅全参微调的 MolFormer 仍显著更差，其余差异不显著——故宜表述为第一梯队，而非全面碾压。</w:t>
+        <w:t xml:space="preserve">零调参的表格基础模型 TabPFN 在点预测上为最佳点估计，在 scaffold 外推与低 AD 条件覆盖上表现最稳，整体属于第一梯队；它与 Chemprop、RF、ChemFM 同属第一梯队。显著性依检验口径而定：在逐分子配对 bootstrap 与主分析 ρ=1/9 的 Nadeau–Bengio 检验下，TabPFN 显著优于线性/核模型与 RF/GBM；但在保守 ρ=0.25 NB-Holm 校正下，仅全参微调的 MolFormer 仍显著更差，其余差异不显著。</w:t>
       </w:r>
     </w:p>
     <w:p>
@@ -6656,7 +6656,7 @@
         <w:spacing w:after="60" w:line="300"/>
       </w:pPr>
       <w:r>
-        <w:t xml:space="preserve">结构方法（对接 / PBCNet2）在本设置下未能弥补配体模型短板：Vina 打分弱且受尺寸混淆，PBCNet2 在对接位姿上未超过配体模型——这是一个界定适用范围的阴性结果，瓶颈可能主要在位姿质量而非模型类别。</w:t>
+        <w:t xml:space="preserve">结构方法（对接 / PBCNet2）在本设置下未能弥补配体模型短板：Vina 打分弱且受尺寸混淆，PBCNet2 在对接位姿上未超过配体模型。这是一个界定适用范围的阴性结果，瓶颈可能主要在位姿质量而非模型类别。</w:t>
       </w:r>
     </w:p>
     <w:p>
@@ -6669,7 +6669,7 @@
         <w:spacing w:after="60" w:line="300"/>
       </w:pPr>
       <w:r>
-        <w:t xml:space="preserve">表征与评估口径的稳健性检查进一步支撑主结论：固定模型只换指纹，模型排名不变（Morgan 处第一梯队）；换成分类（ROC-AUC / MCC）与早期富集（EF）两条轴后，各模型整体仍可用，但“谁第一”随口径轻微变化（回归看 TabPFN、分类看 Chemprop）——评估应多轴并看，不可只报单一指标。</w:t>
+        <w:t xml:space="preserve">表征与评估口径的稳健性检查进一步支撑主结论：固定模型只换指纹，模型排名不变（Morgan 处第一梯队）；换成分类（ROC-AUC / MCC）与早期富集（EF）两条轴后，各模型整体仍可用，但“谁第一”随口径轻微变化（回归看 TabPFN、分类看 Chemprop）。评估应多轴并看，不可只报单一指标。</w:t>
       </w:r>
     </w:p>
     <w:p>
@@ -6698,7 +6698,7 @@
         <w:t xml:space="preserve">方法论思考：</w:t>
       </w:r>
       <w:r>
-        <w:t xml:space="preserve">本实验最看重的不是把某个数字刷高，而是让每个结论都能被质疑也能被辩护——用阴性对照排除随机标签记忆、用 scaffold split 量化并披露相似性泄漏、用统计检验约束“显著”一词、对结构方法的阴性结果不作过度归因。这是把“看起来很准”升级为“知道它何时可信”的关键。</w:t>
+        <w:t xml:space="preserve">本实验最看重的不是优化单一数值指标，而是让每个结论都能被质疑也能被辩护：用阴性对照排除随机标签记忆、用 scaffold split 量化并披露相似性泄漏、用统计检验约束“显著”一词、对结构方法的阴性结果不作过度归因。这是把“看起来很准”升级为“知道它何时可信”的关键。</w:t>
       </w:r>
     </w:p>
     <w:p>
@@ -6730,7 +6730,7 @@
         <w:t xml:space="preserve">研究范围界定：</w:t>
       </w:r>
       <w:r>
-        <w:t xml:space="preserve">本实验聚焦先导优化阶段的“活性预测 + 结构复核”，未涉及分子生成、逆合成或新靶标发现——课程允许选择其中一项预测任务，本项目选定并完整实现了 BACE pIC50 活性预测这一项。</w:t>
+        <w:t xml:space="preserve">本实验聚焦先导优化阶段的“活性预测 + 结构复核”，未涉及分子生成、逆合成或新靶标发现；课程允许选择其中一项预测任务，本项目选定并完整实现了 BACE pIC50 活性预测这一项。</w:t>
       </w:r>
     </w:p>
     <w:p>
@@ -6992,7 +6992,7 @@
         <w:t xml:space="preserve">A. 可复现性审计：</w:t>
       </w:r>
       <w:r>
-        <w:t xml:space="preserve">阴性对照——置换训练标签后用同一流程重训，RF / GBM / TabPFN 测试 Pearson R 分别降至 −0.11 / −0.04 / −0.05，支持 R≈0.84–0.87 来自可学习的结构-活性信号、而非对随机标签的记忆；泄漏审计——预定义划分骨架重叠约 64%、约 29% 测试分子 Tanimoto&gt;0.85，scaffold split 已将相似性虚高剥离（RF MAE 0.554→0.684）。统一 set_all_seeds、3 seed、调参只用验证 / 折内 CV、测试集只看一次、所有图由 scripts/ 脚本一键重出。</w:t>
+        <w:t xml:space="preserve">阴性对照：置换训练标签后用同一流程重训，RF / GBM / TabPFN 测试 Pearson R 分别降至 −0.11 / −0.04 / −0.05，支持 R≈0.84–0.87 来自可学习的结构-活性信号、而非对随机标签的记忆；泄漏审计：预定义划分骨架重叠约 64%、约 29% 测试分子 Tanimoto&gt;0.85，scaffold split 已将相似性虚高剥离（RF MAE 0.554→0.684）。统一 set_all_seeds、3 seed、调参只用验证 / 折内 CV、测试集只看一次、所有图由 scripts/ 脚本一键重出。</w:t>
       </w:r>
     </w:p>
     <w:p>

</xml_diff>

<commit_message>
report: fix faux-bold CJK fonts and append JCIM paper as appendix D
- Fonts: the report aliased title/heading/body all to Noto Serif CJK SC,
  whose only installed weight is Regular, so every bold run (title, H1/H2,
  bold labels, table headers) was algorithmically faux-bolded and looked
  smeared. Switch to fonts with real weights installed on the build host:
  headings/title -> PingFang SC (real Semibold), body -> Songti SC (real
  Bold). Restores proper Chinese typography (sans heading, serif body).
- Appendix: add 'D. 配套 JCIM 投稿论文' to the report appendix introducing
  the companion English manuscript.
- Add scripts/make_combined_report.py (pypdf) to concatenate the report
  with the JCIM manuscript + SI into one bookmarked PDF; gitignore that
  regenerable combined deliverable.

Assisted-by: Claude
</commit_message>
<xml_diff>
--- a/report/课程实验报告_BACE.docx
+++ b/report/课程实验报告_BACE.docx
@@ -101,7 +101,7 @@
       </w:pPr>
       <w:r>
         <w:rPr>
-          <w:rFonts w:ascii="Times New Roman" w:cs="Times New Roman" w:eastAsia="Noto Serif CJK SC" w:hAnsi="Times New Roman"/>
+          <w:rFonts w:ascii="Times New Roman" w:cs="Times New Roman" w:eastAsia="PingFang SC" w:hAnsi="Times New Roman"/>
           <w:b/>
           <w:bCs/>
           <w:color w:val="1F3864"/>
@@ -152,7 +152,7 @@
           <w:p>
             <w:r>
               <w:rPr>
-                <w:rFonts w:ascii="Times New Roman" w:cs="Times New Roman" w:eastAsia="Noto Serif CJK SC" w:hAnsi="Times New Roman"/>
+                <w:rFonts w:ascii="Times New Roman" w:cs="Times New Roman" w:eastAsia="Songti SC" w:hAnsi="Times New Roman"/>
                 <w:b/>
                 <w:bCs/>
                 <w:sz w:val="22"/>
@@ -183,7 +183,7 @@
           <w:p>
             <w:r>
               <w:rPr>
-                <w:rFonts w:ascii="Times New Roman" w:cs="Times New Roman" w:eastAsia="Noto Serif CJK SC" w:hAnsi="Times New Roman"/>
+                <w:rFonts w:ascii="Times New Roman" w:cs="Times New Roman" w:eastAsia="Songti SC" w:hAnsi="Times New Roman"/>
                 <w:b w:val="false"/>
                 <w:bCs w:val="false"/>
                 <w:sz w:val="22"/>
@@ -216,7 +216,7 @@
           <w:p>
             <w:r>
               <w:rPr>
-                <w:rFonts w:ascii="Times New Roman" w:cs="Times New Roman" w:eastAsia="Noto Serif CJK SC" w:hAnsi="Times New Roman"/>
+                <w:rFonts w:ascii="Times New Roman" w:cs="Times New Roman" w:eastAsia="Songti SC" w:hAnsi="Times New Roman"/>
                 <w:b/>
                 <w:bCs/>
                 <w:sz w:val="22"/>
@@ -247,7 +247,7 @@
           <w:p>
             <w:r>
               <w:rPr>
-                <w:rFonts w:ascii="Times New Roman" w:cs="Times New Roman" w:eastAsia="Noto Serif CJK SC" w:hAnsi="Times New Roman"/>
+                <w:rFonts w:ascii="Times New Roman" w:cs="Times New Roman" w:eastAsia="Songti SC" w:hAnsi="Times New Roman"/>
                 <w:b w:val="false"/>
                 <w:bCs w:val="false"/>
                 <w:sz w:val="22"/>
@@ -278,7 +278,7 @@
           <w:p>
             <w:r>
               <w:rPr>
-                <w:rFonts w:ascii="Times New Roman" w:cs="Times New Roman" w:eastAsia="Noto Serif CJK SC" w:hAnsi="Times New Roman"/>
+                <w:rFonts w:ascii="Times New Roman" w:cs="Times New Roman" w:eastAsia="Songti SC" w:hAnsi="Times New Roman"/>
                 <w:b/>
                 <w:bCs/>
                 <w:sz w:val="22"/>
@@ -309,7 +309,7 @@
           <w:p>
             <w:r>
               <w:rPr>
-                <w:rFonts w:ascii="Times New Roman" w:cs="Times New Roman" w:eastAsia="Noto Serif CJK SC" w:hAnsi="Times New Roman"/>
+                <w:rFonts w:ascii="Times New Roman" w:cs="Times New Roman" w:eastAsia="Songti SC" w:hAnsi="Times New Roman"/>
                 <w:b w:val="false"/>
                 <w:bCs w:val="false"/>
                 <w:sz w:val="22"/>
@@ -342,7 +342,7 @@
           <w:p>
             <w:r>
               <w:rPr>
-                <w:rFonts w:ascii="Times New Roman" w:cs="Times New Roman" w:eastAsia="Noto Serif CJK SC" w:hAnsi="Times New Roman"/>
+                <w:rFonts w:ascii="Times New Roman" w:cs="Times New Roman" w:eastAsia="Songti SC" w:hAnsi="Times New Roman"/>
                 <w:b/>
                 <w:bCs/>
                 <w:sz w:val="22"/>
@@ -373,7 +373,7 @@
           <w:p>
             <w:r>
               <w:rPr>
-                <w:rFonts w:ascii="Times New Roman" w:cs="Times New Roman" w:eastAsia="Noto Serif CJK SC" w:hAnsi="Times New Roman"/>
+                <w:rFonts w:ascii="Times New Roman" w:cs="Times New Roman" w:eastAsia="Songti SC" w:hAnsi="Times New Roman"/>
                 <w:b w:val="false"/>
                 <w:bCs w:val="false"/>
                 <w:sz w:val="22"/>
@@ -404,7 +404,7 @@
           <w:p>
             <w:r>
               <w:rPr>
-                <w:rFonts w:ascii="Times New Roman" w:cs="Times New Roman" w:eastAsia="Noto Serif CJK SC" w:hAnsi="Times New Roman"/>
+                <w:rFonts w:ascii="Times New Roman" w:cs="Times New Roman" w:eastAsia="Songti SC" w:hAnsi="Times New Roman"/>
                 <w:b/>
                 <w:bCs/>
                 <w:sz w:val="22"/>
@@ -435,7 +435,7 @@
           <w:p>
             <w:r>
               <w:rPr>
-                <w:rFonts w:ascii="Times New Roman" w:cs="Times New Roman" w:eastAsia="Noto Serif CJK SC" w:hAnsi="Times New Roman"/>
+                <w:rFonts w:ascii="Times New Roman" w:cs="Times New Roman" w:eastAsia="Songti SC" w:hAnsi="Times New Roman"/>
                 <w:b w:val="false"/>
                 <w:bCs w:val="false"/>
                 <w:sz w:val="22"/>
@@ -454,7 +454,7 @@
       </w:pPr>
       <w:r>
         <w:rPr>
-          <w:rFonts w:ascii="Times New Roman" w:cs="Times New Roman" w:eastAsia="Noto Serif CJK SC" w:hAnsi="Times New Roman"/>
+          <w:rFonts w:ascii="Times New Roman" w:cs="Times New Roman" w:eastAsia="Songti SC" w:hAnsi="Times New Roman"/>
           <w:sz w:val="22"/>
           <w:szCs w:val="22"/>
         </w:rPr>
@@ -473,7 +473,7 @@
       </w:pPr>
       <w:r>
         <w:rPr>
-          <w:rFonts w:ascii="Times New Roman" w:cs="Times New Roman" w:eastAsia="Noto Serif CJK SC" w:hAnsi="Times New Roman"/>
+          <w:rFonts w:ascii="Times New Roman" w:cs="Times New Roman" w:eastAsia="PingFang SC" w:hAnsi="Times New Roman"/>
           <w:b/>
           <w:bCs/>
           <w:color w:val="1F3864"/>
@@ -490,7 +490,7 @@
       </w:pPr>
       <w:r>
         <w:rPr>
-          <w:rFonts w:ascii="Times New Roman" w:cs="Times New Roman" w:eastAsia="Noto Serif CJK SC" w:hAnsi="Times New Roman"/>
+          <w:rFonts w:ascii="Times New Roman" w:cs="Times New Roman" w:eastAsia="Kaiti SC" w:hAnsi="Times New Roman"/>
           <w:color w:val="555555"/>
           <w:sz w:val="20"/>
           <w:szCs w:val="20"/>
@@ -609,7 +609,7 @@
             </w:pPr>
             <w:r>
               <w:rPr>
-                <w:rFonts w:ascii="Times New Roman" w:cs="Times New Roman" w:eastAsia="Noto Serif CJK SC" w:hAnsi="Times New Roman"/>
+                <w:rFonts w:ascii="Times New Roman" w:cs="Times New Roman" w:eastAsia="Songti SC" w:hAnsi="Times New Roman"/>
                 <w:b/>
                 <w:bCs/>
                 <w:color w:val="FFFFFF"/>
@@ -643,7 +643,7 @@
             </w:pPr>
             <w:r>
               <w:rPr>
-                <w:rFonts w:ascii="Times New Roman" w:cs="Times New Roman" w:eastAsia="Noto Serif CJK SC" w:hAnsi="Times New Roman"/>
+                <w:rFonts w:ascii="Times New Roman" w:cs="Times New Roman" w:eastAsia="Songti SC" w:hAnsi="Times New Roman"/>
                 <w:b/>
                 <w:bCs/>
                 <w:color w:val="FFFFFF"/>
@@ -679,7 +679,7 @@
             </w:pPr>
             <w:r>
               <w:rPr>
-                <w:rFonts w:ascii="Times New Roman" w:cs="Times New Roman" w:eastAsia="Noto Serif CJK SC" w:hAnsi="Times New Roman"/>
+                <w:rFonts w:ascii="Times New Roman" w:cs="Times New Roman" w:eastAsia="Songti SC" w:hAnsi="Times New Roman"/>
                 <w:b w:val="false"/>
                 <w:bCs w:val="false"/>
                 <w:color w:val="000000"/>
@@ -713,7 +713,7 @@
             </w:pPr>
             <w:r>
               <w:rPr>
-                <w:rFonts w:ascii="Times New Roman" w:cs="Times New Roman" w:eastAsia="Noto Serif CJK SC" w:hAnsi="Times New Roman"/>
+                <w:rFonts w:ascii="Times New Roman" w:cs="Times New Roman" w:eastAsia="Songti SC" w:hAnsi="Times New Roman"/>
                 <w:b w:val="false"/>
                 <w:bCs w:val="false"/>
                 <w:color w:val="000000"/>
@@ -749,7 +749,7 @@
             </w:pPr>
             <w:r>
               <w:rPr>
-                <w:rFonts w:ascii="Times New Roman" w:cs="Times New Roman" w:eastAsia="Noto Serif CJK SC" w:hAnsi="Times New Roman"/>
+                <w:rFonts w:ascii="Times New Roman" w:cs="Times New Roman" w:eastAsia="Songti SC" w:hAnsi="Times New Roman"/>
                 <w:b w:val="false"/>
                 <w:bCs w:val="false"/>
                 <w:color w:val="000000"/>
@@ -783,7 +783,7 @@
             </w:pPr>
             <w:r>
               <w:rPr>
-                <w:rFonts w:ascii="Times New Roman" w:cs="Times New Roman" w:eastAsia="Noto Serif CJK SC" w:hAnsi="Times New Roman"/>
+                <w:rFonts w:ascii="Times New Roman" w:cs="Times New Roman" w:eastAsia="Songti SC" w:hAnsi="Times New Roman"/>
                 <w:b w:val="false"/>
                 <w:bCs w:val="false"/>
                 <w:color w:val="000000"/>
@@ -819,7 +819,7 @@
             </w:pPr>
             <w:r>
               <w:rPr>
-                <w:rFonts w:ascii="Times New Roman" w:cs="Times New Roman" w:eastAsia="Noto Serif CJK SC" w:hAnsi="Times New Roman"/>
+                <w:rFonts w:ascii="Times New Roman" w:cs="Times New Roman" w:eastAsia="Songti SC" w:hAnsi="Times New Roman"/>
                 <w:b w:val="false"/>
                 <w:bCs w:val="false"/>
                 <w:color w:val="000000"/>
@@ -853,7 +853,7 @@
             </w:pPr>
             <w:r>
               <w:rPr>
-                <w:rFonts w:ascii="Times New Roman" w:cs="Times New Roman" w:eastAsia="Noto Serif CJK SC" w:hAnsi="Times New Roman"/>
+                <w:rFonts w:ascii="Times New Roman" w:cs="Times New Roman" w:eastAsia="Songti SC" w:hAnsi="Times New Roman"/>
                 <w:b w:val="false"/>
                 <w:bCs w:val="false"/>
                 <w:color w:val="000000"/>
@@ -889,7 +889,7 @@
             </w:pPr>
             <w:r>
               <w:rPr>
-                <w:rFonts w:ascii="Times New Roman" w:cs="Times New Roman" w:eastAsia="Noto Serif CJK SC" w:hAnsi="Times New Roman"/>
+                <w:rFonts w:ascii="Times New Roman" w:cs="Times New Roman" w:eastAsia="Songti SC" w:hAnsi="Times New Roman"/>
                 <w:b w:val="false"/>
                 <w:bCs w:val="false"/>
                 <w:color w:val="000000"/>
@@ -923,7 +923,7 @@
             </w:pPr>
             <w:r>
               <w:rPr>
-                <w:rFonts w:ascii="Times New Roman" w:cs="Times New Roman" w:eastAsia="Noto Serif CJK SC" w:hAnsi="Times New Roman"/>
+                <w:rFonts w:ascii="Times New Roman" w:cs="Times New Roman" w:eastAsia="Songti SC" w:hAnsi="Times New Roman"/>
                 <w:b w:val="false"/>
                 <w:bCs w:val="false"/>
                 <w:color w:val="000000"/>
@@ -959,7 +959,7 @@
             </w:pPr>
             <w:r>
               <w:rPr>
-                <w:rFonts w:ascii="Times New Roman" w:cs="Times New Roman" w:eastAsia="Noto Serif CJK SC" w:hAnsi="Times New Roman"/>
+                <w:rFonts w:ascii="Times New Roman" w:cs="Times New Roman" w:eastAsia="Songti SC" w:hAnsi="Times New Roman"/>
                 <w:b w:val="false"/>
                 <w:bCs w:val="false"/>
                 <w:color w:val="000000"/>
@@ -993,7 +993,7 @@
             </w:pPr>
             <w:r>
               <w:rPr>
-                <w:rFonts w:ascii="Times New Roman" w:cs="Times New Roman" w:eastAsia="Noto Serif CJK SC" w:hAnsi="Times New Roman"/>
+                <w:rFonts w:ascii="Times New Roman" w:cs="Times New Roman" w:eastAsia="Songti SC" w:hAnsi="Times New Roman"/>
                 <w:b w:val="false"/>
                 <w:bCs w:val="false"/>
                 <w:color w:val="000000"/>
@@ -1029,7 +1029,7 @@
             </w:pPr>
             <w:r>
               <w:rPr>
-                <w:rFonts w:ascii="Times New Roman" w:cs="Times New Roman" w:eastAsia="Noto Serif CJK SC" w:hAnsi="Times New Roman"/>
+                <w:rFonts w:ascii="Times New Roman" w:cs="Times New Roman" w:eastAsia="Songti SC" w:hAnsi="Times New Roman"/>
                 <w:b w:val="false"/>
                 <w:bCs w:val="false"/>
                 <w:color w:val="000000"/>
@@ -1063,7 +1063,7 @@
             </w:pPr>
             <w:r>
               <w:rPr>
-                <w:rFonts w:ascii="Times New Roman" w:cs="Times New Roman" w:eastAsia="Noto Serif CJK SC" w:hAnsi="Times New Roman"/>
+                <w:rFonts w:ascii="Times New Roman" w:cs="Times New Roman" w:eastAsia="Songti SC" w:hAnsi="Times New Roman"/>
                 <w:b w:val="false"/>
                 <w:bCs w:val="false"/>
                 <w:color w:val="000000"/>
@@ -1307,7 +1307,7 @@
       </w:pPr>
       <w:r>
         <w:rPr>
-          <w:rFonts w:ascii="Times New Roman" w:cs="Times New Roman" w:eastAsia="Noto Serif CJK SC" w:hAnsi="Times New Roman"/>
+          <w:rFonts w:ascii="Times New Roman" w:cs="Times New Roman" w:eastAsia="PingFang SC" w:hAnsi="Times New Roman"/>
           <w:color w:val="333333"/>
           <w:sz w:val="18"/>
           <w:szCs w:val="18"/>
@@ -1368,7 +1368,7 @@
       </w:pPr>
       <w:r>
         <w:rPr>
-          <w:rFonts w:ascii="Times New Roman" w:cs="Times New Roman" w:eastAsia="Noto Serif CJK SC" w:hAnsi="Times New Roman"/>
+          <w:rFonts w:ascii="Times New Roman" w:cs="Times New Roman" w:eastAsia="PingFang SC" w:hAnsi="Times New Roman"/>
           <w:color w:val="333333"/>
           <w:sz w:val="18"/>
           <w:szCs w:val="18"/>
@@ -1429,7 +1429,7 @@
       </w:pPr>
       <w:r>
         <w:rPr>
-          <w:rFonts w:ascii="Times New Roman" w:cs="Times New Roman" w:eastAsia="Noto Serif CJK SC" w:hAnsi="Times New Roman"/>
+          <w:rFonts w:ascii="Times New Roman" w:cs="Times New Roman" w:eastAsia="PingFang SC" w:hAnsi="Times New Roman"/>
           <w:color w:val="333333"/>
           <w:sz w:val="18"/>
           <w:szCs w:val="18"/>
@@ -1463,7 +1463,7 @@
       </w:pPr>
       <w:r>
         <w:rPr>
-          <w:rFonts w:ascii="Courier New" w:cs="Courier New" w:eastAsia="Noto Serif CJK SC" w:hAnsi="Courier New"/>
+          <w:rFonts w:ascii="Courier New" w:cs="Courier New" w:eastAsia="Songti SC" w:hAnsi="Courier New"/>
           <w:color w:val="1A1A1A"/>
           <w:sz w:val="16"/>
           <w:szCs w:val="16"/>
@@ -1479,7 +1479,7 @@
       </w:pPr>
       <w:r>
         <w:rPr>
-          <w:rFonts w:ascii="Courier New" w:cs="Courier New" w:eastAsia="Noto Serif CJK SC" w:hAnsi="Courier New"/>
+          <w:rFonts w:ascii="Courier New" w:cs="Courier New" w:eastAsia="Songti SC" w:hAnsi="Courier New"/>
           <w:color w:val="1A1A1A"/>
           <w:sz w:val="16"/>
           <w:szCs w:val="16"/>
@@ -1495,7 +1495,7 @@
       </w:pPr>
       <w:r>
         <w:rPr>
-          <w:rFonts w:ascii="Courier New" w:cs="Courier New" w:eastAsia="Noto Serif CJK SC" w:hAnsi="Courier New"/>
+          <w:rFonts w:ascii="Courier New" w:cs="Courier New" w:eastAsia="Songti SC" w:hAnsi="Courier New"/>
           <w:color w:val="1A1A1A"/>
           <w:sz w:val="16"/>
           <w:szCs w:val="16"/>
@@ -1511,7 +1511,7 @@
       </w:pPr>
       <w:r>
         <w:rPr>
-          <w:rFonts w:ascii="Courier New" w:cs="Courier New" w:eastAsia="Noto Serif CJK SC" w:hAnsi="Courier New"/>
+          <w:rFonts w:ascii="Courier New" w:cs="Courier New" w:eastAsia="Songti SC" w:hAnsi="Courier New"/>
           <w:color w:val="1A1A1A"/>
           <w:sz w:val="16"/>
           <w:szCs w:val="16"/>
@@ -1527,7 +1527,7 @@
       </w:pPr>
       <w:r>
         <w:rPr>
-          <w:rFonts w:ascii="Courier New" w:cs="Courier New" w:eastAsia="Noto Serif CJK SC" w:hAnsi="Courier New"/>
+          <w:rFonts w:ascii="Courier New" w:cs="Courier New" w:eastAsia="Songti SC" w:hAnsi="Courier New"/>
           <w:color w:val="1A1A1A"/>
           <w:sz w:val="16"/>
           <w:szCs w:val="16"/>
@@ -1543,7 +1543,7 @@
       </w:pPr>
       <w:r>
         <w:rPr>
-          <w:rFonts w:ascii="Courier New" w:cs="Courier New" w:eastAsia="Noto Serif CJK SC" w:hAnsi="Courier New"/>
+          <w:rFonts w:ascii="Courier New" w:cs="Courier New" w:eastAsia="Songti SC" w:hAnsi="Courier New"/>
           <w:color w:val="1A1A1A"/>
           <w:sz w:val="16"/>
           <w:szCs w:val="16"/>
@@ -1603,7 +1603,7 @@
       </w:pPr>
       <w:r>
         <w:rPr>
-          <w:rFonts w:ascii="Times New Roman" w:cs="Times New Roman" w:eastAsia="Noto Serif CJK SC" w:hAnsi="Times New Roman"/>
+          <w:rFonts w:ascii="Times New Roman" w:cs="Times New Roman" w:eastAsia="PingFang SC" w:hAnsi="Times New Roman"/>
           <w:color w:val="333333"/>
           <w:sz w:val="18"/>
           <w:szCs w:val="18"/>
@@ -1656,7 +1656,7 @@
             </w:pPr>
             <w:r>
               <w:rPr>
-                <w:rFonts w:ascii="Times New Roman" w:cs="Times New Roman" w:eastAsia="Noto Serif CJK SC" w:hAnsi="Times New Roman"/>
+                <w:rFonts w:ascii="Times New Roman" w:cs="Times New Roman" w:eastAsia="Songti SC" w:hAnsi="Times New Roman"/>
                 <w:b/>
                 <w:bCs/>
                 <w:color w:val="FFFFFF"/>
@@ -1690,7 +1690,7 @@
             </w:pPr>
             <w:r>
               <w:rPr>
-                <w:rFonts w:ascii="Times New Roman" w:cs="Times New Roman" w:eastAsia="Noto Serif CJK SC" w:hAnsi="Times New Roman"/>
+                <w:rFonts w:ascii="Times New Roman" w:cs="Times New Roman" w:eastAsia="Songti SC" w:hAnsi="Times New Roman"/>
                 <w:b/>
                 <w:bCs/>
                 <w:color w:val="FFFFFF"/>
@@ -1724,7 +1724,7 @@
             </w:pPr>
             <w:r>
               <w:rPr>
-                <w:rFonts w:ascii="Times New Roman" w:cs="Times New Roman" w:eastAsia="Noto Serif CJK SC" w:hAnsi="Times New Roman"/>
+                <w:rFonts w:ascii="Times New Roman" w:cs="Times New Roman" w:eastAsia="Songti SC" w:hAnsi="Times New Roman"/>
                 <w:b/>
                 <w:bCs/>
                 <w:color w:val="FFFFFF"/>
@@ -1758,7 +1758,7 @@
             </w:pPr>
             <w:r>
               <w:rPr>
-                <w:rFonts w:ascii="Times New Roman" w:cs="Times New Roman" w:eastAsia="Noto Serif CJK SC" w:hAnsi="Times New Roman"/>
+                <w:rFonts w:ascii="Times New Roman" w:cs="Times New Roman" w:eastAsia="Songti SC" w:hAnsi="Times New Roman"/>
                 <w:b/>
                 <w:bCs/>
                 <w:color w:val="FFFFFF"/>
@@ -1794,7 +1794,7 @@
             </w:pPr>
             <w:r>
               <w:rPr>
-                <w:rFonts w:ascii="Times New Roman" w:cs="Times New Roman" w:eastAsia="Noto Serif CJK SC" w:hAnsi="Times New Roman"/>
+                <w:rFonts w:ascii="Times New Roman" w:cs="Times New Roman" w:eastAsia="Songti SC" w:hAnsi="Times New Roman"/>
                 <w:b w:val="false"/>
                 <w:bCs w:val="false"/>
                 <w:color w:val="000000"/>
@@ -1828,7 +1828,7 @@
             </w:pPr>
             <w:r>
               <w:rPr>
-                <w:rFonts w:ascii="Times New Roman" w:cs="Times New Roman" w:eastAsia="Noto Serif CJK SC" w:hAnsi="Times New Roman"/>
+                <w:rFonts w:ascii="Times New Roman" w:cs="Times New Roman" w:eastAsia="Songti SC" w:hAnsi="Times New Roman"/>
                 <w:b w:val="false"/>
                 <w:bCs w:val="false"/>
                 <w:color w:val="000000"/>
@@ -1862,7 +1862,7 @@
             </w:pPr>
             <w:r>
               <w:rPr>
-                <w:rFonts w:ascii="Times New Roman" w:cs="Times New Roman" w:eastAsia="Noto Serif CJK SC" w:hAnsi="Times New Roman"/>
+                <w:rFonts w:ascii="Times New Roman" w:cs="Times New Roman" w:eastAsia="Songti SC" w:hAnsi="Times New Roman"/>
                 <w:b w:val="false"/>
                 <w:bCs w:val="false"/>
                 <w:color w:val="000000"/>
@@ -1896,7 +1896,7 @@
             </w:pPr>
             <w:r>
               <w:rPr>
-                <w:rFonts w:ascii="Times New Roman" w:cs="Times New Roman" w:eastAsia="Noto Serif CJK SC" w:hAnsi="Times New Roman"/>
+                <w:rFonts w:ascii="Times New Roman" w:cs="Times New Roman" w:eastAsia="Songti SC" w:hAnsi="Times New Roman"/>
                 <w:b w:val="false"/>
                 <w:bCs w:val="false"/>
                 <w:color w:val="000000"/>
@@ -1932,7 +1932,7 @@
             </w:pPr>
             <w:r>
               <w:rPr>
-                <w:rFonts w:ascii="Times New Roman" w:cs="Times New Roman" w:eastAsia="Noto Serif CJK SC" w:hAnsi="Times New Roman"/>
+                <w:rFonts w:ascii="Times New Roman" w:cs="Times New Roman" w:eastAsia="Songti SC" w:hAnsi="Times New Roman"/>
                 <w:b w:val="false"/>
                 <w:bCs w:val="false"/>
                 <w:color w:val="000000"/>
@@ -1966,7 +1966,7 @@
             </w:pPr>
             <w:r>
               <w:rPr>
-                <w:rFonts w:ascii="Times New Roman" w:cs="Times New Roman" w:eastAsia="Noto Serif CJK SC" w:hAnsi="Times New Roman"/>
+                <w:rFonts w:ascii="Times New Roman" w:cs="Times New Roman" w:eastAsia="Songti SC" w:hAnsi="Times New Roman"/>
                 <w:b w:val="false"/>
                 <w:bCs w:val="false"/>
                 <w:color w:val="000000"/>
@@ -2000,7 +2000,7 @@
             </w:pPr>
             <w:r>
               <w:rPr>
-                <w:rFonts w:ascii="Times New Roman" w:cs="Times New Roman" w:eastAsia="Noto Serif CJK SC" w:hAnsi="Times New Roman"/>
+                <w:rFonts w:ascii="Times New Roman" w:cs="Times New Roman" w:eastAsia="Songti SC" w:hAnsi="Times New Roman"/>
                 <w:b w:val="false"/>
                 <w:bCs w:val="false"/>
                 <w:color w:val="000000"/>
@@ -2034,7 +2034,7 @@
             </w:pPr>
             <w:r>
               <w:rPr>
-                <w:rFonts w:ascii="Times New Roman" w:cs="Times New Roman" w:eastAsia="Noto Serif CJK SC" w:hAnsi="Times New Roman"/>
+                <w:rFonts w:ascii="Times New Roman" w:cs="Times New Roman" w:eastAsia="Songti SC" w:hAnsi="Times New Roman"/>
                 <w:b w:val="false"/>
                 <w:bCs w:val="false"/>
                 <w:color w:val="000000"/>
@@ -2070,7 +2070,7 @@
             </w:pPr>
             <w:r>
               <w:rPr>
-                <w:rFonts w:ascii="Times New Roman" w:cs="Times New Roman" w:eastAsia="Noto Serif CJK SC" w:hAnsi="Times New Roman"/>
+                <w:rFonts w:ascii="Times New Roman" w:cs="Times New Roman" w:eastAsia="Songti SC" w:hAnsi="Times New Roman"/>
                 <w:b w:val="false"/>
                 <w:bCs w:val="false"/>
                 <w:color w:val="000000"/>
@@ -2104,7 +2104,7 @@
             </w:pPr>
             <w:r>
               <w:rPr>
-                <w:rFonts w:ascii="Times New Roman" w:cs="Times New Roman" w:eastAsia="Noto Serif CJK SC" w:hAnsi="Times New Roman"/>
+                <w:rFonts w:ascii="Times New Roman" w:cs="Times New Roman" w:eastAsia="Songti SC" w:hAnsi="Times New Roman"/>
                 <w:b w:val="false"/>
                 <w:bCs w:val="false"/>
                 <w:color w:val="000000"/>
@@ -2138,7 +2138,7 @@
             </w:pPr>
             <w:r>
               <w:rPr>
-                <w:rFonts w:ascii="Times New Roman" w:cs="Times New Roman" w:eastAsia="Noto Serif CJK SC" w:hAnsi="Times New Roman"/>
+                <w:rFonts w:ascii="Times New Roman" w:cs="Times New Roman" w:eastAsia="Songti SC" w:hAnsi="Times New Roman"/>
                 <w:b w:val="false"/>
                 <w:bCs w:val="false"/>
                 <w:color w:val="000000"/>
@@ -2172,7 +2172,7 @@
             </w:pPr>
             <w:r>
               <w:rPr>
-                <w:rFonts w:ascii="Times New Roman" w:cs="Times New Roman" w:eastAsia="Noto Serif CJK SC" w:hAnsi="Times New Roman"/>
+                <w:rFonts w:ascii="Times New Roman" w:cs="Times New Roman" w:eastAsia="Songti SC" w:hAnsi="Times New Roman"/>
                 <w:b w:val="false"/>
                 <w:bCs w:val="false"/>
                 <w:color w:val="000000"/>
@@ -2208,7 +2208,7 @@
             </w:pPr>
             <w:r>
               <w:rPr>
-                <w:rFonts w:ascii="Times New Roman" w:cs="Times New Roman" w:eastAsia="Noto Serif CJK SC" w:hAnsi="Times New Roman"/>
+                <w:rFonts w:ascii="Times New Roman" w:cs="Times New Roman" w:eastAsia="Songti SC" w:hAnsi="Times New Roman"/>
                 <w:b w:val="false"/>
                 <w:bCs w:val="false"/>
                 <w:color w:val="000000"/>
@@ -2242,7 +2242,7 @@
             </w:pPr>
             <w:r>
               <w:rPr>
-                <w:rFonts w:ascii="Times New Roman" w:cs="Times New Roman" w:eastAsia="Noto Serif CJK SC" w:hAnsi="Times New Roman"/>
+                <w:rFonts w:ascii="Times New Roman" w:cs="Times New Roman" w:eastAsia="Songti SC" w:hAnsi="Times New Roman"/>
                 <w:b w:val="false"/>
                 <w:bCs w:val="false"/>
                 <w:color w:val="000000"/>
@@ -2276,7 +2276,7 @@
             </w:pPr>
             <w:r>
               <w:rPr>
-                <w:rFonts w:ascii="Times New Roman" w:cs="Times New Roman" w:eastAsia="Noto Serif CJK SC" w:hAnsi="Times New Roman"/>
+                <w:rFonts w:ascii="Times New Roman" w:cs="Times New Roman" w:eastAsia="Songti SC" w:hAnsi="Times New Roman"/>
                 <w:b w:val="false"/>
                 <w:bCs w:val="false"/>
                 <w:color w:val="000000"/>
@@ -2310,7 +2310,7 @@
             </w:pPr>
             <w:r>
               <w:rPr>
-                <w:rFonts w:ascii="Times New Roman" w:cs="Times New Roman" w:eastAsia="Noto Serif CJK SC" w:hAnsi="Times New Roman"/>
+                <w:rFonts w:ascii="Times New Roman" w:cs="Times New Roman" w:eastAsia="Songti SC" w:hAnsi="Times New Roman"/>
                 <w:b w:val="false"/>
                 <w:bCs w:val="false"/>
                 <w:color w:val="000000"/>
@@ -2346,7 +2346,7 @@
             </w:pPr>
             <w:r>
               <w:rPr>
-                <w:rFonts w:ascii="Times New Roman" w:cs="Times New Roman" w:eastAsia="Noto Serif CJK SC" w:hAnsi="Times New Roman"/>
+                <w:rFonts w:ascii="Times New Roman" w:cs="Times New Roman" w:eastAsia="Songti SC" w:hAnsi="Times New Roman"/>
                 <w:b w:val="false"/>
                 <w:bCs w:val="false"/>
                 <w:color w:val="000000"/>
@@ -2380,7 +2380,7 @@
             </w:pPr>
             <w:r>
               <w:rPr>
-                <w:rFonts w:ascii="Times New Roman" w:cs="Times New Roman" w:eastAsia="Noto Serif CJK SC" w:hAnsi="Times New Roman"/>
+                <w:rFonts w:ascii="Times New Roman" w:cs="Times New Roman" w:eastAsia="Songti SC" w:hAnsi="Times New Roman"/>
                 <w:b w:val="false"/>
                 <w:bCs w:val="false"/>
                 <w:color w:val="000000"/>
@@ -2414,7 +2414,7 @@
             </w:pPr>
             <w:r>
               <w:rPr>
-                <w:rFonts w:ascii="Times New Roman" w:cs="Times New Roman" w:eastAsia="Noto Serif CJK SC" w:hAnsi="Times New Roman"/>
+                <w:rFonts w:ascii="Times New Roman" w:cs="Times New Roman" w:eastAsia="Songti SC" w:hAnsi="Times New Roman"/>
                 <w:b w:val="false"/>
                 <w:bCs w:val="false"/>
                 <w:color w:val="000000"/>
@@ -2448,7 +2448,7 @@
             </w:pPr>
             <w:r>
               <w:rPr>
-                <w:rFonts w:ascii="Times New Roman" w:cs="Times New Roman" w:eastAsia="Noto Serif CJK SC" w:hAnsi="Times New Roman"/>
+                <w:rFonts w:ascii="Times New Roman" w:cs="Times New Roman" w:eastAsia="Songti SC" w:hAnsi="Times New Roman"/>
                 <w:b w:val="false"/>
                 <w:bCs w:val="false"/>
                 <w:color w:val="000000"/>
@@ -2484,7 +2484,7 @@
             </w:pPr>
             <w:r>
               <w:rPr>
-                <w:rFonts w:ascii="Times New Roman" w:cs="Times New Roman" w:eastAsia="Noto Serif CJK SC" w:hAnsi="Times New Roman"/>
+                <w:rFonts w:ascii="Times New Roman" w:cs="Times New Roman" w:eastAsia="Songti SC" w:hAnsi="Times New Roman"/>
                 <w:b w:val="false"/>
                 <w:bCs w:val="false"/>
                 <w:color w:val="000000"/>
@@ -2518,7 +2518,7 @@
             </w:pPr>
             <w:r>
               <w:rPr>
-                <w:rFonts w:ascii="Times New Roman" w:cs="Times New Roman" w:eastAsia="Noto Serif CJK SC" w:hAnsi="Times New Roman"/>
+                <w:rFonts w:ascii="Times New Roman" w:cs="Times New Roman" w:eastAsia="Songti SC" w:hAnsi="Times New Roman"/>
                 <w:b w:val="false"/>
                 <w:bCs w:val="false"/>
                 <w:color w:val="000000"/>
@@ -2552,7 +2552,7 @@
             </w:pPr>
             <w:r>
               <w:rPr>
-                <w:rFonts w:ascii="Times New Roman" w:cs="Times New Roman" w:eastAsia="Noto Serif CJK SC" w:hAnsi="Times New Roman"/>
+                <w:rFonts w:ascii="Times New Roman" w:cs="Times New Roman" w:eastAsia="Songti SC" w:hAnsi="Times New Roman"/>
                 <w:b w:val="false"/>
                 <w:bCs w:val="false"/>
                 <w:color w:val="000000"/>
@@ -2586,7 +2586,7 @@
             </w:pPr>
             <w:r>
               <w:rPr>
-                <w:rFonts w:ascii="Times New Roman" w:cs="Times New Roman" w:eastAsia="Noto Serif CJK SC" w:hAnsi="Times New Roman"/>
+                <w:rFonts w:ascii="Times New Roman" w:cs="Times New Roman" w:eastAsia="Songti SC" w:hAnsi="Times New Roman"/>
                 <w:b w:val="false"/>
                 <w:bCs w:val="false"/>
                 <w:color w:val="000000"/>
@@ -2622,7 +2622,7 @@
             </w:pPr>
             <w:r>
               <w:rPr>
-                <w:rFonts w:ascii="Times New Roman" w:cs="Times New Roman" w:eastAsia="Noto Serif CJK SC" w:hAnsi="Times New Roman"/>
+                <w:rFonts w:ascii="Times New Roman" w:cs="Times New Roman" w:eastAsia="Songti SC" w:hAnsi="Times New Roman"/>
                 <w:b w:val="false"/>
                 <w:bCs w:val="false"/>
                 <w:color w:val="000000"/>
@@ -2656,7 +2656,7 @@
             </w:pPr>
             <w:r>
               <w:rPr>
-                <w:rFonts w:ascii="Times New Roman" w:cs="Times New Roman" w:eastAsia="Noto Serif CJK SC" w:hAnsi="Times New Roman"/>
+                <w:rFonts w:ascii="Times New Roman" w:cs="Times New Roman" w:eastAsia="Songti SC" w:hAnsi="Times New Roman"/>
                 <w:b w:val="false"/>
                 <w:bCs w:val="false"/>
                 <w:color w:val="000000"/>
@@ -2690,7 +2690,7 @@
             </w:pPr>
             <w:r>
               <w:rPr>
-                <w:rFonts w:ascii="Times New Roman" w:cs="Times New Roman" w:eastAsia="Noto Serif CJK SC" w:hAnsi="Times New Roman"/>
+                <w:rFonts w:ascii="Times New Roman" w:cs="Times New Roman" w:eastAsia="Songti SC" w:hAnsi="Times New Roman"/>
                 <w:b w:val="false"/>
                 <w:bCs w:val="false"/>
                 <w:color w:val="000000"/>
@@ -2724,7 +2724,7 @@
             </w:pPr>
             <w:r>
               <w:rPr>
-                <w:rFonts w:ascii="Times New Roman" w:cs="Times New Roman" w:eastAsia="Noto Serif CJK SC" w:hAnsi="Times New Roman"/>
+                <w:rFonts w:ascii="Times New Roman" w:cs="Times New Roman" w:eastAsia="Songti SC" w:hAnsi="Times New Roman"/>
                 <w:b w:val="false"/>
                 <w:bCs w:val="false"/>
                 <w:color w:val="000000"/>
@@ -2760,7 +2760,7 @@
             </w:pPr>
             <w:r>
               <w:rPr>
-                <w:rFonts w:ascii="Times New Roman" w:cs="Times New Roman" w:eastAsia="Noto Serif CJK SC" w:hAnsi="Times New Roman"/>
+                <w:rFonts w:ascii="Times New Roman" w:cs="Times New Roman" w:eastAsia="Songti SC" w:hAnsi="Times New Roman"/>
                 <w:b w:val="false"/>
                 <w:bCs w:val="false"/>
                 <w:color w:val="000000"/>
@@ -2794,7 +2794,7 @@
             </w:pPr>
             <w:r>
               <w:rPr>
-                <w:rFonts w:ascii="Times New Roman" w:cs="Times New Roman" w:eastAsia="Noto Serif CJK SC" w:hAnsi="Times New Roman"/>
+                <w:rFonts w:ascii="Times New Roman" w:cs="Times New Roman" w:eastAsia="Songti SC" w:hAnsi="Times New Roman"/>
                 <w:b w:val="false"/>
                 <w:bCs w:val="false"/>
                 <w:color w:val="000000"/>
@@ -2828,7 +2828,7 @@
             </w:pPr>
             <w:r>
               <w:rPr>
-                <w:rFonts w:ascii="Times New Roman" w:cs="Times New Roman" w:eastAsia="Noto Serif CJK SC" w:hAnsi="Times New Roman"/>
+                <w:rFonts w:ascii="Times New Roman" w:cs="Times New Roman" w:eastAsia="Songti SC" w:hAnsi="Times New Roman"/>
                 <w:b w:val="false"/>
                 <w:bCs w:val="false"/>
                 <w:color w:val="000000"/>
@@ -2862,7 +2862,7 @@
             </w:pPr>
             <w:r>
               <w:rPr>
-                <w:rFonts w:ascii="Times New Roman" w:cs="Times New Roman" w:eastAsia="Noto Serif CJK SC" w:hAnsi="Times New Roman"/>
+                <w:rFonts w:ascii="Times New Roman" w:cs="Times New Roman" w:eastAsia="Songti SC" w:hAnsi="Times New Roman"/>
                 <w:b w:val="false"/>
                 <w:bCs w:val="false"/>
                 <w:color w:val="000000"/>
@@ -2937,7 +2937,7 @@
       </w:pPr>
       <w:r>
         <w:rPr>
-          <w:rFonts w:ascii="Times New Roman" w:cs="Times New Roman" w:eastAsia="Noto Serif CJK SC" w:hAnsi="Times New Roman"/>
+          <w:rFonts w:ascii="Times New Roman" w:cs="Times New Roman" w:eastAsia="PingFang SC" w:hAnsi="Times New Roman"/>
           <w:color w:val="333333"/>
           <w:sz w:val="18"/>
           <w:szCs w:val="18"/>
@@ -2998,7 +2998,7 @@
       </w:pPr>
       <w:r>
         <w:rPr>
-          <w:rFonts w:ascii="Times New Roman" w:cs="Times New Roman" w:eastAsia="Noto Serif CJK SC" w:hAnsi="Times New Roman"/>
+          <w:rFonts w:ascii="Times New Roman" w:cs="Times New Roman" w:eastAsia="PingFang SC" w:hAnsi="Times New Roman"/>
           <w:color w:val="333333"/>
           <w:sz w:val="18"/>
           <w:szCs w:val="18"/>
@@ -3077,7 +3077,7 @@
       </w:pPr>
       <w:r>
         <w:rPr>
-          <w:rFonts w:ascii="Times New Roman" w:cs="Times New Roman" w:eastAsia="Noto Serif CJK SC" w:hAnsi="Times New Roman"/>
+          <w:rFonts w:ascii="Times New Roman" w:cs="Times New Roman" w:eastAsia="PingFang SC" w:hAnsi="Times New Roman"/>
           <w:color w:val="333333"/>
           <w:sz w:val="18"/>
           <w:szCs w:val="18"/>
@@ -3138,7 +3138,7 @@
       </w:pPr>
       <w:r>
         <w:rPr>
-          <w:rFonts w:ascii="Times New Roman" w:cs="Times New Roman" w:eastAsia="Noto Serif CJK SC" w:hAnsi="Times New Roman"/>
+          <w:rFonts w:ascii="Times New Roman" w:cs="Times New Roman" w:eastAsia="PingFang SC" w:hAnsi="Times New Roman"/>
           <w:color w:val="333333"/>
           <w:sz w:val="18"/>
           <w:szCs w:val="18"/>
@@ -3217,7 +3217,7 @@
       </w:pPr>
       <w:r>
         <w:rPr>
-          <w:rFonts w:ascii="Times New Roman" w:cs="Times New Roman" w:eastAsia="Noto Serif CJK SC" w:hAnsi="Times New Roman"/>
+          <w:rFonts w:ascii="Times New Roman" w:cs="Times New Roman" w:eastAsia="PingFang SC" w:hAnsi="Times New Roman"/>
           <w:color w:val="333333"/>
           <w:sz w:val="18"/>
           <w:szCs w:val="18"/>
@@ -3278,7 +3278,7 @@
       </w:pPr>
       <w:r>
         <w:rPr>
-          <w:rFonts w:ascii="Times New Roman" w:cs="Times New Roman" w:eastAsia="Noto Serif CJK SC" w:hAnsi="Times New Roman"/>
+          <w:rFonts w:ascii="Times New Roman" w:cs="Times New Roman" w:eastAsia="PingFang SC" w:hAnsi="Times New Roman"/>
           <w:color w:val="333333"/>
           <w:sz w:val="18"/>
           <w:szCs w:val="18"/>
@@ -3339,7 +3339,7 @@
       </w:pPr>
       <w:r>
         <w:rPr>
-          <w:rFonts w:ascii="Times New Roman" w:cs="Times New Roman" w:eastAsia="Noto Serif CJK SC" w:hAnsi="Times New Roman"/>
+          <w:rFonts w:ascii="Times New Roman" w:cs="Times New Roman" w:eastAsia="PingFang SC" w:hAnsi="Times New Roman"/>
           <w:color w:val="333333"/>
           <w:sz w:val="18"/>
           <w:szCs w:val="18"/>
@@ -3418,7 +3418,7 @@
       </w:pPr>
       <w:r>
         <w:rPr>
-          <w:rFonts w:ascii="Times New Roman" w:cs="Times New Roman" w:eastAsia="Noto Serif CJK SC" w:hAnsi="Times New Roman"/>
+          <w:rFonts w:ascii="Times New Roman" w:cs="Times New Roman" w:eastAsia="PingFang SC" w:hAnsi="Times New Roman"/>
           <w:color w:val="333333"/>
           <w:sz w:val="18"/>
           <w:szCs w:val="18"/>
@@ -3479,7 +3479,7 @@
       </w:pPr>
       <w:r>
         <w:rPr>
-          <w:rFonts w:ascii="Times New Roman" w:cs="Times New Roman" w:eastAsia="Noto Serif CJK SC" w:hAnsi="Times New Roman"/>
+          <w:rFonts w:ascii="Times New Roman" w:cs="Times New Roman" w:eastAsia="PingFang SC" w:hAnsi="Times New Roman"/>
           <w:color w:val="333333"/>
           <w:sz w:val="18"/>
           <w:szCs w:val="18"/>
@@ -3558,7 +3558,7 @@
       </w:pPr>
       <w:r>
         <w:rPr>
-          <w:rFonts w:ascii="Times New Roman" w:cs="Times New Roman" w:eastAsia="Noto Serif CJK SC" w:hAnsi="Times New Roman"/>
+          <w:rFonts w:ascii="Times New Roman" w:cs="Times New Roman" w:eastAsia="PingFang SC" w:hAnsi="Times New Roman"/>
           <w:color w:val="333333"/>
           <w:sz w:val="18"/>
           <w:szCs w:val="18"/>
@@ -3619,7 +3619,7 @@
       </w:pPr>
       <w:r>
         <w:rPr>
-          <w:rFonts w:ascii="Times New Roman" w:cs="Times New Roman" w:eastAsia="Noto Serif CJK SC" w:hAnsi="Times New Roman"/>
+          <w:rFonts w:ascii="Times New Roman" w:cs="Times New Roman" w:eastAsia="PingFang SC" w:hAnsi="Times New Roman"/>
           <w:color w:val="333333"/>
           <w:sz w:val="18"/>
           <w:szCs w:val="18"/>
@@ -3652,7 +3652,7 @@
       </w:pPr>
       <w:r>
         <w:rPr>
-          <w:rFonts w:ascii="Times New Roman" w:cs="Times New Roman" w:eastAsia="Noto Serif CJK SC" w:hAnsi="Times New Roman"/>
+          <w:rFonts w:ascii="Times New Roman" w:cs="Times New Roman" w:eastAsia="PingFang SC" w:hAnsi="Times New Roman"/>
           <w:color w:val="333333"/>
           <w:sz w:val="18"/>
           <w:szCs w:val="18"/>
@@ -3705,7 +3705,7 @@
             </w:pPr>
             <w:r>
               <w:rPr>
-                <w:rFonts w:ascii="Times New Roman" w:cs="Times New Roman" w:eastAsia="Noto Serif CJK SC" w:hAnsi="Times New Roman"/>
+                <w:rFonts w:ascii="Times New Roman" w:cs="Times New Roman" w:eastAsia="Songti SC" w:hAnsi="Times New Roman"/>
                 <w:b/>
                 <w:bCs/>
                 <w:color w:val="FFFFFF"/>
@@ -3739,7 +3739,7 @@
             </w:pPr>
             <w:r>
               <w:rPr>
-                <w:rFonts w:ascii="Times New Roman" w:cs="Times New Roman" w:eastAsia="Noto Serif CJK SC" w:hAnsi="Times New Roman"/>
+                <w:rFonts w:ascii="Times New Roman" w:cs="Times New Roman" w:eastAsia="Songti SC" w:hAnsi="Times New Roman"/>
                 <w:b/>
                 <w:bCs/>
                 <w:color w:val="FFFFFF"/>
@@ -3773,7 +3773,7 @@
             </w:pPr>
             <w:r>
               <w:rPr>
-                <w:rFonts w:ascii="Times New Roman" w:cs="Times New Roman" w:eastAsia="Noto Serif CJK SC" w:hAnsi="Times New Roman"/>
+                <w:rFonts w:ascii="Times New Roman" w:cs="Times New Roman" w:eastAsia="Songti SC" w:hAnsi="Times New Roman"/>
                 <w:b/>
                 <w:bCs/>
                 <w:color w:val="FFFFFF"/>
@@ -3807,7 +3807,7 @@
             </w:pPr>
             <w:r>
               <w:rPr>
-                <w:rFonts w:ascii="Times New Roman" w:cs="Times New Roman" w:eastAsia="Noto Serif CJK SC" w:hAnsi="Times New Roman"/>
+                <w:rFonts w:ascii="Times New Roman" w:cs="Times New Roman" w:eastAsia="Songti SC" w:hAnsi="Times New Roman"/>
                 <w:b/>
                 <w:bCs/>
                 <w:color w:val="FFFFFF"/>
@@ -3843,7 +3843,7 @@
             </w:pPr>
             <w:r>
               <w:rPr>
-                <w:rFonts w:ascii="Times New Roman" w:cs="Times New Roman" w:eastAsia="Noto Serif CJK SC" w:hAnsi="Times New Roman"/>
+                <w:rFonts w:ascii="Times New Roman" w:cs="Times New Roman" w:eastAsia="Songti SC" w:hAnsi="Times New Roman"/>
                 <w:b w:val="false"/>
                 <w:bCs w:val="false"/>
                 <w:color w:val="000000"/>
@@ -3877,7 +3877,7 @@
             </w:pPr>
             <w:r>
               <w:rPr>
-                <w:rFonts w:ascii="Times New Roman" w:cs="Times New Roman" w:eastAsia="Noto Serif CJK SC" w:hAnsi="Times New Roman"/>
+                <w:rFonts w:ascii="Times New Roman" w:cs="Times New Roman" w:eastAsia="Songti SC" w:hAnsi="Times New Roman"/>
                 <w:b w:val="false"/>
                 <w:bCs w:val="false"/>
                 <w:color w:val="000000"/>
@@ -3911,7 +3911,7 @@
             </w:pPr>
             <w:r>
               <w:rPr>
-                <w:rFonts w:ascii="Times New Roman" w:cs="Times New Roman" w:eastAsia="Noto Serif CJK SC" w:hAnsi="Times New Roman"/>
+                <w:rFonts w:ascii="Times New Roman" w:cs="Times New Roman" w:eastAsia="Songti SC" w:hAnsi="Times New Roman"/>
                 <w:b w:val="false"/>
                 <w:bCs w:val="false"/>
                 <w:color w:val="000000"/>
@@ -3945,7 +3945,7 @@
             </w:pPr>
             <w:r>
               <w:rPr>
-                <w:rFonts w:ascii="Times New Roman" w:cs="Times New Roman" w:eastAsia="Noto Serif CJK SC" w:hAnsi="Times New Roman"/>
+                <w:rFonts w:ascii="Times New Roman" w:cs="Times New Roman" w:eastAsia="Songti SC" w:hAnsi="Times New Roman"/>
                 <w:b w:val="false"/>
                 <w:bCs w:val="false"/>
                 <w:color w:val="000000"/>
@@ -3981,7 +3981,7 @@
             </w:pPr>
             <w:r>
               <w:rPr>
-                <w:rFonts w:ascii="Times New Roman" w:cs="Times New Roman" w:eastAsia="Noto Serif CJK SC" w:hAnsi="Times New Roman"/>
+                <w:rFonts w:ascii="Times New Roman" w:cs="Times New Roman" w:eastAsia="Songti SC" w:hAnsi="Times New Roman"/>
                 <w:b w:val="false"/>
                 <w:bCs w:val="false"/>
                 <w:color w:val="000000"/>
@@ -4015,7 +4015,7 @@
             </w:pPr>
             <w:r>
               <w:rPr>
-                <w:rFonts w:ascii="Times New Roman" w:cs="Times New Roman" w:eastAsia="Noto Serif CJK SC" w:hAnsi="Times New Roman"/>
+                <w:rFonts w:ascii="Times New Roman" w:cs="Times New Roman" w:eastAsia="Songti SC" w:hAnsi="Times New Roman"/>
                 <w:b w:val="false"/>
                 <w:bCs w:val="false"/>
                 <w:color w:val="000000"/>
@@ -4049,7 +4049,7 @@
             </w:pPr>
             <w:r>
               <w:rPr>
-                <w:rFonts w:ascii="Times New Roman" w:cs="Times New Roman" w:eastAsia="Noto Serif CJK SC" w:hAnsi="Times New Roman"/>
+                <w:rFonts w:ascii="Times New Roman" w:cs="Times New Roman" w:eastAsia="Songti SC" w:hAnsi="Times New Roman"/>
                 <w:b w:val="false"/>
                 <w:bCs w:val="false"/>
                 <w:color w:val="000000"/>
@@ -4083,7 +4083,7 @@
             </w:pPr>
             <w:r>
               <w:rPr>
-                <w:rFonts w:ascii="Times New Roman" w:cs="Times New Roman" w:eastAsia="Noto Serif CJK SC" w:hAnsi="Times New Roman"/>
+                <w:rFonts w:ascii="Times New Roman" w:cs="Times New Roman" w:eastAsia="Songti SC" w:hAnsi="Times New Roman"/>
                 <w:b w:val="false"/>
                 <w:bCs w:val="false"/>
                 <w:color w:val="000000"/>
@@ -4119,7 +4119,7 @@
             </w:pPr>
             <w:r>
               <w:rPr>
-                <w:rFonts w:ascii="Times New Roman" w:cs="Times New Roman" w:eastAsia="Noto Serif CJK SC" w:hAnsi="Times New Roman"/>
+                <w:rFonts w:ascii="Times New Roman" w:cs="Times New Roman" w:eastAsia="Songti SC" w:hAnsi="Times New Roman"/>
                 <w:b w:val="false"/>
                 <w:bCs w:val="false"/>
                 <w:color w:val="000000"/>
@@ -4153,7 +4153,7 @@
             </w:pPr>
             <w:r>
               <w:rPr>
-                <w:rFonts w:ascii="Times New Roman" w:cs="Times New Roman" w:eastAsia="Noto Serif CJK SC" w:hAnsi="Times New Roman"/>
+                <w:rFonts w:ascii="Times New Roman" w:cs="Times New Roman" w:eastAsia="Songti SC" w:hAnsi="Times New Roman"/>
                 <w:b w:val="false"/>
                 <w:bCs w:val="false"/>
                 <w:color w:val="000000"/>
@@ -4187,7 +4187,7 @@
             </w:pPr>
             <w:r>
               <w:rPr>
-                <w:rFonts w:ascii="Times New Roman" w:cs="Times New Roman" w:eastAsia="Noto Serif CJK SC" w:hAnsi="Times New Roman"/>
+                <w:rFonts w:ascii="Times New Roman" w:cs="Times New Roman" w:eastAsia="Songti SC" w:hAnsi="Times New Roman"/>
                 <w:b w:val="false"/>
                 <w:bCs w:val="false"/>
                 <w:color w:val="000000"/>
@@ -4221,7 +4221,7 @@
             </w:pPr>
             <w:r>
               <w:rPr>
-                <w:rFonts w:ascii="Times New Roman" w:cs="Times New Roman" w:eastAsia="Noto Serif CJK SC" w:hAnsi="Times New Roman"/>
+                <w:rFonts w:ascii="Times New Roman" w:cs="Times New Roman" w:eastAsia="Songti SC" w:hAnsi="Times New Roman"/>
                 <w:b w:val="false"/>
                 <w:bCs w:val="false"/>
                 <w:color w:val="000000"/>
@@ -4257,7 +4257,7 @@
             </w:pPr>
             <w:r>
               <w:rPr>
-                <w:rFonts w:ascii="Times New Roman" w:cs="Times New Roman" w:eastAsia="Noto Serif CJK SC" w:hAnsi="Times New Roman"/>
+                <w:rFonts w:ascii="Times New Roman" w:cs="Times New Roman" w:eastAsia="Songti SC" w:hAnsi="Times New Roman"/>
                 <w:b w:val="false"/>
                 <w:bCs w:val="false"/>
                 <w:color w:val="000000"/>
@@ -4291,7 +4291,7 @@
             </w:pPr>
             <w:r>
               <w:rPr>
-                <w:rFonts w:ascii="Times New Roman" w:cs="Times New Roman" w:eastAsia="Noto Serif CJK SC" w:hAnsi="Times New Roman"/>
+                <w:rFonts w:ascii="Times New Roman" w:cs="Times New Roman" w:eastAsia="Songti SC" w:hAnsi="Times New Roman"/>
                 <w:b w:val="false"/>
                 <w:bCs w:val="false"/>
                 <w:color w:val="000000"/>
@@ -4325,7 +4325,7 @@
             </w:pPr>
             <w:r>
               <w:rPr>
-                <w:rFonts w:ascii="Times New Roman" w:cs="Times New Roman" w:eastAsia="Noto Serif CJK SC" w:hAnsi="Times New Roman"/>
+                <w:rFonts w:ascii="Times New Roman" w:cs="Times New Roman" w:eastAsia="Songti SC" w:hAnsi="Times New Roman"/>
                 <w:b w:val="false"/>
                 <w:bCs w:val="false"/>
                 <w:color w:val="000000"/>
@@ -4359,7 +4359,7 @@
             </w:pPr>
             <w:r>
               <w:rPr>
-                <w:rFonts w:ascii="Times New Roman" w:cs="Times New Roman" w:eastAsia="Noto Serif CJK SC" w:hAnsi="Times New Roman"/>
+                <w:rFonts w:ascii="Times New Roman" w:cs="Times New Roman" w:eastAsia="Songti SC" w:hAnsi="Times New Roman"/>
                 <w:b w:val="false"/>
                 <w:bCs w:val="false"/>
                 <w:color w:val="000000"/>
@@ -4395,7 +4395,7 @@
             </w:pPr>
             <w:r>
               <w:rPr>
-                <w:rFonts w:ascii="Times New Roman" w:cs="Times New Roman" w:eastAsia="Noto Serif CJK SC" w:hAnsi="Times New Roman"/>
+                <w:rFonts w:ascii="Times New Roman" w:cs="Times New Roman" w:eastAsia="Songti SC" w:hAnsi="Times New Roman"/>
                 <w:b w:val="false"/>
                 <w:bCs w:val="false"/>
                 <w:color w:val="000000"/>
@@ -4429,7 +4429,7 @@
             </w:pPr>
             <w:r>
               <w:rPr>
-                <w:rFonts w:ascii="Times New Roman" w:cs="Times New Roman" w:eastAsia="Noto Serif CJK SC" w:hAnsi="Times New Roman"/>
+                <w:rFonts w:ascii="Times New Roman" w:cs="Times New Roman" w:eastAsia="Songti SC" w:hAnsi="Times New Roman"/>
                 <w:b w:val="false"/>
                 <w:bCs w:val="false"/>
                 <w:color w:val="000000"/>
@@ -4463,7 +4463,7 @@
             </w:pPr>
             <w:r>
               <w:rPr>
-                <w:rFonts w:ascii="Times New Roman" w:cs="Times New Roman" w:eastAsia="Noto Serif CJK SC" w:hAnsi="Times New Roman"/>
+                <w:rFonts w:ascii="Times New Roman" w:cs="Times New Roman" w:eastAsia="Songti SC" w:hAnsi="Times New Roman"/>
                 <w:b w:val="false"/>
                 <w:bCs w:val="false"/>
                 <w:color w:val="000000"/>
@@ -4497,7 +4497,7 @@
             </w:pPr>
             <w:r>
               <w:rPr>
-                <w:rFonts w:ascii="Times New Roman" w:cs="Times New Roman" w:eastAsia="Noto Serif CJK SC" w:hAnsi="Times New Roman"/>
+                <w:rFonts w:ascii="Times New Roman" w:cs="Times New Roman" w:eastAsia="Songti SC" w:hAnsi="Times New Roman"/>
                 <w:b w:val="false"/>
                 <w:bCs w:val="false"/>
                 <w:color w:val="000000"/>
@@ -4533,7 +4533,7 @@
             </w:pPr>
             <w:r>
               <w:rPr>
-                <w:rFonts w:ascii="Times New Roman" w:cs="Times New Roman" w:eastAsia="Noto Serif CJK SC" w:hAnsi="Times New Roman"/>
+                <w:rFonts w:ascii="Times New Roman" w:cs="Times New Roman" w:eastAsia="Songti SC" w:hAnsi="Times New Roman"/>
                 <w:b w:val="false"/>
                 <w:bCs w:val="false"/>
                 <w:color w:val="000000"/>
@@ -4567,7 +4567,7 @@
             </w:pPr>
             <w:r>
               <w:rPr>
-                <w:rFonts w:ascii="Times New Roman" w:cs="Times New Roman" w:eastAsia="Noto Serif CJK SC" w:hAnsi="Times New Roman"/>
+                <w:rFonts w:ascii="Times New Roman" w:cs="Times New Roman" w:eastAsia="Songti SC" w:hAnsi="Times New Roman"/>
                 <w:b w:val="false"/>
                 <w:bCs w:val="false"/>
                 <w:color w:val="000000"/>
@@ -4601,7 +4601,7 @@
             </w:pPr>
             <w:r>
               <w:rPr>
-                <w:rFonts w:ascii="Times New Roman" w:cs="Times New Roman" w:eastAsia="Noto Serif CJK SC" w:hAnsi="Times New Roman"/>
+                <w:rFonts w:ascii="Times New Roman" w:cs="Times New Roman" w:eastAsia="Songti SC" w:hAnsi="Times New Roman"/>
                 <w:b w:val="false"/>
                 <w:bCs w:val="false"/>
                 <w:color w:val="000000"/>
@@ -4635,7 +4635,7 @@
             </w:pPr>
             <w:r>
               <w:rPr>
-                <w:rFonts w:ascii="Times New Roman" w:cs="Times New Roman" w:eastAsia="Noto Serif CJK SC" w:hAnsi="Times New Roman"/>
+                <w:rFonts w:ascii="Times New Roman" w:cs="Times New Roman" w:eastAsia="Songti SC" w:hAnsi="Times New Roman"/>
                 <w:b w:val="false"/>
                 <w:bCs w:val="false"/>
                 <w:color w:val="000000"/>
@@ -4701,7 +4701,7 @@
       </w:pPr>
       <w:r>
         <w:rPr>
-          <w:rFonts w:ascii="Times New Roman" w:cs="Times New Roman" w:eastAsia="Noto Serif CJK SC" w:hAnsi="Times New Roman"/>
+          <w:rFonts w:ascii="Times New Roman" w:cs="Times New Roman" w:eastAsia="PingFang SC" w:hAnsi="Times New Roman"/>
           <w:color w:val="333333"/>
           <w:sz w:val="18"/>
           <w:szCs w:val="18"/>
@@ -4789,7 +4789,7 @@
       </w:pPr>
       <w:r>
         <w:rPr>
-          <w:rFonts w:ascii="Times New Roman" w:cs="Times New Roman" w:eastAsia="Noto Serif CJK SC" w:hAnsi="Times New Roman"/>
+          <w:rFonts w:ascii="Times New Roman" w:cs="Times New Roman" w:eastAsia="PingFang SC" w:hAnsi="Times New Roman"/>
           <w:color w:val="333333"/>
           <w:sz w:val="18"/>
           <w:szCs w:val="18"/>
@@ -4850,7 +4850,7 @@
       </w:pPr>
       <w:r>
         <w:rPr>
-          <w:rFonts w:ascii="Times New Roman" w:cs="Times New Roman" w:eastAsia="Noto Serif CJK SC" w:hAnsi="Times New Roman"/>
+          <w:rFonts w:ascii="Times New Roman" w:cs="Times New Roman" w:eastAsia="PingFang SC" w:hAnsi="Times New Roman"/>
           <w:color w:val="333333"/>
           <w:sz w:val="18"/>
           <w:szCs w:val="18"/>
@@ -4901,7 +4901,7 @@
       </w:pPr>
       <w:r>
         <w:rPr>
-          <w:rFonts w:ascii="Times New Roman" w:cs="Times New Roman" w:eastAsia="Noto Serif CJK SC" w:hAnsi="Times New Roman"/>
+          <w:rFonts w:ascii="Times New Roman" w:cs="Times New Roman" w:eastAsia="PingFang SC" w:hAnsi="Times New Roman"/>
           <w:color w:val="333333"/>
           <w:sz w:val="18"/>
           <w:szCs w:val="18"/>
@@ -4955,7 +4955,7 @@
             </w:pPr>
             <w:r>
               <w:rPr>
-                <w:rFonts w:ascii="Times New Roman" w:cs="Times New Roman" w:eastAsia="Noto Serif CJK SC" w:hAnsi="Times New Roman"/>
+                <w:rFonts w:ascii="Times New Roman" w:cs="Times New Roman" w:eastAsia="Songti SC" w:hAnsi="Times New Roman"/>
                 <w:b/>
                 <w:bCs/>
                 <w:color w:val="FFFFFF"/>
@@ -4989,7 +4989,7 @@
             </w:pPr>
             <w:r>
               <w:rPr>
-                <w:rFonts w:ascii="Times New Roman" w:cs="Times New Roman" w:eastAsia="Noto Serif CJK SC" w:hAnsi="Times New Roman"/>
+                <w:rFonts w:ascii="Times New Roman" w:cs="Times New Roman" w:eastAsia="Songti SC" w:hAnsi="Times New Roman"/>
                 <w:b/>
                 <w:bCs/>
                 <w:color w:val="FFFFFF"/>
@@ -5023,7 +5023,7 @@
             </w:pPr>
             <w:r>
               <w:rPr>
-                <w:rFonts w:ascii="Times New Roman" w:cs="Times New Roman" w:eastAsia="Noto Serif CJK SC" w:hAnsi="Times New Roman"/>
+                <w:rFonts w:ascii="Times New Roman" w:cs="Times New Roman" w:eastAsia="Songti SC" w:hAnsi="Times New Roman"/>
                 <w:b/>
                 <w:bCs/>
                 <w:color w:val="FFFFFF"/>
@@ -5057,7 +5057,7 @@
             </w:pPr>
             <w:r>
               <w:rPr>
-                <w:rFonts w:ascii="Times New Roman" w:cs="Times New Roman" w:eastAsia="Noto Serif CJK SC" w:hAnsi="Times New Roman"/>
+                <w:rFonts w:ascii="Times New Roman" w:cs="Times New Roman" w:eastAsia="Songti SC" w:hAnsi="Times New Roman"/>
                 <w:b/>
                 <w:bCs/>
                 <w:color w:val="FFFFFF"/>
@@ -5091,7 +5091,7 @@
             </w:pPr>
             <w:r>
               <w:rPr>
-                <w:rFonts w:ascii="Times New Roman" w:cs="Times New Roman" w:eastAsia="Noto Serif CJK SC" w:hAnsi="Times New Roman"/>
+                <w:rFonts w:ascii="Times New Roman" w:cs="Times New Roman" w:eastAsia="Songti SC" w:hAnsi="Times New Roman"/>
                 <w:b/>
                 <w:bCs/>
                 <w:color w:val="FFFFFF"/>
@@ -5127,7 +5127,7 @@
             </w:pPr>
             <w:r>
               <w:rPr>
-                <w:rFonts w:ascii="Times New Roman" w:cs="Times New Roman" w:eastAsia="Noto Serif CJK SC" w:hAnsi="Times New Roman"/>
+                <w:rFonts w:ascii="Times New Roman" w:cs="Times New Roman" w:eastAsia="Songti SC" w:hAnsi="Times New Roman"/>
                 <w:b w:val="false"/>
                 <w:bCs w:val="false"/>
                 <w:color w:val="000000"/>
@@ -5161,7 +5161,7 @@
             </w:pPr>
             <w:r>
               <w:rPr>
-                <w:rFonts w:ascii="Times New Roman" w:cs="Times New Roman" w:eastAsia="Noto Serif CJK SC" w:hAnsi="Times New Roman"/>
+                <w:rFonts w:ascii="Times New Roman" w:cs="Times New Roman" w:eastAsia="Songti SC" w:hAnsi="Times New Roman"/>
                 <w:b w:val="false"/>
                 <w:bCs w:val="false"/>
                 <w:color w:val="000000"/>
@@ -5195,7 +5195,7 @@
             </w:pPr>
             <w:r>
               <w:rPr>
-                <w:rFonts w:ascii="Times New Roman" w:cs="Times New Roman" w:eastAsia="Noto Serif CJK SC" w:hAnsi="Times New Roman"/>
+                <w:rFonts w:ascii="Times New Roman" w:cs="Times New Roman" w:eastAsia="Songti SC" w:hAnsi="Times New Roman"/>
                 <w:b w:val="false"/>
                 <w:bCs w:val="false"/>
                 <w:color w:val="000000"/>
@@ -5229,7 +5229,7 @@
             </w:pPr>
             <w:r>
               <w:rPr>
-                <w:rFonts w:ascii="Times New Roman" w:cs="Times New Roman" w:eastAsia="Noto Serif CJK SC" w:hAnsi="Times New Roman"/>
+                <w:rFonts w:ascii="Times New Roman" w:cs="Times New Roman" w:eastAsia="Songti SC" w:hAnsi="Times New Roman"/>
                 <w:b w:val="false"/>
                 <w:bCs w:val="false"/>
                 <w:color w:val="000000"/>
@@ -5263,7 +5263,7 @@
             </w:pPr>
             <w:r>
               <w:rPr>
-                <w:rFonts w:ascii="Times New Roman" w:cs="Times New Roman" w:eastAsia="Noto Serif CJK SC" w:hAnsi="Times New Roman"/>
+                <w:rFonts w:ascii="Times New Roman" w:cs="Times New Roman" w:eastAsia="Songti SC" w:hAnsi="Times New Roman"/>
                 <w:b w:val="false"/>
                 <w:bCs w:val="false"/>
                 <w:color w:val="000000"/>
@@ -5299,7 +5299,7 @@
             </w:pPr>
             <w:r>
               <w:rPr>
-                <w:rFonts w:ascii="Times New Roman" w:cs="Times New Roman" w:eastAsia="Noto Serif CJK SC" w:hAnsi="Times New Roman"/>
+                <w:rFonts w:ascii="Times New Roman" w:cs="Times New Roman" w:eastAsia="Songti SC" w:hAnsi="Times New Roman"/>
                 <w:b w:val="false"/>
                 <w:bCs w:val="false"/>
                 <w:color w:val="000000"/>
@@ -5333,7 +5333,7 @@
             </w:pPr>
             <w:r>
               <w:rPr>
-                <w:rFonts w:ascii="Times New Roman" w:cs="Times New Roman" w:eastAsia="Noto Serif CJK SC" w:hAnsi="Times New Roman"/>
+                <w:rFonts w:ascii="Times New Roman" w:cs="Times New Roman" w:eastAsia="Songti SC" w:hAnsi="Times New Roman"/>
                 <w:b w:val="false"/>
                 <w:bCs w:val="false"/>
                 <w:color w:val="000000"/>
@@ -5367,7 +5367,7 @@
             </w:pPr>
             <w:r>
               <w:rPr>
-                <w:rFonts w:ascii="Times New Roman" w:cs="Times New Roman" w:eastAsia="Noto Serif CJK SC" w:hAnsi="Times New Roman"/>
+                <w:rFonts w:ascii="Times New Roman" w:cs="Times New Roman" w:eastAsia="Songti SC" w:hAnsi="Times New Roman"/>
                 <w:b w:val="false"/>
                 <w:bCs w:val="false"/>
                 <w:color w:val="000000"/>
@@ -5401,7 +5401,7 @@
             </w:pPr>
             <w:r>
               <w:rPr>
-                <w:rFonts w:ascii="Times New Roman" w:cs="Times New Roman" w:eastAsia="Noto Serif CJK SC" w:hAnsi="Times New Roman"/>
+                <w:rFonts w:ascii="Times New Roman" w:cs="Times New Roman" w:eastAsia="Songti SC" w:hAnsi="Times New Roman"/>
                 <w:b w:val="false"/>
                 <w:bCs w:val="false"/>
                 <w:color w:val="000000"/>
@@ -5435,7 +5435,7 @@
             </w:pPr>
             <w:r>
               <w:rPr>
-                <w:rFonts w:ascii="Times New Roman" w:cs="Times New Roman" w:eastAsia="Noto Serif CJK SC" w:hAnsi="Times New Roman"/>
+                <w:rFonts w:ascii="Times New Roman" w:cs="Times New Roman" w:eastAsia="Songti SC" w:hAnsi="Times New Roman"/>
                 <w:b w:val="false"/>
                 <w:bCs w:val="false"/>
                 <w:color w:val="000000"/>
@@ -5471,7 +5471,7 @@
             </w:pPr>
             <w:r>
               <w:rPr>
-                <w:rFonts w:ascii="Times New Roman" w:cs="Times New Roman" w:eastAsia="Noto Serif CJK SC" w:hAnsi="Times New Roman"/>
+                <w:rFonts w:ascii="Times New Roman" w:cs="Times New Roman" w:eastAsia="Songti SC" w:hAnsi="Times New Roman"/>
                 <w:b w:val="false"/>
                 <w:bCs w:val="false"/>
                 <w:color w:val="000000"/>
@@ -5505,7 +5505,7 @@
             </w:pPr>
             <w:r>
               <w:rPr>
-                <w:rFonts w:ascii="Times New Roman" w:cs="Times New Roman" w:eastAsia="Noto Serif CJK SC" w:hAnsi="Times New Roman"/>
+                <w:rFonts w:ascii="Times New Roman" w:cs="Times New Roman" w:eastAsia="Songti SC" w:hAnsi="Times New Roman"/>
                 <w:b w:val="false"/>
                 <w:bCs w:val="false"/>
                 <w:color w:val="000000"/>
@@ -5539,7 +5539,7 @@
             </w:pPr>
             <w:r>
               <w:rPr>
-                <w:rFonts w:ascii="Times New Roman" w:cs="Times New Roman" w:eastAsia="Noto Serif CJK SC" w:hAnsi="Times New Roman"/>
+                <w:rFonts w:ascii="Times New Roman" w:cs="Times New Roman" w:eastAsia="Songti SC" w:hAnsi="Times New Roman"/>
                 <w:b w:val="false"/>
                 <w:bCs w:val="false"/>
                 <w:color w:val="000000"/>
@@ -5573,7 +5573,7 @@
             </w:pPr>
             <w:r>
               <w:rPr>
-                <w:rFonts w:ascii="Times New Roman" w:cs="Times New Roman" w:eastAsia="Noto Serif CJK SC" w:hAnsi="Times New Roman"/>
+                <w:rFonts w:ascii="Times New Roman" w:cs="Times New Roman" w:eastAsia="Songti SC" w:hAnsi="Times New Roman"/>
                 <w:b w:val="false"/>
                 <w:bCs w:val="false"/>
                 <w:color w:val="000000"/>
@@ -5607,7 +5607,7 @@
             </w:pPr>
             <w:r>
               <w:rPr>
-                <w:rFonts w:ascii="Times New Roman" w:cs="Times New Roman" w:eastAsia="Noto Serif CJK SC" w:hAnsi="Times New Roman"/>
+                <w:rFonts w:ascii="Times New Roman" w:cs="Times New Roman" w:eastAsia="Songti SC" w:hAnsi="Times New Roman"/>
                 <w:b w:val="false"/>
                 <w:bCs w:val="false"/>
                 <w:color w:val="000000"/>
@@ -5643,7 +5643,7 @@
             </w:pPr>
             <w:r>
               <w:rPr>
-                <w:rFonts w:ascii="Times New Roman" w:cs="Times New Roman" w:eastAsia="Noto Serif CJK SC" w:hAnsi="Times New Roman"/>
+                <w:rFonts w:ascii="Times New Roman" w:cs="Times New Roman" w:eastAsia="Songti SC" w:hAnsi="Times New Roman"/>
                 <w:b w:val="false"/>
                 <w:bCs w:val="false"/>
                 <w:color w:val="000000"/>
@@ -5677,7 +5677,7 @@
             </w:pPr>
             <w:r>
               <w:rPr>
-                <w:rFonts w:ascii="Times New Roman" w:cs="Times New Roman" w:eastAsia="Noto Serif CJK SC" w:hAnsi="Times New Roman"/>
+                <w:rFonts w:ascii="Times New Roman" w:cs="Times New Roman" w:eastAsia="Songti SC" w:hAnsi="Times New Roman"/>
                 <w:b w:val="false"/>
                 <w:bCs w:val="false"/>
                 <w:color w:val="000000"/>
@@ -5711,7 +5711,7 @@
             </w:pPr>
             <w:r>
               <w:rPr>
-                <w:rFonts w:ascii="Times New Roman" w:cs="Times New Roman" w:eastAsia="Noto Serif CJK SC" w:hAnsi="Times New Roman"/>
+                <w:rFonts w:ascii="Times New Roman" w:cs="Times New Roman" w:eastAsia="Songti SC" w:hAnsi="Times New Roman"/>
                 <w:b w:val="false"/>
                 <w:bCs w:val="false"/>
                 <w:color w:val="000000"/>
@@ -5745,7 +5745,7 @@
             </w:pPr>
             <w:r>
               <w:rPr>
-                <w:rFonts w:ascii="Times New Roman" w:cs="Times New Roman" w:eastAsia="Noto Serif CJK SC" w:hAnsi="Times New Roman"/>
+                <w:rFonts w:ascii="Times New Roman" w:cs="Times New Roman" w:eastAsia="Songti SC" w:hAnsi="Times New Roman"/>
                 <w:b w:val="false"/>
                 <w:bCs w:val="false"/>
                 <w:color w:val="000000"/>
@@ -5779,7 +5779,7 @@
             </w:pPr>
             <w:r>
               <w:rPr>
-                <w:rFonts w:ascii="Times New Roman" w:cs="Times New Roman" w:eastAsia="Noto Serif CJK SC" w:hAnsi="Times New Roman"/>
+                <w:rFonts w:ascii="Times New Roman" w:cs="Times New Roman" w:eastAsia="Songti SC" w:hAnsi="Times New Roman"/>
                 <w:b w:val="false"/>
                 <w:bCs w:val="false"/>
                 <w:color w:val="000000"/>
@@ -5815,7 +5815,7 @@
             </w:pPr>
             <w:r>
               <w:rPr>
-                <w:rFonts w:ascii="Times New Roman" w:cs="Times New Roman" w:eastAsia="Noto Serif CJK SC" w:hAnsi="Times New Roman"/>
+                <w:rFonts w:ascii="Times New Roman" w:cs="Times New Roman" w:eastAsia="Songti SC" w:hAnsi="Times New Roman"/>
                 <w:b w:val="false"/>
                 <w:bCs w:val="false"/>
                 <w:color w:val="000000"/>
@@ -5849,7 +5849,7 @@
             </w:pPr>
             <w:r>
               <w:rPr>
-                <w:rFonts w:ascii="Times New Roman" w:cs="Times New Roman" w:eastAsia="Noto Serif CJK SC" w:hAnsi="Times New Roman"/>
+                <w:rFonts w:ascii="Times New Roman" w:cs="Times New Roman" w:eastAsia="Songti SC" w:hAnsi="Times New Roman"/>
                 <w:b w:val="false"/>
                 <w:bCs w:val="false"/>
                 <w:color w:val="000000"/>
@@ -5883,7 +5883,7 @@
             </w:pPr>
             <w:r>
               <w:rPr>
-                <w:rFonts w:ascii="Times New Roman" w:cs="Times New Roman" w:eastAsia="Noto Serif CJK SC" w:hAnsi="Times New Roman"/>
+                <w:rFonts w:ascii="Times New Roman" w:cs="Times New Roman" w:eastAsia="Songti SC" w:hAnsi="Times New Roman"/>
                 <w:b w:val="false"/>
                 <w:bCs w:val="false"/>
                 <w:color w:val="000000"/>
@@ -5917,7 +5917,7 @@
             </w:pPr>
             <w:r>
               <w:rPr>
-                <w:rFonts w:ascii="Times New Roman" w:cs="Times New Roman" w:eastAsia="Noto Serif CJK SC" w:hAnsi="Times New Roman"/>
+                <w:rFonts w:ascii="Times New Roman" w:cs="Times New Roman" w:eastAsia="Songti SC" w:hAnsi="Times New Roman"/>
                 <w:b w:val="false"/>
                 <w:bCs w:val="false"/>
                 <w:color w:val="000000"/>
@@ -5951,7 +5951,7 @@
             </w:pPr>
             <w:r>
               <w:rPr>
-                <w:rFonts w:ascii="Times New Roman" w:cs="Times New Roman" w:eastAsia="Noto Serif CJK SC" w:hAnsi="Times New Roman"/>
+                <w:rFonts w:ascii="Times New Roman" w:cs="Times New Roman" w:eastAsia="Songti SC" w:hAnsi="Times New Roman"/>
                 <w:b w:val="false"/>
                 <w:bCs w:val="false"/>
                 <w:color w:val="000000"/>
@@ -5987,7 +5987,7 @@
             </w:pPr>
             <w:r>
               <w:rPr>
-                <w:rFonts w:ascii="Times New Roman" w:cs="Times New Roman" w:eastAsia="Noto Serif CJK SC" w:hAnsi="Times New Roman"/>
+                <w:rFonts w:ascii="Times New Roman" w:cs="Times New Roman" w:eastAsia="Songti SC" w:hAnsi="Times New Roman"/>
                 <w:b w:val="false"/>
                 <w:bCs w:val="false"/>
                 <w:color w:val="000000"/>
@@ -6021,7 +6021,7 @@
             </w:pPr>
             <w:r>
               <w:rPr>
-                <w:rFonts w:ascii="Times New Roman" w:cs="Times New Roman" w:eastAsia="Noto Serif CJK SC" w:hAnsi="Times New Roman"/>
+                <w:rFonts w:ascii="Times New Roman" w:cs="Times New Roman" w:eastAsia="Songti SC" w:hAnsi="Times New Roman"/>
                 <w:b w:val="false"/>
                 <w:bCs w:val="false"/>
                 <w:color w:val="000000"/>
@@ -6055,7 +6055,7 @@
             </w:pPr>
             <w:r>
               <w:rPr>
-                <w:rFonts w:ascii="Times New Roman" w:cs="Times New Roman" w:eastAsia="Noto Serif CJK SC" w:hAnsi="Times New Roman"/>
+                <w:rFonts w:ascii="Times New Roman" w:cs="Times New Roman" w:eastAsia="Songti SC" w:hAnsi="Times New Roman"/>
                 <w:b w:val="false"/>
                 <w:bCs w:val="false"/>
                 <w:color w:val="000000"/>
@@ -6089,7 +6089,7 @@
             </w:pPr>
             <w:r>
               <w:rPr>
-                <w:rFonts w:ascii="Times New Roman" w:cs="Times New Roman" w:eastAsia="Noto Serif CJK SC" w:hAnsi="Times New Roman"/>
+                <w:rFonts w:ascii="Times New Roman" w:cs="Times New Roman" w:eastAsia="Songti SC" w:hAnsi="Times New Roman"/>
                 <w:b w:val="false"/>
                 <w:bCs w:val="false"/>
                 <w:color w:val="000000"/>
@@ -6123,7 +6123,7 @@
             </w:pPr>
             <w:r>
               <w:rPr>
-                <w:rFonts w:ascii="Times New Roman" w:cs="Times New Roman" w:eastAsia="Noto Serif CJK SC" w:hAnsi="Times New Roman"/>
+                <w:rFonts w:ascii="Times New Roman" w:cs="Times New Roman" w:eastAsia="Songti SC" w:hAnsi="Times New Roman"/>
                 <w:b w:val="false"/>
                 <w:bCs w:val="false"/>
                 <w:color w:val="000000"/>
@@ -6159,7 +6159,7 @@
             </w:pPr>
             <w:r>
               <w:rPr>
-                <w:rFonts w:ascii="Times New Roman" w:cs="Times New Roman" w:eastAsia="Noto Serif CJK SC" w:hAnsi="Times New Roman"/>
+                <w:rFonts w:ascii="Times New Roman" w:cs="Times New Roman" w:eastAsia="Songti SC" w:hAnsi="Times New Roman"/>
                 <w:b w:val="false"/>
                 <w:bCs w:val="false"/>
                 <w:color w:val="000000"/>
@@ -6193,7 +6193,7 @@
             </w:pPr>
             <w:r>
               <w:rPr>
-                <w:rFonts w:ascii="Times New Roman" w:cs="Times New Roman" w:eastAsia="Noto Serif CJK SC" w:hAnsi="Times New Roman"/>
+                <w:rFonts w:ascii="Times New Roman" w:cs="Times New Roman" w:eastAsia="Songti SC" w:hAnsi="Times New Roman"/>
                 <w:b w:val="false"/>
                 <w:bCs w:val="false"/>
                 <w:color w:val="000000"/>
@@ -6227,7 +6227,7 @@
             </w:pPr>
             <w:r>
               <w:rPr>
-                <w:rFonts w:ascii="Times New Roman" w:cs="Times New Roman" w:eastAsia="Noto Serif CJK SC" w:hAnsi="Times New Roman"/>
+                <w:rFonts w:ascii="Times New Roman" w:cs="Times New Roman" w:eastAsia="Songti SC" w:hAnsi="Times New Roman"/>
                 <w:b w:val="false"/>
                 <w:bCs w:val="false"/>
                 <w:color w:val="000000"/>
@@ -6261,7 +6261,7 @@
             </w:pPr>
             <w:r>
               <w:rPr>
-                <w:rFonts w:ascii="Times New Roman" w:cs="Times New Roman" w:eastAsia="Noto Serif CJK SC" w:hAnsi="Times New Roman"/>
+                <w:rFonts w:ascii="Times New Roman" w:cs="Times New Roman" w:eastAsia="Songti SC" w:hAnsi="Times New Roman"/>
                 <w:b w:val="false"/>
                 <w:bCs w:val="false"/>
                 <w:color w:val="000000"/>
@@ -6295,7 +6295,7 @@
             </w:pPr>
             <w:r>
               <w:rPr>
-                <w:rFonts w:ascii="Times New Roman" w:cs="Times New Roman" w:eastAsia="Noto Serif CJK SC" w:hAnsi="Times New Roman"/>
+                <w:rFonts w:ascii="Times New Roman" w:cs="Times New Roman" w:eastAsia="Songti SC" w:hAnsi="Times New Roman"/>
                 <w:b w:val="false"/>
                 <w:bCs w:val="false"/>
                 <w:color w:val="000000"/>
@@ -6331,7 +6331,7 @@
             </w:pPr>
             <w:r>
               <w:rPr>
-                <w:rFonts w:ascii="Times New Roman" w:cs="Times New Roman" w:eastAsia="Noto Serif CJK SC" w:hAnsi="Times New Roman"/>
+                <w:rFonts w:ascii="Times New Roman" w:cs="Times New Roman" w:eastAsia="Songti SC" w:hAnsi="Times New Roman"/>
                 <w:b w:val="false"/>
                 <w:bCs w:val="false"/>
                 <w:color w:val="000000"/>
@@ -6365,7 +6365,7 @@
             </w:pPr>
             <w:r>
               <w:rPr>
-                <w:rFonts w:ascii="Times New Roman" w:cs="Times New Roman" w:eastAsia="Noto Serif CJK SC" w:hAnsi="Times New Roman"/>
+                <w:rFonts w:ascii="Times New Roman" w:cs="Times New Roman" w:eastAsia="Songti SC" w:hAnsi="Times New Roman"/>
                 <w:b w:val="false"/>
                 <w:bCs w:val="false"/>
                 <w:color w:val="000000"/>
@@ -6399,7 +6399,7 @@
             </w:pPr>
             <w:r>
               <w:rPr>
-                <w:rFonts w:ascii="Times New Roman" w:cs="Times New Roman" w:eastAsia="Noto Serif CJK SC" w:hAnsi="Times New Roman"/>
+                <w:rFonts w:ascii="Times New Roman" w:cs="Times New Roman" w:eastAsia="Songti SC" w:hAnsi="Times New Roman"/>
                 <w:b w:val="false"/>
                 <w:bCs w:val="false"/>
                 <w:color w:val="000000"/>
@@ -6433,7 +6433,7 @@
             </w:pPr>
             <w:r>
               <w:rPr>
-                <w:rFonts w:ascii="Times New Roman" w:cs="Times New Roman" w:eastAsia="Noto Serif CJK SC" w:hAnsi="Times New Roman"/>
+                <w:rFonts w:ascii="Times New Roman" w:cs="Times New Roman" w:eastAsia="Songti SC" w:hAnsi="Times New Roman"/>
                 <w:b w:val="false"/>
                 <w:bCs w:val="false"/>
                 <w:color w:val="000000"/>
@@ -6467,7 +6467,7 @@
             </w:pPr>
             <w:r>
               <w:rPr>
-                <w:rFonts w:ascii="Times New Roman" w:cs="Times New Roman" w:eastAsia="Noto Serif CJK SC" w:hAnsi="Times New Roman"/>
+                <w:rFonts w:ascii="Times New Roman" w:cs="Times New Roman" w:eastAsia="Songti SC" w:hAnsi="Times New Roman"/>
                 <w:b w:val="false"/>
                 <w:bCs w:val="false"/>
                 <w:color w:val="000000"/>
@@ -6533,7 +6533,7 @@
       </w:pPr>
       <w:r>
         <w:rPr>
-          <w:rFonts w:ascii="Times New Roman" w:cs="Times New Roman" w:eastAsia="Noto Serif CJK SC" w:hAnsi="Times New Roman"/>
+          <w:rFonts w:ascii="Times New Roman" w:cs="Times New Roman" w:eastAsia="PingFang SC" w:hAnsi="Times New Roman"/>
           <w:color w:val="333333"/>
           <w:sz w:val="18"/>
           <w:szCs w:val="18"/>
@@ -6594,7 +6594,7 @@
       </w:pPr>
       <w:r>
         <w:rPr>
-          <w:rFonts w:ascii="Times New Roman" w:cs="Times New Roman" w:eastAsia="Noto Serif CJK SC" w:hAnsi="Times New Roman"/>
+          <w:rFonts w:ascii="Times New Roman" w:cs="Times New Roman" w:eastAsia="PingFang SC" w:hAnsi="Times New Roman"/>
           <w:color w:val="333333"/>
           <w:sz w:val="18"/>
           <w:szCs w:val="18"/>
@@ -6767,7 +6767,7 @@
       </w:pPr>
       <w:r>
         <w:rPr>
-          <w:rFonts w:ascii="Times New Roman" w:cs="Times New Roman" w:eastAsia="Noto Serif CJK SC" w:hAnsi="Times New Roman"/>
+          <w:rFonts w:ascii="Times New Roman" w:cs="Times New Roman" w:eastAsia="Songti SC" w:hAnsi="Times New Roman"/>
           <w:sz w:val="18"/>
           <w:szCs w:val="18"/>
         </w:rPr>
@@ -6781,7 +6781,7 @@
       </w:pPr>
       <w:r>
         <w:rPr>
-          <w:rFonts w:ascii="Times New Roman" w:cs="Times New Roman" w:eastAsia="Noto Serif CJK SC" w:hAnsi="Times New Roman"/>
+          <w:rFonts w:ascii="Times New Roman" w:cs="Times New Roman" w:eastAsia="Songti SC" w:hAnsi="Times New Roman"/>
           <w:sz w:val="18"/>
           <w:szCs w:val="18"/>
         </w:rPr>
@@ -6795,7 +6795,7 @@
       </w:pPr>
       <w:r>
         <w:rPr>
-          <w:rFonts w:ascii="Times New Roman" w:cs="Times New Roman" w:eastAsia="Noto Serif CJK SC" w:hAnsi="Times New Roman"/>
+          <w:rFonts w:ascii="Times New Roman" w:cs="Times New Roman" w:eastAsia="Songti SC" w:hAnsi="Times New Roman"/>
           <w:sz w:val="18"/>
           <w:szCs w:val="18"/>
         </w:rPr>
@@ -6809,7 +6809,7 @@
       </w:pPr>
       <w:r>
         <w:rPr>
-          <w:rFonts w:ascii="Times New Roman" w:cs="Times New Roman" w:eastAsia="Noto Serif CJK SC" w:hAnsi="Times New Roman"/>
+          <w:rFonts w:ascii="Times New Roman" w:cs="Times New Roman" w:eastAsia="Songti SC" w:hAnsi="Times New Roman"/>
           <w:sz w:val="18"/>
           <w:szCs w:val="18"/>
         </w:rPr>
@@ -6823,7 +6823,7 @@
       </w:pPr>
       <w:r>
         <w:rPr>
-          <w:rFonts w:ascii="Times New Roman" w:cs="Times New Roman" w:eastAsia="Noto Serif CJK SC" w:hAnsi="Times New Roman"/>
+          <w:rFonts w:ascii="Times New Roman" w:cs="Times New Roman" w:eastAsia="Songti SC" w:hAnsi="Times New Roman"/>
           <w:sz w:val="18"/>
           <w:szCs w:val="18"/>
         </w:rPr>
@@ -6837,7 +6837,7 @@
       </w:pPr>
       <w:r>
         <w:rPr>
-          <w:rFonts w:ascii="Times New Roman" w:cs="Times New Roman" w:eastAsia="Noto Serif CJK SC" w:hAnsi="Times New Roman"/>
+          <w:rFonts w:ascii="Times New Roman" w:cs="Times New Roman" w:eastAsia="Songti SC" w:hAnsi="Times New Roman"/>
           <w:sz w:val="18"/>
           <w:szCs w:val="18"/>
         </w:rPr>
@@ -6851,7 +6851,7 @@
       </w:pPr>
       <w:r>
         <w:rPr>
-          <w:rFonts w:ascii="Times New Roman" w:cs="Times New Roman" w:eastAsia="Noto Serif CJK SC" w:hAnsi="Times New Roman"/>
+          <w:rFonts w:ascii="Times New Roman" w:cs="Times New Roman" w:eastAsia="Songti SC" w:hAnsi="Times New Roman"/>
           <w:sz w:val="18"/>
           <w:szCs w:val="18"/>
         </w:rPr>
@@ -6865,7 +6865,7 @@
       </w:pPr>
       <w:r>
         <w:rPr>
-          <w:rFonts w:ascii="Times New Roman" w:cs="Times New Roman" w:eastAsia="Noto Serif CJK SC" w:hAnsi="Times New Roman"/>
+          <w:rFonts w:ascii="Times New Roman" w:cs="Times New Roman" w:eastAsia="Songti SC" w:hAnsi="Times New Roman"/>
           <w:sz w:val="18"/>
           <w:szCs w:val="18"/>
         </w:rPr>
@@ -6879,7 +6879,7 @@
       </w:pPr>
       <w:r>
         <w:rPr>
-          <w:rFonts w:ascii="Times New Roman" w:cs="Times New Roman" w:eastAsia="Noto Serif CJK SC" w:hAnsi="Times New Roman"/>
+          <w:rFonts w:ascii="Times New Roman" w:cs="Times New Roman" w:eastAsia="Songti SC" w:hAnsi="Times New Roman"/>
           <w:sz w:val="18"/>
           <w:szCs w:val="18"/>
         </w:rPr>
@@ -6893,7 +6893,7 @@
       </w:pPr>
       <w:r>
         <w:rPr>
-          <w:rFonts w:ascii="Times New Roman" w:cs="Times New Roman" w:eastAsia="Noto Serif CJK SC" w:hAnsi="Times New Roman"/>
+          <w:rFonts w:ascii="Times New Roman" w:cs="Times New Roman" w:eastAsia="Songti SC" w:hAnsi="Times New Roman"/>
           <w:sz w:val="18"/>
           <w:szCs w:val="18"/>
         </w:rPr>
@@ -6907,7 +6907,7 @@
       </w:pPr>
       <w:r>
         <w:rPr>
-          <w:rFonts w:ascii="Times New Roman" w:cs="Times New Roman" w:eastAsia="Noto Serif CJK SC" w:hAnsi="Times New Roman"/>
+          <w:rFonts w:ascii="Times New Roman" w:cs="Times New Roman" w:eastAsia="Songti SC" w:hAnsi="Times New Roman"/>
           <w:sz w:val="18"/>
           <w:szCs w:val="18"/>
         </w:rPr>
@@ -6921,7 +6921,7 @@
       </w:pPr>
       <w:r>
         <w:rPr>
-          <w:rFonts w:ascii="Times New Roman" w:cs="Times New Roman" w:eastAsia="Noto Serif CJK SC" w:hAnsi="Times New Roman"/>
+          <w:rFonts w:ascii="Times New Roman" w:cs="Times New Roman" w:eastAsia="Songti SC" w:hAnsi="Times New Roman"/>
           <w:sz w:val="18"/>
           <w:szCs w:val="18"/>
         </w:rPr>
@@ -6935,7 +6935,7 @@
       </w:pPr>
       <w:r>
         <w:rPr>
-          <w:rFonts w:ascii="Times New Roman" w:cs="Times New Roman" w:eastAsia="Noto Serif CJK SC" w:hAnsi="Times New Roman"/>
+          <w:rFonts w:ascii="Times New Roman" w:cs="Times New Roman" w:eastAsia="Songti SC" w:hAnsi="Times New Roman"/>
           <w:sz w:val="18"/>
           <w:szCs w:val="18"/>
         </w:rPr>
@@ -6949,7 +6949,7 @@
       </w:pPr>
       <w:r>
         <w:rPr>
-          <w:rFonts w:ascii="Times New Roman" w:cs="Times New Roman" w:eastAsia="Noto Serif CJK SC" w:hAnsi="Times New Roman"/>
+          <w:rFonts w:ascii="Times New Roman" w:cs="Times New Roman" w:eastAsia="Songti SC" w:hAnsi="Times New Roman"/>
           <w:sz w:val="18"/>
           <w:szCs w:val="18"/>
         </w:rPr>
@@ -6963,7 +6963,7 @@
       </w:pPr>
       <w:r>
         <w:rPr>
-          <w:rFonts w:ascii="Times New Roman" w:cs="Times New Roman" w:eastAsia="Noto Serif CJK SC" w:hAnsi="Times New Roman"/>
+          <w:rFonts w:ascii="Times New Roman" w:cs="Times New Roman" w:eastAsia="Songti SC" w:hAnsi="Times New Roman"/>
           <w:sz w:val="18"/>
           <w:szCs w:val="18"/>
         </w:rPr>
@@ -7057,7 +7057,7 @@
             </w:pPr>
             <w:r>
               <w:rPr>
-                <w:rFonts w:ascii="Times New Roman" w:cs="Times New Roman" w:eastAsia="Noto Serif CJK SC" w:hAnsi="Times New Roman"/>
+                <w:rFonts w:ascii="Times New Roman" w:cs="Times New Roman" w:eastAsia="Songti SC" w:hAnsi="Times New Roman"/>
                 <w:b/>
                 <w:bCs/>
                 <w:color w:val="FFFFFF"/>
@@ -7091,7 +7091,7 @@
             </w:pPr>
             <w:r>
               <w:rPr>
-                <w:rFonts w:ascii="Times New Roman" w:cs="Times New Roman" w:eastAsia="Noto Serif CJK SC" w:hAnsi="Times New Roman"/>
+                <w:rFonts w:ascii="Times New Roman" w:cs="Times New Roman" w:eastAsia="Songti SC" w:hAnsi="Times New Roman"/>
                 <w:b/>
                 <w:bCs/>
                 <w:color w:val="FFFFFF"/>
@@ -7125,7 +7125,7 @@
             </w:pPr>
             <w:r>
               <w:rPr>
-                <w:rFonts w:ascii="Times New Roman" w:cs="Times New Roman" w:eastAsia="Noto Serif CJK SC" w:hAnsi="Times New Roman"/>
+                <w:rFonts w:ascii="Times New Roman" w:cs="Times New Roman" w:eastAsia="Songti SC" w:hAnsi="Times New Roman"/>
                 <w:b/>
                 <w:bCs/>
                 <w:color w:val="FFFFFF"/>
@@ -7159,7 +7159,7 @@
             </w:pPr>
             <w:r>
               <w:rPr>
-                <w:rFonts w:ascii="Times New Roman" w:cs="Times New Roman" w:eastAsia="Noto Serif CJK SC" w:hAnsi="Times New Roman"/>
+                <w:rFonts w:ascii="Times New Roman" w:cs="Times New Roman" w:eastAsia="Songti SC" w:hAnsi="Times New Roman"/>
                 <w:b/>
                 <w:bCs/>
                 <w:color w:val="FFFFFF"/>
@@ -7193,7 +7193,7 @@
             </w:pPr>
             <w:r>
               <w:rPr>
-                <w:rFonts w:ascii="Times New Roman" w:cs="Times New Roman" w:eastAsia="Noto Serif CJK SC" w:hAnsi="Times New Roman"/>
+                <w:rFonts w:ascii="Times New Roman" w:cs="Times New Roman" w:eastAsia="Songti SC" w:hAnsi="Times New Roman"/>
                 <w:b/>
                 <w:bCs/>
                 <w:color w:val="FFFFFF"/>
@@ -7229,7 +7229,7 @@
             </w:pPr>
             <w:r>
               <w:rPr>
-                <w:rFonts w:ascii="Times New Roman" w:cs="Times New Roman" w:eastAsia="Noto Serif CJK SC" w:hAnsi="Times New Roman"/>
+                <w:rFonts w:ascii="Times New Roman" w:cs="Times New Roman" w:eastAsia="Songti SC" w:hAnsi="Times New Roman"/>
                 <w:b w:val="false"/>
                 <w:bCs w:val="false"/>
                 <w:color w:val="000000"/>
@@ -7263,7 +7263,7 @@
             </w:pPr>
             <w:r>
               <w:rPr>
-                <w:rFonts w:ascii="Times New Roman" w:cs="Times New Roman" w:eastAsia="Noto Serif CJK SC" w:hAnsi="Times New Roman"/>
+                <w:rFonts w:ascii="Times New Roman" w:cs="Times New Roman" w:eastAsia="Songti SC" w:hAnsi="Times New Roman"/>
                 <w:b w:val="false"/>
                 <w:bCs w:val="false"/>
                 <w:color w:val="000000"/>
@@ -7297,7 +7297,7 @@
             </w:pPr>
             <w:r>
               <w:rPr>
-                <w:rFonts w:ascii="Times New Roman" w:cs="Times New Roman" w:eastAsia="Noto Serif CJK SC" w:hAnsi="Times New Roman"/>
+                <w:rFonts w:ascii="Times New Roman" w:cs="Times New Roman" w:eastAsia="Songti SC" w:hAnsi="Times New Roman"/>
                 <w:b w:val="false"/>
                 <w:bCs w:val="false"/>
                 <w:color w:val="000000"/>
@@ -7331,7 +7331,7 @@
             </w:pPr>
             <w:r>
               <w:rPr>
-                <w:rFonts w:ascii="Times New Roman" w:cs="Times New Roman" w:eastAsia="Noto Serif CJK SC" w:hAnsi="Times New Roman"/>
+                <w:rFonts w:ascii="Times New Roman" w:cs="Times New Roman" w:eastAsia="Songti SC" w:hAnsi="Times New Roman"/>
                 <w:b w:val="false"/>
                 <w:bCs w:val="false"/>
                 <w:color w:val="000000"/>
@@ -7365,7 +7365,7 @@
             </w:pPr>
             <w:r>
               <w:rPr>
-                <w:rFonts w:ascii="Times New Roman" w:cs="Times New Roman" w:eastAsia="Noto Serif CJK SC" w:hAnsi="Times New Roman"/>
+                <w:rFonts w:ascii="Times New Roman" w:cs="Times New Roman" w:eastAsia="Songti SC" w:hAnsi="Times New Roman"/>
                 <w:b w:val="false"/>
                 <w:bCs w:val="false"/>
                 <w:color w:val="000000"/>
@@ -7401,7 +7401,7 @@
             </w:pPr>
             <w:r>
               <w:rPr>
-                <w:rFonts w:ascii="Times New Roman" w:cs="Times New Roman" w:eastAsia="Noto Serif CJK SC" w:hAnsi="Times New Roman"/>
+                <w:rFonts w:ascii="Times New Roman" w:cs="Times New Roman" w:eastAsia="Songti SC" w:hAnsi="Times New Roman"/>
                 <w:b w:val="false"/>
                 <w:bCs w:val="false"/>
                 <w:color w:val="000000"/>
@@ -7435,7 +7435,7 @@
             </w:pPr>
             <w:r>
               <w:rPr>
-                <w:rFonts w:ascii="Times New Roman" w:cs="Times New Roman" w:eastAsia="Noto Serif CJK SC" w:hAnsi="Times New Roman"/>
+                <w:rFonts w:ascii="Times New Roman" w:cs="Times New Roman" w:eastAsia="Songti SC" w:hAnsi="Times New Roman"/>
                 <w:b w:val="false"/>
                 <w:bCs w:val="false"/>
                 <w:color w:val="000000"/>
@@ -7469,7 +7469,7 @@
             </w:pPr>
             <w:r>
               <w:rPr>
-                <w:rFonts w:ascii="Times New Roman" w:cs="Times New Roman" w:eastAsia="Noto Serif CJK SC" w:hAnsi="Times New Roman"/>
+                <w:rFonts w:ascii="Times New Roman" w:cs="Times New Roman" w:eastAsia="Songti SC" w:hAnsi="Times New Roman"/>
                 <w:b w:val="false"/>
                 <w:bCs w:val="false"/>
                 <w:color w:val="000000"/>
@@ -7503,7 +7503,7 @@
             </w:pPr>
             <w:r>
               <w:rPr>
-                <w:rFonts w:ascii="Times New Roman" w:cs="Times New Roman" w:eastAsia="Noto Serif CJK SC" w:hAnsi="Times New Roman"/>
+                <w:rFonts w:ascii="Times New Roman" w:cs="Times New Roman" w:eastAsia="Songti SC" w:hAnsi="Times New Roman"/>
                 <w:b w:val="false"/>
                 <w:bCs w:val="false"/>
                 <w:color w:val="000000"/>
@@ -7537,7 +7537,7 @@
             </w:pPr>
             <w:r>
               <w:rPr>
-                <w:rFonts w:ascii="Times New Roman" w:cs="Times New Roman" w:eastAsia="Noto Serif CJK SC" w:hAnsi="Times New Roman"/>
+                <w:rFonts w:ascii="Times New Roman" w:cs="Times New Roman" w:eastAsia="Songti SC" w:hAnsi="Times New Roman"/>
                 <w:b w:val="false"/>
                 <w:bCs w:val="false"/>
                 <w:color w:val="000000"/>
@@ -7573,7 +7573,7 @@
             </w:pPr>
             <w:r>
               <w:rPr>
-                <w:rFonts w:ascii="Times New Roman" w:cs="Times New Roman" w:eastAsia="Noto Serif CJK SC" w:hAnsi="Times New Roman"/>
+                <w:rFonts w:ascii="Times New Roman" w:cs="Times New Roman" w:eastAsia="Songti SC" w:hAnsi="Times New Roman"/>
                 <w:b w:val="false"/>
                 <w:bCs w:val="false"/>
                 <w:color w:val="000000"/>
@@ -7607,7 +7607,7 @@
             </w:pPr>
             <w:r>
               <w:rPr>
-                <w:rFonts w:ascii="Times New Roman" w:cs="Times New Roman" w:eastAsia="Noto Serif CJK SC" w:hAnsi="Times New Roman"/>
+                <w:rFonts w:ascii="Times New Roman" w:cs="Times New Roman" w:eastAsia="Songti SC" w:hAnsi="Times New Roman"/>
                 <w:b w:val="false"/>
                 <w:bCs w:val="false"/>
                 <w:color w:val="000000"/>
@@ -7641,7 +7641,7 @@
             </w:pPr>
             <w:r>
               <w:rPr>
-                <w:rFonts w:ascii="Times New Roman" w:cs="Times New Roman" w:eastAsia="Noto Serif CJK SC" w:hAnsi="Times New Roman"/>
+                <w:rFonts w:ascii="Times New Roman" w:cs="Times New Roman" w:eastAsia="Songti SC" w:hAnsi="Times New Roman"/>
                 <w:b w:val="false"/>
                 <w:bCs w:val="false"/>
                 <w:color w:val="000000"/>
@@ -7675,7 +7675,7 @@
             </w:pPr>
             <w:r>
               <w:rPr>
-                <w:rFonts w:ascii="Times New Roman" w:cs="Times New Roman" w:eastAsia="Noto Serif CJK SC" w:hAnsi="Times New Roman"/>
+                <w:rFonts w:ascii="Times New Roman" w:cs="Times New Roman" w:eastAsia="Songti SC" w:hAnsi="Times New Roman"/>
                 <w:b w:val="false"/>
                 <w:bCs w:val="false"/>
                 <w:color w:val="000000"/>
@@ -7709,7 +7709,7 @@
             </w:pPr>
             <w:r>
               <w:rPr>
-                <w:rFonts w:ascii="Times New Roman" w:cs="Times New Roman" w:eastAsia="Noto Serif CJK SC" w:hAnsi="Times New Roman"/>
+                <w:rFonts w:ascii="Times New Roman" w:cs="Times New Roman" w:eastAsia="Songti SC" w:hAnsi="Times New Roman"/>
                 <w:b w:val="false"/>
                 <w:bCs w:val="false"/>
                 <w:color w:val="000000"/>
@@ -7745,7 +7745,7 @@
             </w:pPr>
             <w:r>
               <w:rPr>
-                <w:rFonts w:ascii="Times New Roman" w:cs="Times New Roman" w:eastAsia="Noto Serif CJK SC" w:hAnsi="Times New Roman"/>
+                <w:rFonts w:ascii="Times New Roman" w:cs="Times New Roman" w:eastAsia="Songti SC" w:hAnsi="Times New Roman"/>
                 <w:b w:val="false"/>
                 <w:bCs w:val="false"/>
                 <w:color w:val="000000"/>
@@ -7779,7 +7779,7 @@
             </w:pPr>
             <w:r>
               <w:rPr>
-                <w:rFonts w:ascii="Times New Roman" w:cs="Times New Roman" w:eastAsia="Noto Serif CJK SC" w:hAnsi="Times New Roman"/>
+                <w:rFonts w:ascii="Times New Roman" w:cs="Times New Roman" w:eastAsia="Songti SC" w:hAnsi="Times New Roman"/>
                 <w:b w:val="false"/>
                 <w:bCs w:val="false"/>
                 <w:color w:val="000000"/>
@@ -7813,7 +7813,7 @@
             </w:pPr>
             <w:r>
               <w:rPr>
-                <w:rFonts w:ascii="Times New Roman" w:cs="Times New Roman" w:eastAsia="Noto Serif CJK SC" w:hAnsi="Times New Roman"/>
+                <w:rFonts w:ascii="Times New Roman" w:cs="Times New Roman" w:eastAsia="Songti SC" w:hAnsi="Times New Roman"/>
                 <w:b w:val="false"/>
                 <w:bCs w:val="false"/>
                 <w:color w:val="000000"/>
@@ -7847,7 +7847,7 @@
             </w:pPr>
             <w:r>
               <w:rPr>
-                <w:rFonts w:ascii="Times New Roman" w:cs="Times New Roman" w:eastAsia="Noto Serif CJK SC" w:hAnsi="Times New Roman"/>
+                <w:rFonts w:ascii="Times New Roman" w:cs="Times New Roman" w:eastAsia="Songti SC" w:hAnsi="Times New Roman"/>
                 <w:b w:val="false"/>
                 <w:bCs w:val="false"/>
                 <w:color w:val="000000"/>
@@ -7881,7 +7881,7 @@
             </w:pPr>
             <w:r>
               <w:rPr>
-                <w:rFonts w:ascii="Times New Roman" w:cs="Times New Roman" w:eastAsia="Noto Serif CJK SC" w:hAnsi="Times New Roman"/>
+                <w:rFonts w:ascii="Times New Roman" w:cs="Times New Roman" w:eastAsia="Songti SC" w:hAnsi="Times New Roman"/>
                 <w:b w:val="false"/>
                 <w:bCs w:val="false"/>
                 <w:color w:val="000000"/>
@@ -7917,7 +7917,7 @@
             </w:pPr>
             <w:r>
               <w:rPr>
-                <w:rFonts w:ascii="Times New Roman" w:cs="Times New Roman" w:eastAsia="Noto Serif CJK SC" w:hAnsi="Times New Roman"/>
+                <w:rFonts w:ascii="Times New Roman" w:cs="Times New Roman" w:eastAsia="Songti SC" w:hAnsi="Times New Roman"/>
                 <w:b w:val="false"/>
                 <w:bCs w:val="false"/>
                 <w:color w:val="000000"/>
@@ -7951,7 +7951,7 @@
             </w:pPr>
             <w:r>
               <w:rPr>
-                <w:rFonts w:ascii="Times New Roman" w:cs="Times New Roman" w:eastAsia="Noto Serif CJK SC" w:hAnsi="Times New Roman"/>
+                <w:rFonts w:ascii="Times New Roman" w:cs="Times New Roman" w:eastAsia="Songti SC" w:hAnsi="Times New Roman"/>
                 <w:b w:val="false"/>
                 <w:bCs w:val="false"/>
                 <w:color w:val="000000"/>
@@ -7985,7 +7985,7 @@
             </w:pPr>
             <w:r>
               <w:rPr>
-                <w:rFonts w:ascii="Times New Roman" w:cs="Times New Roman" w:eastAsia="Noto Serif CJK SC" w:hAnsi="Times New Roman"/>
+                <w:rFonts w:ascii="Times New Roman" w:cs="Times New Roman" w:eastAsia="Songti SC" w:hAnsi="Times New Roman"/>
                 <w:b w:val="false"/>
                 <w:bCs w:val="false"/>
                 <w:color w:val="000000"/>
@@ -8019,7 +8019,7 @@
             </w:pPr>
             <w:r>
               <w:rPr>
-                <w:rFonts w:ascii="Times New Roman" w:cs="Times New Roman" w:eastAsia="Noto Serif CJK SC" w:hAnsi="Times New Roman"/>
+                <w:rFonts w:ascii="Times New Roman" w:cs="Times New Roman" w:eastAsia="Songti SC" w:hAnsi="Times New Roman"/>
                 <w:b w:val="false"/>
                 <w:bCs w:val="false"/>
                 <w:color w:val="000000"/>
@@ -8053,7 +8053,7 @@
             </w:pPr>
             <w:r>
               <w:rPr>
-                <w:rFonts w:ascii="Times New Roman" w:cs="Times New Roman" w:eastAsia="Noto Serif CJK SC" w:hAnsi="Times New Roman"/>
+                <w:rFonts w:ascii="Times New Roman" w:cs="Times New Roman" w:eastAsia="Songti SC" w:hAnsi="Times New Roman"/>
                 <w:b w:val="false"/>
                 <w:bCs w:val="false"/>
                 <w:color w:val="000000"/>
@@ -8089,7 +8089,7 @@
             </w:pPr>
             <w:r>
               <w:rPr>
-                <w:rFonts w:ascii="Times New Roman" w:cs="Times New Roman" w:eastAsia="Noto Serif CJK SC" w:hAnsi="Times New Roman"/>
+                <w:rFonts w:ascii="Times New Roman" w:cs="Times New Roman" w:eastAsia="Songti SC" w:hAnsi="Times New Roman"/>
                 <w:b w:val="false"/>
                 <w:bCs w:val="false"/>
                 <w:color w:val="000000"/>
@@ -8123,7 +8123,7 @@
             </w:pPr>
             <w:r>
               <w:rPr>
-                <w:rFonts w:ascii="Times New Roman" w:cs="Times New Roman" w:eastAsia="Noto Serif CJK SC" w:hAnsi="Times New Roman"/>
+                <w:rFonts w:ascii="Times New Roman" w:cs="Times New Roman" w:eastAsia="Songti SC" w:hAnsi="Times New Roman"/>
                 <w:b w:val="false"/>
                 <w:bCs w:val="false"/>
                 <w:color w:val="000000"/>
@@ -8157,7 +8157,7 @@
             </w:pPr>
             <w:r>
               <w:rPr>
-                <w:rFonts w:ascii="Times New Roman" w:cs="Times New Roman" w:eastAsia="Noto Serif CJK SC" w:hAnsi="Times New Roman"/>
+                <w:rFonts w:ascii="Times New Roman" w:cs="Times New Roman" w:eastAsia="Songti SC" w:hAnsi="Times New Roman"/>
                 <w:b w:val="false"/>
                 <w:bCs w:val="false"/>
                 <w:color w:val="000000"/>
@@ -8191,7 +8191,7 @@
             </w:pPr>
             <w:r>
               <w:rPr>
-                <w:rFonts w:ascii="Times New Roman" w:cs="Times New Roman" w:eastAsia="Noto Serif CJK SC" w:hAnsi="Times New Roman"/>
+                <w:rFonts w:ascii="Times New Roman" w:cs="Times New Roman" w:eastAsia="Songti SC" w:hAnsi="Times New Roman"/>
                 <w:b w:val="false"/>
                 <w:bCs w:val="false"/>
                 <w:color w:val="000000"/>
@@ -8225,7 +8225,7 @@
             </w:pPr>
             <w:r>
               <w:rPr>
-                <w:rFonts w:ascii="Times New Roman" w:cs="Times New Roman" w:eastAsia="Noto Serif CJK SC" w:hAnsi="Times New Roman"/>
+                <w:rFonts w:ascii="Times New Roman" w:cs="Times New Roman" w:eastAsia="Songti SC" w:hAnsi="Times New Roman"/>
                 <w:b w:val="false"/>
                 <w:bCs w:val="false"/>
                 <w:color w:val="000000"/>
@@ -8261,7 +8261,7 @@
             </w:pPr>
             <w:r>
               <w:rPr>
-                <w:rFonts w:ascii="Times New Roman" w:cs="Times New Roman" w:eastAsia="Noto Serif CJK SC" w:hAnsi="Times New Roman"/>
+                <w:rFonts w:ascii="Times New Roman" w:cs="Times New Roman" w:eastAsia="Songti SC" w:hAnsi="Times New Roman"/>
                 <w:b w:val="false"/>
                 <w:bCs w:val="false"/>
                 <w:color w:val="000000"/>
@@ -8295,7 +8295,7 @@
             </w:pPr>
             <w:r>
               <w:rPr>
-                <w:rFonts w:ascii="Times New Roman" w:cs="Times New Roman" w:eastAsia="Noto Serif CJK SC" w:hAnsi="Times New Roman"/>
+                <w:rFonts w:ascii="Times New Roman" w:cs="Times New Roman" w:eastAsia="Songti SC" w:hAnsi="Times New Roman"/>
                 <w:b w:val="false"/>
                 <w:bCs w:val="false"/>
                 <w:color w:val="000000"/>
@@ -8329,7 +8329,7 @@
             </w:pPr>
             <w:r>
               <w:rPr>
-                <w:rFonts w:ascii="Times New Roman" w:cs="Times New Roman" w:eastAsia="Noto Serif CJK SC" w:hAnsi="Times New Roman"/>
+                <w:rFonts w:ascii="Times New Roman" w:cs="Times New Roman" w:eastAsia="Songti SC" w:hAnsi="Times New Roman"/>
                 <w:b w:val="false"/>
                 <w:bCs w:val="false"/>
                 <w:color w:val="000000"/>
@@ -8363,7 +8363,7 @@
             </w:pPr>
             <w:r>
               <w:rPr>
-                <w:rFonts w:ascii="Times New Roman" w:cs="Times New Roman" w:eastAsia="Noto Serif CJK SC" w:hAnsi="Times New Roman"/>
+                <w:rFonts w:ascii="Times New Roman" w:cs="Times New Roman" w:eastAsia="Songti SC" w:hAnsi="Times New Roman"/>
                 <w:b w:val="false"/>
                 <w:bCs w:val="false"/>
                 <w:color w:val="000000"/>
@@ -8397,7 +8397,7 @@
             </w:pPr>
             <w:r>
               <w:rPr>
-                <w:rFonts w:ascii="Times New Roman" w:cs="Times New Roman" w:eastAsia="Noto Serif CJK SC" w:hAnsi="Times New Roman"/>
+                <w:rFonts w:ascii="Times New Roman" w:cs="Times New Roman" w:eastAsia="Songti SC" w:hAnsi="Times New Roman"/>
                 <w:b w:val="false"/>
                 <w:bCs w:val="false"/>
                 <w:color w:val="000000"/>
@@ -8433,7 +8433,7 @@
             </w:pPr>
             <w:r>
               <w:rPr>
-                <w:rFonts w:ascii="Times New Roman" w:cs="Times New Roman" w:eastAsia="Noto Serif CJK SC" w:hAnsi="Times New Roman"/>
+                <w:rFonts w:ascii="Times New Roman" w:cs="Times New Roman" w:eastAsia="Songti SC" w:hAnsi="Times New Roman"/>
                 <w:b w:val="false"/>
                 <w:bCs w:val="false"/>
                 <w:color w:val="000000"/>
@@ -8467,7 +8467,7 @@
             </w:pPr>
             <w:r>
               <w:rPr>
-                <w:rFonts w:ascii="Times New Roman" w:cs="Times New Roman" w:eastAsia="Noto Serif CJK SC" w:hAnsi="Times New Roman"/>
+                <w:rFonts w:ascii="Times New Roman" w:cs="Times New Roman" w:eastAsia="Songti SC" w:hAnsi="Times New Roman"/>
                 <w:b w:val="false"/>
                 <w:bCs w:val="false"/>
                 <w:color w:val="000000"/>
@@ -8501,7 +8501,7 @@
             </w:pPr>
             <w:r>
               <w:rPr>
-                <w:rFonts w:ascii="Times New Roman" w:cs="Times New Roman" w:eastAsia="Noto Serif CJK SC" w:hAnsi="Times New Roman"/>
+                <w:rFonts w:ascii="Times New Roman" w:cs="Times New Roman" w:eastAsia="Songti SC" w:hAnsi="Times New Roman"/>
                 <w:b w:val="false"/>
                 <w:bCs w:val="false"/>
                 <w:color w:val="000000"/>
@@ -8535,7 +8535,7 @@
             </w:pPr>
             <w:r>
               <w:rPr>
-                <w:rFonts w:ascii="Times New Roman" w:cs="Times New Roman" w:eastAsia="Noto Serif CJK SC" w:hAnsi="Times New Roman"/>
+                <w:rFonts w:ascii="Times New Roman" w:cs="Times New Roman" w:eastAsia="Songti SC" w:hAnsi="Times New Roman"/>
                 <w:b w:val="false"/>
                 <w:bCs w:val="false"/>
                 <w:color w:val="000000"/>
@@ -8569,7 +8569,7 @@
             </w:pPr>
             <w:r>
               <w:rPr>
-                <w:rFonts w:ascii="Times New Roman" w:cs="Times New Roman" w:eastAsia="Noto Serif CJK SC" w:hAnsi="Times New Roman"/>
+                <w:rFonts w:ascii="Times New Roman" w:cs="Times New Roman" w:eastAsia="Songti SC" w:hAnsi="Times New Roman"/>
                 <w:b w:val="false"/>
                 <w:bCs w:val="false"/>
                 <w:color w:val="000000"/>
@@ -8596,6 +8596,22 @@
       </w:r>
       <w:r>
         <w:t xml:space="preserve">本研究使用课程提供的 BACE 数据集与公开蛋白结构 PDB 4D8C；建模、调参、误差解剖、对接、PBCNet2、conformal 与审计脚本及结果表存于项目仓库，经统一入口一键复跑；PBCNet2 代码与权重来自作者公开 MIT 仓库。</w:t>
+      </w:r>
+    </w:p>
+    <w:p>
+      <w:pPr>
+        <w:spacing w:after="100" w:line="300"/>
+        <w:jc w:val="both"/>
+      </w:pPr>
+      <w:r>
+        <w:rPr>
+          <w:b/>
+          <w:bCs/>
+        </w:rPr>
+        <w:t xml:space="preserve">D. 配套 JCIM 投稿论文（全文附后）：</w:t>
+      </w:r>
+      <w:r>
+        <w:t xml:space="preserve">本项目中跨分子基础模型的 conformal 预测区间评估已扩展为一篇面向《Journal of Chemical Information and Modeling》（JCIM, ACS）的英文论文，题为 “Conformal Uncertainty Quantification across Molecular Foundation Models for Small-Sample Regression”，在固定有效覆盖率下系统比较各分子基础模型预测区间的宽度与条件覆盖。该论文正文与补充材料（Supporting Information）作为本报告附录全文附于其后，保留其英文 ACS 双栏排版与独立页码。</w:t>
       </w:r>
     </w:p>
     <w:sectPr>
@@ -8658,7 +8674,7 @@
     </w:pPr>
     <w:r>
       <w:rPr>
-        <w:rFonts w:ascii="Times New Roman" w:cs="Times New Roman" w:eastAsia="Noto Serif CJK SC" w:hAnsi="Times New Roman"/>
+        <w:rFonts w:ascii="Times New Roman" w:cs="Times New Roman" w:eastAsia="Songti SC" w:hAnsi="Times New Roman"/>
         <w:sz w:val="18"/>
         <w:szCs w:val="18"/>
       </w:rPr>
@@ -8826,7 +8842,7 @@
   <w:docDefaults>
     <w:rPrDefault>
       <w:rPr>
-        <w:rFonts w:ascii="Times New Roman" w:cs="Times New Roman" w:eastAsia="Noto Serif CJK SC" w:hAnsi="Times New Roman"/>
+        <w:rFonts w:ascii="Times New Roman" w:cs="Times New Roman" w:eastAsia="Songti SC" w:hAnsi="Times New Roman"/>
         <w:sz w:val="21"/>
         <w:szCs w:val="21"/>
       </w:rPr>
@@ -9014,7 +9030,7 @@
       <w:outlineLvl w:val="0"/>
     </w:pPr>
     <w:rPr>
-      <w:rFonts w:ascii="Times New Roman" w:cs="Times New Roman" w:eastAsia="Noto Serif CJK SC" w:hAnsi="Times New Roman"/>
+      <w:rFonts w:ascii="Times New Roman" w:cs="Times New Roman" w:eastAsia="PingFang SC" w:hAnsi="Times New Roman"/>
       <w:b/>
       <w:bCs/>
       <w:color w:val="1F3864"/>
@@ -9032,7 +9048,7 @@
       <w:outlineLvl w:val="1"/>
     </w:pPr>
     <w:rPr>
-      <w:rFonts w:ascii="Times New Roman" w:cs="Times New Roman" w:eastAsia="Noto Serif CJK SC" w:hAnsi="Times New Roman"/>
+      <w:rFonts w:ascii="Times New Roman" w:cs="Times New Roman" w:eastAsia="PingFang SC" w:hAnsi="Times New Roman"/>
       <w:b/>
       <w:bCs/>
       <w:color w:val="2E5496"/>

</xml_diff>

<commit_message>
report+slides: use open Noto CJK fonts (no Apple fonts), with real bold
Replace the Apple system fonts (PingFang SC / Songti SC) introduced in the
previous commit with the open-source, freely embeddable Noto CJK fonts:
headings/title -> Noto Sans CJK SC (heihei), body -> Noto Serif CJK SC
(songti), both with real Bold weights so no run is algorithmically
faux-bolded. The exported report/slides PDFs now embed only Noto + Times +
Courier, zero Apple fonts (verified via pdffonts).

macOS 14+ does not reliably register fonts dropped in ~/Library/Fonts with
CoreText (which LibreOffice uses for PDF export), so add
scripts/setup_soffice_fonts.sh to copy the Noto OTFs into LibreOffice's own
bundled font directory, which it scans directly. Unnecessary on Linux.

Assisted-by: Claude
</commit_message>
<xml_diff>
--- a/report/课程实验报告_BACE.docx
+++ b/report/课程实验报告_BACE.docx
@@ -101,7 +101,7 @@
       </w:pPr>
       <w:r>
         <w:rPr>
-          <w:rFonts w:ascii="Times New Roman" w:cs="Times New Roman" w:eastAsia="PingFang SC" w:hAnsi="Times New Roman"/>
+          <w:rFonts w:ascii="Times New Roman" w:cs="Times New Roman" w:eastAsia="Noto Sans CJK SC" w:hAnsi="Times New Roman"/>
           <w:b/>
           <w:bCs/>
           <w:color w:val="1F3864"/>
@@ -152,7 +152,7 @@
           <w:p>
             <w:r>
               <w:rPr>
-                <w:rFonts w:ascii="Times New Roman" w:cs="Times New Roman" w:eastAsia="Songti SC" w:hAnsi="Times New Roman"/>
+                <w:rFonts w:ascii="Times New Roman" w:cs="Times New Roman" w:eastAsia="Noto Serif CJK SC" w:hAnsi="Times New Roman"/>
                 <w:b/>
                 <w:bCs/>
                 <w:sz w:val="22"/>
@@ -183,7 +183,7 @@
           <w:p>
             <w:r>
               <w:rPr>
-                <w:rFonts w:ascii="Times New Roman" w:cs="Times New Roman" w:eastAsia="Songti SC" w:hAnsi="Times New Roman"/>
+                <w:rFonts w:ascii="Times New Roman" w:cs="Times New Roman" w:eastAsia="Noto Serif CJK SC" w:hAnsi="Times New Roman"/>
                 <w:b w:val="false"/>
                 <w:bCs w:val="false"/>
                 <w:sz w:val="22"/>
@@ -216,7 +216,7 @@
           <w:p>
             <w:r>
               <w:rPr>
-                <w:rFonts w:ascii="Times New Roman" w:cs="Times New Roman" w:eastAsia="Songti SC" w:hAnsi="Times New Roman"/>
+                <w:rFonts w:ascii="Times New Roman" w:cs="Times New Roman" w:eastAsia="Noto Serif CJK SC" w:hAnsi="Times New Roman"/>
                 <w:b/>
                 <w:bCs/>
                 <w:sz w:val="22"/>
@@ -247,7 +247,7 @@
           <w:p>
             <w:r>
               <w:rPr>
-                <w:rFonts w:ascii="Times New Roman" w:cs="Times New Roman" w:eastAsia="Songti SC" w:hAnsi="Times New Roman"/>
+                <w:rFonts w:ascii="Times New Roman" w:cs="Times New Roman" w:eastAsia="Noto Serif CJK SC" w:hAnsi="Times New Roman"/>
                 <w:b w:val="false"/>
                 <w:bCs w:val="false"/>
                 <w:sz w:val="22"/>
@@ -278,7 +278,7 @@
           <w:p>
             <w:r>
               <w:rPr>
-                <w:rFonts w:ascii="Times New Roman" w:cs="Times New Roman" w:eastAsia="Songti SC" w:hAnsi="Times New Roman"/>
+                <w:rFonts w:ascii="Times New Roman" w:cs="Times New Roman" w:eastAsia="Noto Serif CJK SC" w:hAnsi="Times New Roman"/>
                 <w:b/>
                 <w:bCs/>
                 <w:sz w:val="22"/>
@@ -309,7 +309,7 @@
           <w:p>
             <w:r>
               <w:rPr>
-                <w:rFonts w:ascii="Times New Roman" w:cs="Times New Roman" w:eastAsia="Songti SC" w:hAnsi="Times New Roman"/>
+                <w:rFonts w:ascii="Times New Roman" w:cs="Times New Roman" w:eastAsia="Noto Serif CJK SC" w:hAnsi="Times New Roman"/>
                 <w:b w:val="false"/>
                 <w:bCs w:val="false"/>
                 <w:sz w:val="22"/>
@@ -342,7 +342,7 @@
           <w:p>
             <w:r>
               <w:rPr>
-                <w:rFonts w:ascii="Times New Roman" w:cs="Times New Roman" w:eastAsia="Songti SC" w:hAnsi="Times New Roman"/>
+                <w:rFonts w:ascii="Times New Roman" w:cs="Times New Roman" w:eastAsia="Noto Serif CJK SC" w:hAnsi="Times New Roman"/>
                 <w:b/>
                 <w:bCs/>
                 <w:sz w:val="22"/>
@@ -373,7 +373,7 @@
           <w:p>
             <w:r>
               <w:rPr>
-                <w:rFonts w:ascii="Times New Roman" w:cs="Times New Roman" w:eastAsia="Songti SC" w:hAnsi="Times New Roman"/>
+                <w:rFonts w:ascii="Times New Roman" w:cs="Times New Roman" w:eastAsia="Noto Serif CJK SC" w:hAnsi="Times New Roman"/>
                 <w:b w:val="false"/>
                 <w:bCs w:val="false"/>
                 <w:sz w:val="22"/>
@@ -404,7 +404,7 @@
           <w:p>
             <w:r>
               <w:rPr>
-                <w:rFonts w:ascii="Times New Roman" w:cs="Times New Roman" w:eastAsia="Songti SC" w:hAnsi="Times New Roman"/>
+                <w:rFonts w:ascii="Times New Roman" w:cs="Times New Roman" w:eastAsia="Noto Serif CJK SC" w:hAnsi="Times New Roman"/>
                 <w:b/>
                 <w:bCs/>
                 <w:sz w:val="22"/>
@@ -435,7 +435,7 @@
           <w:p>
             <w:r>
               <w:rPr>
-                <w:rFonts w:ascii="Times New Roman" w:cs="Times New Roman" w:eastAsia="Songti SC" w:hAnsi="Times New Roman"/>
+                <w:rFonts w:ascii="Times New Roman" w:cs="Times New Roman" w:eastAsia="Noto Serif CJK SC" w:hAnsi="Times New Roman"/>
                 <w:b w:val="false"/>
                 <w:bCs w:val="false"/>
                 <w:sz w:val="22"/>
@@ -454,7 +454,7 @@
       </w:pPr>
       <w:r>
         <w:rPr>
-          <w:rFonts w:ascii="Times New Roman" w:cs="Times New Roman" w:eastAsia="Songti SC" w:hAnsi="Times New Roman"/>
+          <w:rFonts w:ascii="Times New Roman" w:cs="Times New Roman" w:eastAsia="Noto Serif CJK SC" w:hAnsi="Times New Roman"/>
           <w:sz w:val="22"/>
           <w:szCs w:val="22"/>
         </w:rPr>
@@ -473,7 +473,7 @@
       </w:pPr>
       <w:r>
         <w:rPr>
-          <w:rFonts w:ascii="Times New Roman" w:cs="Times New Roman" w:eastAsia="PingFang SC" w:hAnsi="Times New Roman"/>
+          <w:rFonts w:ascii="Times New Roman" w:cs="Times New Roman" w:eastAsia="Noto Sans CJK SC" w:hAnsi="Times New Roman"/>
           <w:b/>
           <w:bCs/>
           <w:color w:val="1F3864"/>
@@ -490,7 +490,7 @@
       </w:pPr>
       <w:r>
         <w:rPr>
-          <w:rFonts w:ascii="Times New Roman" w:cs="Times New Roman" w:eastAsia="Kaiti SC" w:hAnsi="Times New Roman"/>
+          <w:rFonts w:ascii="Times New Roman" w:cs="Times New Roman" w:eastAsia="Noto Serif CJK SC" w:hAnsi="Times New Roman"/>
           <w:color w:val="555555"/>
           <w:sz w:val="20"/>
           <w:szCs w:val="20"/>
@@ -609,7 +609,7 @@
             </w:pPr>
             <w:r>
               <w:rPr>
-                <w:rFonts w:ascii="Times New Roman" w:cs="Times New Roman" w:eastAsia="Songti SC" w:hAnsi="Times New Roman"/>
+                <w:rFonts w:ascii="Times New Roman" w:cs="Times New Roman" w:eastAsia="Noto Serif CJK SC" w:hAnsi="Times New Roman"/>
                 <w:b/>
                 <w:bCs/>
                 <w:color w:val="FFFFFF"/>
@@ -643,7 +643,7 @@
             </w:pPr>
             <w:r>
               <w:rPr>
-                <w:rFonts w:ascii="Times New Roman" w:cs="Times New Roman" w:eastAsia="Songti SC" w:hAnsi="Times New Roman"/>
+                <w:rFonts w:ascii="Times New Roman" w:cs="Times New Roman" w:eastAsia="Noto Serif CJK SC" w:hAnsi="Times New Roman"/>
                 <w:b/>
                 <w:bCs/>
                 <w:color w:val="FFFFFF"/>
@@ -679,7 +679,7 @@
             </w:pPr>
             <w:r>
               <w:rPr>
-                <w:rFonts w:ascii="Times New Roman" w:cs="Times New Roman" w:eastAsia="Songti SC" w:hAnsi="Times New Roman"/>
+                <w:rFonts w:ascii="Times New Roman" w:cs="Times New Roman" w:eastAsia="Noto Serif CJK SC" w:hAnsi="Times New Roman"/>
                 <w:b w:val="false"/>
                 <w:bCs w:val="false"/>
                 <w:color w:val="000000"/>
@@ -713,7 +713,7 @@
             </w:pPr>
             <w:r>
               <w:rPr>
-                <w:rFonts w:ascii="Times New Roman" w:cs="Times New Roman" w:eastAsia="Songti SC" w:hAnsi="Times New Roman"/>
+                <w:rFonts w:ascii="Times New Roman" w:cs="Times New Roman" w:eastAsia="Noto Serif CJK SC" w:hAnsi="Times New Roman"/>
                 <w:b w:val="false"/>
                 <w:bCs w:val="false"/>
                 <w:color w:val="000000"/>
@@ -749,7 +749,7 @@
             </w:pPr>
             <w:r>
               <w:rPr>
-                <w:rFonts w:ascii="Times New Roman" w:cs="Times New Roman" w:eastAsia="Songti SC" w:hAnsi="Times New Roman"/>
+                <w:rFonts w:ascii="Times New Roman" w:cs="Times New Roman" w:eastAsia="Noto Serif CJK SC" w:hAnsi="Times New Roman"/>
                 <w:b w:val="false"/>
                 <w:bCs w:val="false"/>
                 <w:color w:val="000000"/>
@@ -783,7 +783,7 @@
             </w:pPr>
             <w:r>
               <w:rPr>
-                <w:rFonts w:ascii="Times New Roman" w:cs="Times New Roman" w:eastAsia="Songti SC" w:hAnsi="Times New Roman"/>
+                <w:rFonts w:ascii="Times New Roman" w:cs="Times New Roman" w:eastAsia="Noto Serif CJK SC" w:hAnsi="Times New Roman"/>
                 <w:b w:val="false"/>
                 <w:bCs w:val="false"/>
                 <w:color w:val="000000"/>
@@ -819,7 +819,7 @@
             </w:pPr>
             <w:r>
               <w:rPr>
-                <w:rFonts w:ascii="Times New Roman" w:cs="Times New Roman" w:eastAsia="Songti SC" w:hAnsi="Times New Roman"/>
+                <w:rFonts w:ascii="Times New Roman" w:cs="Times New Roman" w:eastAsia="Noto Serif CJK SC" w:hAnsi="Times New Roman"/>
                 <w:b w:val="false"/>
                 <w:bCs w:val="false"/>
                 <w:color w:val="000000"/>
@@ -853,7 +853,7 @@
             </w:pPr>
             <w:r>
               <w:rPr>
-                <w:rFonts w:ascii="Times New Roman" w:cs="Times New Roman" w:eastAsia="Songti SC" w:hAnsi="Times New Roman"/>
+                <w:rFonts w:ascii="Times New Roman" w:cs="Times New Roman" w:eastAsia="Noto Serif CJK SC" w:hAnsi="Times New Roman"/>
                 <w:b w:val="false"/>
                 <w:bCs w:val="false"/>
                 <w:color w:val="000000"/>
@@ -889,7 +889,7 @@
             </w:pPr>
             <w:r>
               <w:rPr>
-                <w:rFonts w:ascii="Times New Roman" w:cs="Times New Roman" w:eastAsia="Songti SC" w:hAnsi="Times New Roman"/>
+                <w:rFonts w:ascii="Times New Roman" w:cs="Times New Roman" w:eastAsia="Noto Serif CJK SC" w:hAnsi="Times New Roman"/>
                 <w:b w:val="false"/>
                 <w:bCs w:val="false"/>
                 <w:color w:val="000000"/>
@@ -923,7 +923,7 @@
             </w:pPr>
             <w:r>
               <w:rPr>
-                <w:rFonts w:ascii="Times New Roman" w:cs="Times New Roman" w:eastAsia="Songti SC" w:hAnsi="Times New Roman"/>
+                <w:rFonts w:ascii="Times New Roman" w:cs="Times New Roman" w:eastAsia="Noto Serif CJK SC" w:hAnsi="Times New Roman"/>
                 <w:b w:val="false"/>
                 <w:bCs w:val="false"/>
                 <w:color w:val="000000"/>
@@ -959,7 +959,7 @@
             </w:pPr>
             <w:r>
               <w:rPr>
-                <w:rFonts w:ascii="Times New Roman" w:cs="Times New Roman" w:eastAsia="Songti SC" w:hAnsi="Times New Roman"/>
+                <w:rFonts w:ascii="Times New Roman" w:cs="Times New Roman" w:eastAsia="Noto Serif CJK SC" w:hAnsi="Times New Roman"/>
                 <w:b w:val="false"/>
                 <w:bCs w:val="false"/>
                 <w:color w:val="000000"/>
@@ -993,7 +993,7 @@
             </w:pPr>
             <w:r>
               <w:rPr>
-                <w:rFonts w:ascii="Times New Roman" w:cs="Times New Roman" w:eastAsia="Songti SC" w:hAnsi="Times New Roman"/>
+                <w:rFonts w:ascii="Times New Roman" w:cs="Times New Roman" w:eastAsia="Noto Serif CJK SC" w:hAnsi="Times New Roman"/>
                 <w:b w:val="false"/>
                 <w:bCs w:val="false"/>
                 <w:color w:val="000000"/>
@@ -1029,7 +1029,7 @@
             </w:pPr>
             <w:r>
               <w:rPr>
-                <w:rFonts w:ascii="Times New Roman" w:cs="Times New Roman" w:eastAsia="Songti SC" w:hAnsi="Times New Roman"/>
+                <w:rFonts w:ascii="Times New Roman" w:cs="Times New Roman" w:eastAsia="Noto Serif CJK SC" w:hAnsi="Times New Roman"/>
                 <w:b w:val="false"/>
                 <w:bCs w:val="false"/>
                 <w:color w:val="000000"/>
@@ -1063,7 +1063,7 @@
             </w:pPr>
             <w:r>
               <w:rPr>
-                <w:rFonts w:ascii="Times New Roman" w:cs="Times New Roman" w:eastAsia="Songti SC" w:hAnsi="Times New Roman"/>
+                <w:rFonts w:ascii="Times New Roman" w:cs="Times New Roman" w:eastAsia="Noto Serif CJK SC" w:hAnsi="Times New Roman"/>
                 <w:b w:val="false"/>
                 <w:bCs w:val="false"/>
                 <w:color w:val="000000"/>
@@ -1307,7 +1307,7 @@
       </w:pPr>
       <w:r>
         <w:rPr>
-          <w:rFonts w:ascii="Times New Roman" w:cs="Times New Roman" w:eastAsia="PingFang SC" w:hAnsi="Times New Roman"/>
+          <w:rFonts w:ascii="Times New Roman" w:cs="Times New Roman" w:eastAsia="Noto Sans CJK SC" w:hAnsi="Times New Roman"/>
           <w:color w:val="333333"/>
           <w:sz w:val="18"/>
           <w:szCs w:val="18"/>
@@ -1368,7 +1368,7 @@
       </w:pPr>
       <w:r>
         <w:rPr>
-          <w:rFonts w:ascii="Times New Roman" w:cs="Times New Roman" w:eastAsia="PingFang SC" w:hAnsi="Times New Roman"/>
+          <w:rFonts w:ascii="Times New Roman" w:cs="Times New Roman" w:eastAsia="Noto Sans CJK SC" w:hAnsi="Times New Roman"/>
           <w:color w:val="333333"/>
           <w:sz w:val="18"/>
           <w:szCs w:val="18"/>
@@ -1429,7 +1429,7 @@
       </w:pPr>
       <w:r>
         <w:rPr>
-          <w:rFonts w:ascii="Times New Roman" w:cs="Times New Roman" w:eastAsia="PingFang SC" w:hAnsi="Times New Roman"/>
+          <w:rFonts w:ascii="Times New Roman" w:cs="Times New Roman" w:eastAsia="Noto Sans CJK SC" w:hAnsi="Times New Roman"/>
           <w:color w:val="333333"/>
           <w:sz w:val="18"/>
           <w:szCs w:val="18"/>
@@ -1463,7 +1463,7 @@
       </w:pPr>
       <w:r>
         <w:rPr>
-          <w:rFonts w:ascii="Courier New" w:cs="Courier New" w:eastAsia="Songti SC" w:hAnsi="Courier New"/>
+          <w:rFonts w:ascii="Courier New" w:cs="Courier New" w:eastAsia="Noto Serif CJK SC" w:hAnsi="Courier New"/>
           <w:color w:val="1A1A1A"/>
           <w:sz w:val="16"/>
           <w:szCs w:val="16"/>
@@ -1479,7 +1479,7 @@
       </w:pPr>
       <w:r>
         <w:rPr>
-          <w:rFonts w:ascii="Courier New" w:cs="Courier New" w:eastAsia="Songti SC" w:hAnsi="Courier New"/>
+          <w:rFonts w:ascii="Courier New" w:cs="Courier New" w:eastAsia="Noto Serif CJK SC" w:hAnsi="Courier New"/>
           <w:color w:val="1A1A1A"/>
           <w:sz w:val="16"/>
           <w:szCs w:val="16"/>
@@ -1495,7 +1495,7 @@
       </w:pPr>
       <w:r>
         <w:rPr>
-          <w:rFonts w:ascii="Courier New" w:cs="Courier New" w:eastAsia="Songti SC" w:hAnsi="Courier New"/>
+          <w:rFonts w:ascii="Courier New" w:cs="Courier New" w:eastAsia="Noto Serif CJK SC" w:hAnsi="Courier New"/>
           <w:color w:val="1A1A1A"/>
           <w:sz w:val="16"/>
           <w:szCs w:val="16"/>
@@ -1511,7 +1511,7 @@
       </w:pPr>
       <w:r>
         <w:rPr>
-          <w:rFonts w:ascii="Courier New" w:cs="Courier New" w:eastAsia="Songti SC" w:hAnsi="Courier New"/>
+          <w:rFonts w:ascii="Courier New" w:cs="Courier New" w:eastAsia="Noto Serif CJK SC" w:hAnsi="Courier New"/>
           <w:color w:val="1A1A1A"/>
           <w:sz w:val="16"/>
           <w:szCs w:val="16"/>
@@ -1527,7 +1527,7 @@
       </w:pPr>
       <w:r>
         <w:rPr>
-          <w:rFonts w:ascii="Courier New" w:cs="Courier New" w:eastAsia="Songti SC" w:hAnsi="Courier New"/>
+          <w:rFonts w:ascii="Courier New" w:cs="Courier New" w:eastAsia="Noto Serif CJK SC" w:hAnsi="Courier New"/>
           <w:color w:val="1A1A1A"/>
           <w:sz w:val="16"/>
           <w:szCs w:val="16"/>
@@ -1543,7 +1543,7 @@
       </w:pPr>
       <w:r>
         <w:rPr>
-          <w:rFonts w:ascii="Courier New" w:cs="Courier New" w:eastAsia="Songti SC" w:hAnsi="Courier New"/>
+          <w:rFonts w:ascii="Courier New" w:cs="Courier New" w:eastAsia="Noto Serif CJK SC" w:hAnsi="Courier New"/>
           <w:color w:val="1A1A1A"/>
           <w:sz w:val="16"/>
           <w:szCs w:val="16"/>
@@ -1603,7 +1603,7 @@
       </w:pPr>
       <w:r>
         <w:rPr>
-          <w:rFonts w:ascii="Times New Roman" w:cs="Times New Roman" w:eastAsia="PingFang SC" w:hAnsi="Times New Roman"/>
+          <w:rFonts w:ascii="Times New Roman" w:cs="Times New Roman" w:eastAsia="Noto Sans CJK SC" w:hAnsi="Times New Roman"/>
           <w:color w:val="333333"/>
           <w:sz w:val="18"/>
           <w:szCs w:val="18"/>
@@ -1656,7 +1656,7 @@
             </w:pPr>
             <w:r>
               <w:rPr>
-                <w:rFonts w:ascii="Times New Roman" w:cs="Times New Roman" w:eastAsia="Songti SC" w:hAnsi="Times New Roman"/>
+                <w:rFonts w:ascii="Times New Roman" w:cs="Times New Roman" w:eastAsia="Noto Serif CJK SC" w:hAnsi="Times New Roman"/>
                 <w:b/>
                 <w:bCs/>
                 <w:color w:val="FFFFFF"/>
@@ -1690,7 +1690,7 @@
             </w:pPr>
             <w:r>
               <w:rPr>
-                <w:rFonts w:ascii="Times New Roman" w:cs="Times New Roman" w:eastAsia="Songti SC" w:hAnsi="Times New Roman"/>
+                <w:rFonts w:ascii="Times New Roman" w:cs="Times New Roman" w:eastAsia="Noto Serif CJK SC" w:hAnsi="Times New Roman"/>
                 <w:b/>
                 <w:bCs/>
                 <w:color w:val="FFFFFF"/>
@@ -1724,7 +1724,7 @@
             </w:pPr>
             <w:r>
               <w:rPr>
-                <w:rFonts w:ascii="Times New Roman" w:cs="Times New Roman" w:eastAsia="Songti SC" w:hAnsi="Times New Roman"/>
+                <w:rFonts w:ascii="Times New Roman" w:cs="Times New Roman" w:eastAsia="Noto Serif CJK SC" w:hAnsi="Times New Roman"/>
                 <w:b/>
                 <w:bCs/>
                 <w:color w:val="FFFFFF"/>
@@ -1758,7 +1758,7 @@
             </w:pPr>
             <w:r>
               <w:rPr>
-                <w:rFonts w:ascii="Times New Roman" w:cs="Times New Roman" w:eastAsia="Songti SC" w:hAnsi="Times New Roman"/>
+                <w:rFonts w:ascii="Times New Roman" w:cs="Times New Roman" w:eastAsia="Noto Serif CJK SC" w:hAnsi="Times New Roman"/>
                 <w:b/>
                 <w:bCs/>
                 <w:color w:val="FFFFFF"/>
@@ -1794,7 +1794,7 @@
             </w:pPr>
             <w:r>
               <w:rPr>
-                <w:rFonts w:ascii="Times New Roman" w:cs="Times New Roman" w:eastAsia="Songti SC" w:hAnsi="Times New Roman"/>
+                <w:rFonts w:ascii="Times New Roman" w:cs="Times New Roman" w:eastAsia="Noto Serif CJK SC" w:hAnsi="Times New Roman"/>
                 <w:b w:val="false"/>
                 <w:bCs w:val="false"/>
                 <w:color w:val="000000"/>
@@ -1828,7 +1828,7 @@
             </w:pPr>
             <w:r>
               <w:rPr>
-                <w:rFonts w:ascii="Times New Roman" w:cs="Times New Roman" w:eastAsia="Songti SC" w:hAnsi="Times New Roman"/>
+                <w:rFonts w:ascii="Times New Roman" w:cs="Times New Roman" w:eastAsia="Noto Serif CJK SC" w:hAnsi="Times New Roman"/>
                 <w:b w:val="false"/>
                 <w:bCs w:val="false"/>
                 <w:color w:val="000000"/>
@@ -1862,7 +1862,7 @@
             </w:pPr>
             <w:r>
               <w:rPr>
-                <w:rFonts w:ascii="Times New Roman" w:cs="Times New Roman" w:eastAsia="Songti SC" w:hAnsi="Times New Roman"/>
+                <w:rFonts w:ascii="Times New Roman" w:cs="Times New Roman" w:eastAsia="Noto Serif CJK SC" w:hAnsi="Times New Roman"/>
                 <w:b w:val="false"/>
                 <w:bCs w:val="false"/>
                 <w:color w:val="000000"/>
@@ -1896,7 +1896,7 @@
             </w:pPr>
             <w:r>
               <w:rPr>
-                <w:rFonts w:ascii="Times New Roman" w:cs="Times New Roman" w:eastAsia="Songti SC" w:hAnsi="Times New Roman"/>
+                <w:rFonts w:ascii="Times New Roman" w:cs="Times New Roman" w:eastAsia="Noto Serif CJK SC" w:hAnsi="Times New Roman"/>
                 <w:b w:val="false"/>
                 <w:bCs w:val="false"/>
                 <w:color w:val="000000"/>
@@ -1932,7 +1932,7 @@
             </w:pPr>
             <w:r>
               <w:rPr>
-                <w:rFonts w:ascii="Times New Roman" w:cs="Times New Roman" w:eastAsia="Songti SC" w:hAnsi="Times New Roman"/>
+                <w:rFonts w:ascii="Times New Roman" w:cs="Times New Roman" w:eastAsia="Noto Serif CJK SC" w:hAnsi="Times New Roman"/>
                 <w:b w:val="false"/>
                 <w:bCs w:val="false"/>
                 <w:color w:val="000000"/>
@@ -1966,7 +1966,7 @@
             </w:pPr>
             <w:r>
               <w:rPr>
-                <w:rFonts w:ascii="Times New Roman" w:cs="Times New Roman" w:eastAsia="Songti SC" w:hAnsi="Times New Roman"/>
+                <w:rFonts w:ascii="Times New Roman" w:cs="Times New Roman" w:eastAsia="Noto Serif CJK SC" w:hAnsi="Times New Roman"/>
                 <w:b w:val="false"/>
                 <w:bCs w:val="false"/>
                 <w:color w:val="000000"/>
@@ -2000,7 +2000,7 @@
             </w:pPr>
             <w:r>
               <w:rPr>
-                <w:rFonts w:ascii="Times New Roman" w:cs="Times New Roman" w:eastAsia="Songti SC" w:hAnsi="Times New Roman"/>
+                <w:rFonts w:ascii="Times New Roman" w:cs="Times New Roman" w:eastAsia="Noto Serif CJK SC" w:hAnsi="Times New Roman"/>
                 <w:b w:val="false"/>
                 <w:bCs w:val="false"/>
                 <w:color w:val="000000"/>
@@ -2034,7 +2034,7 @@
             </w:pPr>
             <w:r>
               <w:rPr>
-                <w:rFonts w:ascii="Times New Roman" w:cs="Times New Roman" w:eastAsia="Songti SC" w:hAnsi="Times New Roman"/>
+                <w:rFonts w:ascii="Times New Roman" w:cs="Times New Roman" w:eastAsia="Noto Serif CJK SC" w:hAnsi="Times New Roman"/>
                 <w:b w:val="false"/>
                 <w:bCs w:val="false"/>
                 <w:color w:val="000000"/>
@@ -2070,7 +2070,7 @@
             </w:pPr>
             <w:r>
               <w:rPr>
-                <w:rFonts w:ascii="Times New Roman" w:cs="Times New Roman" w:eastAsia="Songti SC" w:hAnsi="Times New Roman"/>
+                <w:rFonts w:ascii="Times New Roman" w:cs="Times New Roman" w:eastAsia="Noto Serif CJK SC" w:hAnsi="Times New Roman"/>
                 <w:b w:val="false"/>
                 <w:bCs w:val="false"/>
                 <w:color w:val="000000"/>
@@ -2104,7 +2104,7 @@
             </w:pPr>
             <w:r>
               <w:rPr>
-                <w:rFonts w:ascii="Times New Roman" w:cs="Times New Roman" w:eastAsia="Songti SC" w:hAnsi="Times New Roman"/>
+                <w:rFonts w:ascii="Times New Roman" w:cs="Times New Roman" w:eastAsia="Noto Serif CJK SC" w:hAnsi="Times New Roman"/>
                 <w:b w:val="false"/>
                 <w:bCs w:val="false"/>
                 <w:color w:val="000000"/>
@@ -2138,7 +2138,7 @@
             </w:pPr>
             <w:r>
               <w:rPr>
-                <w:rFonts w:ascii="Times New Roman" w:cs="Times New Roman" w:eastAsia="Songti SC" w:hAnsi="Times New Roman"/>
+                <w:rFonts w:ascii="Times New Roman" w:cs="Times New Roman" w:eastAsia="Noto Serif CJK SC" w:hAnsi="Times New Roman"/>
                 <w:b w:val="false"/>
                 <w:bCs w:val="false"/>
                 <w:color w:val="000000"/>
@@ -2172,7 +2172,7 @@
             </w:pPr>
             <w:r>
               <w:rPr>
-                <w:rFonts w:ascii="Times New Roman" w:cs="Times New Roman" w:eastAsia="Songti SC" w:hAnsi="Times New Roman"/>
+                <w:rFonts w:ascii="Times New Roman" w:cs="Times New Roman" w:eastAsia="Noto Serif CJK SC" w:hAnsi="Times New Roman"/>
                 <w:b w:val="false"/>
                 <w:bCs w:val="false"/>
                 <w:color w:val="000000"/>
@@ -2208,7 +2208,7 @@
             </w:pPr>
             <w:r>
               <w:rPr>
-                <w:rFonts w:ascii="Times New Roman" w:cs="Times New Roman" w:eastAsia="Songti SC" w:hAnsi="Times New Roman"/>
+                <w:rFonts w:ascii="Times New Roman" w:cs="Times New Roman" w:eastAsia="Noto Serif CJK SC" w:hAnsi="Times New Roman"/>
                 <w:b w:val="false"/>
                 <w:bCs w:val="false"/>
                 <w:color w:val="000000"/>
@@ -2242,7 +2242,7 @@
             </w:pPr>
             <w:r>
               <w:rPr>
-                <w:rFonts w:ascii="Times New Roman" w:cs="Times New Roman" w:eastAsia="Songti SC" w:hAnsi="Times New Roman"/>
+                <w:rFonts w:ascii="Times New Roman" w:cs="Times New Roman" w:eastAsia="Noto Serif CJK SC" w:hAnsi="Times New Roman"/>
                 <w:b w:val="false"/>
                 <w:bCs w:val="false"/>
                 <w:color w:val="000000"/>
@@ -2276,7 +2276,7 @@
             </w:pPr>
             <w:r>
               <w:rPr>
-                <w:rFonts w:ascii="Times New Roman" w:cs="Times New Roman" w:eastAsia="Songti SC" w:hAnsi="Times New Roman"/>
+                <w:rFonts w:ascii="Times New Roman" w:cs="Times New Roman" w:eastAsia="Noto Serif CJK SC" w:hAnsi="Times New Roman"/>
                 <w:b w:val="false"/>
                 <w:bCs w:val="false"/>
                 <w:color w:val="000000"/>
@@ -2310,7 +2310,7 @@
             </w:pPr>
             <w:r>
               <w:rPr>
-                <w:rFonts w:ascii="Times New Roman" w:cs="Times New Roman" w:eastAsia="Songti SC" w:hAnsi="Times New Roman"/>
+                <w:rFonts w:ascii="Times New Roman" w:cs="Times New Roman" w:eastAsia="Noto Serif CJK SC" w:hAnsi="Times New Roman"/>
                 <w:b w:val="false"/>
                 <w:bCs w:val="false"/>
                 <w:color w:val="000000"/>
@@ -2346,7 +2346,7 @@
             </w:pPr>
             <w:r>
               <w:rPr>
-                <w:rFonts w:ascii="Times New Roman" w:cs="Times New Roman" w:eastAsia="Songti SC" w:hAnsi="Times New Roman"/>
+                <w:rFonts w:ascii="Times New Roman" w:cs="Times New Roman" w:eastAsia="Noto Serif CJK SC" w:hAnsi="Times New Roman"/>
                 <w:b w:val="false"/>
                 <w:bCs w:val="false"/>
                 <w:color w:val="000000"/>
@@ -2380,7 +2380,7 @@
             </w:pPr>
             <w:r>
               <w:rPr>
-                <w:rFonts w:ascii="Times New Roman" w:cs="Times New Roman" w:eastAsia="Songti SC" w:hAnsi="Times New Roman"/>
+                <w:rFonts w:ascii="Times New Roman" w:cs="Times New Roman" w:eastAsia="Noto Serif CJK SC" w:hAnsi="Times New Roman"/>
                 <w:b w:val="false"/>
                 <w:bCs w:val="false"/>
                 <w:color w:val="000000"/>
@@ -2414,7 +2414,7 @@
             </w:pPr>
             <w:r>
               <w:rPr>
-                <w:rFonts w:ascii="Times New Roman" w:cs="Times New Roman" w:eastAsia="Songti SC" w:hAnsi="Times New Roman"/>
+                <w:rFonts w:ascii="Times New Roman" w:cs="Times New Roman" w:eastAsia="Noto Serif CJK SC" w:hAnsi="Times New Roman"/>
                 <w:b w:val="false"/>
                 <w:bCs w:val="false"/>
                 <w:color w:val="000000"/>
@@ -2448,7 +2448,7 @@
             </w:pPr>
             <w:r>
               <w:rPr>
-                <w:rFonts w:ascii="Times New Roman" w:cs="Times New Roman" w:eastAsia="Songti SC" w:hAnsi="Times New Roman"/>
+                <w:rFonts w:ascii="Times New Roman" w:cs="Times New Roman" w:eastAsia="Noto Serif CJK SC" w:hAnsi="Times New Roman"/>
                 <w:b w:val="false"/>
                 <w:bCs w:val="false"/>
                 <w:color w:val="000000"/>
@@ -2484,7 +2484,7 @@
             </w:pPr>
             <w:r>
               <w:rPr>
-                <w:rFonts w:ascii="Times New Roman" w:cs="Times New Roman" w:eastAsia="Songti SC" w:hAnsi="Times New Roman"/>
+                <w:rFonts w:ascii="Times New Roman" w:cs="Times New Roman" w:eastAsia="Noto Serif CJK SC" w:hAnsi="Times New Roman"/>
                 <w:b w:val="false"/>
                 <w:bCs w:val="false"/>
                 <w:color w:val="000000"/>
@@ -2518,7 +2518,7 @@
             </w:pPr>
             <w:r>
               <w:rPr>
-                <w:rFonts w:ascii="Times New Roman" w:cs="Times New Roman" w:eastAsia="Songti SC" w:hAnsi="Times New Roman"/>
+                <w:rFonts w:ascii="Times New Roman" w:cs="Times New Roman" w:eastAsia="Noto Serif CJK SC" w:hAnsi="Times New Roman"/>
                 <w:b w:val="false"/>
                 <w:bCs w:val="false"/>
                 <w:color w:val="000000"/>
@@ -2552,7 +2552,7 @@
             </w:pPr>
             <w:r>
               <w:rPr>
-                <w:rFonts w:ascii="Times New Roman" w:cs="Times New Roman" w:eastAsia="Songti SC" w:hAnsi="Times New Roman"/>
+                <w:rFonts w:ascii="Times New Roman" w:cs="Times New Roman" w:eastAsia="Noto Serif CJK SC" w:hAnsi="Times New Roman"/>
                 <w:b w:val="false"/>
                 <w:bCs w:val="false"/>
                 <w:color w:val="000000"/>
@@ -2586,7 +2586,7 @@
             </w:pPr>
             <w:r>
               <w:rPr>
-                <w:rFonts w:ascii="Times New Roman" w:cs="Times New Roman" w:eastAsia="Songti SC" w:hAnsi="Times New Roman"/>
+                <w:rFonts w:ascii="Times New Roman" w:cs="Times New Roman" w:eastAsia="Noto Serif CJK SC" w:hAnsi="Times New Roman"/>
                 <w:b w:val="false"/>
                 <w:bCs w:val="false"/>
                 <w:color w:val="000000"/>
@@ -2622,7 +2622,7 @@
             </w:pPr>
             <w:r>
               <w:rPr>
-                <w:rFonts w:ascii="Times New Roman" w:cs="Times New Roman" w:eastAsia="Songti SC" w:hAnsi="Times New Roman"/>
+                <w:rFonts w:ascii="Times New Roman" w:cs="Times New Roman" w:eastAsia="Noto Serif CJK SC" w:hAnsi="Times New Roman"/>
                 <w:b w:val="false"/>
                 <w:bCs w:val="false"/>
                 <w:color w:val="000000"/>
@@ -2656,7 +2656,7 @@
             </w:pPr>
             <w:r>
               <w:rPr>
-                <w:rFonts w:ascii="Times New Roman" w:cs="Times New Roman" w:eastAsia="Songti SC" w:hAnsi="Times New Roman"/>
+                <w:rFonts w:ascii="Times New Roman" w:cs="Times New Roman" w:eastAsia="Noto Serif CJK SC" w:hAnsi="Times New Roman"/>
                 <w:b w:val="false"/>
                 <w:bCs w:val="false"/>
                 <w:color w:val="000000"/>
@@ -2690,7 +2690,7 @@
             </w:pPr>
             <w:r>
               <w:rPr>
-                <w:rFonts w:ascii="Times New Roman" w:cs="Times New Roman" w:eastAsia="Songti SC" w:hAnsi="Times New Roman"/>
+                <w:rFonts w:ascii="Times New Roman" w:cs="Times New Roman" w:eastAsia="Noto Serif CJK SC" w:hAnsi="Times New Roman"/>
                 <w:b w:val="false"/>
                 <w:bCs w:val="false"/>
                 <w:color w:val="000000"/>
@@ -2724,7 +2724,7 @@
             </w:pPr>
             <w:r>
               <w:rPr>
-                <w:rFonts w:ascii="Times New Roman" w:cs="Times New Roman" w:eastAsia="Songti SC" w:hAnsi="Times New Roman"/>
+                <w:rFonts w:ascii="Times New Roman" w:cs="Times New Roman" w:eastAsia="Noto Serif CJK SC" w:hAnsi="Times New Roman"/>
                 <w:b w:val="false"/>
                 <w:bCs w:val="false"/>
                 <w:color w:val="000000"/>
@@ -2760,7 +2760,7 @@
             </w:pPr>
             <w:r>
               <w:rPr>
-                <w:rFonts w:ascii="Times New Roman" w:cs="Times New Roman" w:eastAsia="Songti SC" w:hAnsi="Times New Roman"/>
+                <w:rFonts w:ascii="Times New Roman" w:cs="Times New Roman" w:eastAsia="Noto Serif CJK SC" w:hAnsi="Times New Roman"/>
                 <w:b w:val="false"/>
                 <w:bCs w:val="false"/>
                 <w:color w:val="000000"/>
@@ -2794,7 +2794,7 @@
             </w:pPr>
             <w:r>
               <w:rPr>
-                <w:rFonts w:ascii="Times New Roman" w:cs="Times New Roman" w:eastAsia="Songti SC" w:hAnsi="Times New Roman"/>
+                <w:rFonts w:ascii="Times New Roman" w:cs="Times New Roman" w:eastAsia="Noto Serif CJK SC" w:hAnsi="Times New Roman"/>
                 <w:b w:val="false"/>
                 <w:bCs w:val="false"/>
                 <w:color w:val="000000"/>
@@ -2828,7 +2828,7 @@
             </w:pPr>
             <w:r>
               <w:rPr>
-                <w:rFonts w:ascii="Times New Roman" w:cs="Times New Roman" w:eastAsia="Songti SC" w:hAnsi="Times New Roman"/>
+                <w:rFonts w:ascii="Times New Roman" w:cs="Times New Roman" w:eastAsia="Noto Serif CJK SC" w:hAnsi="Times New Roman"/>
                 <w:b w:val="false"/>
                 <w:bCs w:val="false"/>
                 <w:color w:val="000000"/>
@@ -2862,7 +2862,7 @@
             </w:pPr>
             <w:r>
               <w:rPr>
-                <w:rFonts w:ascii="Times New Roman" w:cs="Times New Roman" w:eastAsia="Songti SC" w:hAnsi="Times New Roman"/>
+                <w:rFonts w:ascii="Times New Roman" w:cs="Times New Roman" w:eastAsia="Noto Serif CJK SC" w:hAnsi="Times New Roman"/>
                 <w:b w:val="false"/>
                 <w:bCs w:val="false"/>
                 <w:color w:val="000000"/>
@@ -2937,7 +2937,7 @@
       </w:pPr>
       <w:r>
         <w:rPr>
-          <w:rFonts w:ascii="Times New Roman" w:cs="Times New Roman" w:eastAsia="PingFang SC" w:hAnsi="Times New Roman"/>
+          <w:rFonts w:ascii="Times New Roman" w:cs="Times New Roman" w:eastAsia="Noto Sans CJK SC" w:hAnsi="Times New Roman"/>
           <w:color w:val="333333"/>
           <w:sz w:val="18"/>
           <w:szCs w:val="18"/>
@@ -2998,7 +2998,7 @@
       </w:pPr>
       <w:r>
         <w:rPr>
-          <w:rFonts w:ascii="Times New Roman" w:cs="Times New Roman" w:eastAsia="PingFang SC" w:hAnsi="Times New Roman"/>
+          <w:rFonts w:ascii="Times New Roman" w:cs="Times New Roman" w:eastAsia="Noto Sans CJK SC" w:hAnsi="Times New Roman"/>
           <w:color w:val="333333"/>
           <w:sz w:val="18"/>
           <w:szCs w:val="18"/>
@@ -3077,7 +3077,7 @@
       </w:pPr>
       <w:r>
         <w:rPr>
-          <w:rFonts w:ascii="Times New Roman" w:cs="Times New Roman" w:eastAsia="PingFang SC" w:hAnsi="Times New Roman"/>
+          <w:rFonts w:ascii="Times New Roman" w:cs="Times New Roman" w:eastAsia="Noto Sans CJK SC" w:hAnsi="Times New Roman"/>
           <w:color w:val="333333"/>
           <w:sz w:val="18"/>
           <w:szCs w:val="18"/>
@@ -3138,7 +3138,7 @@
       </w:pPr>
       <w:r>
         <w:rPr>
-          <w:rFonts w:ascii="Times New Roman" w:cs="Times New Roman" w:eastAsia="PingFang SC" w:hAnsi="Times New Roman"/>
+          <w:rFonts w:ascii="Times New Roman" w:cs="Times New Roman" w:eastAsia="Noto Sans CJK SC" w:hAnsi="Times New Roman"/>
           <w:color w:val="333333"/>
           <w:sz w:val="18"/>
           <w:szCs w:val="18"/>
@@ -3217,7 +3217,7 @@
       </w:pPr>
       <w:r>
         <w:rPr>
-          <w:rFonts w:ascii="Times New Roman" w:cs="Times New Roman" w:eastAsia="PingFang SC" w:hAnsi="Times New Roman"/>
+          <w:rFonts w:ascii="Times New Roman" w:cs="Times New Roman" w:eastAsia="Noto Sans CJK SC" w:hAnsi="Times New Roman"/>
           <w:color w:val="333333"/>
           <w:sz w:val="18"/>
           <w:szCs w:val="18"/>
@@ -3278,7 +3278,7 @@
       </w:pPr>
       <w:r>
         <w:rPr>
-          <w:rFonts w:ascii="Times New Roman" w:cs="Times New Roman" w:eastAsia="PingFang SC" w:hAnsi="Times New Roman"/>
+          <w:rFonts w:ascii="Times New Roman" w:cs="Times New Roman" w:eastAsia="Noto Sans CJK SC" w:hAnsi="Times New Roman"/>
           <w:color w:val="333333"/>
           <w:sz w:val="18"/>
           <w:szCs w:val="18"/>
@@ -3339,7 +3339,7 @@
       </w:pPr>
       <w:r>
         <w:rPr>
-          <w:rFonts w:ascii="Times New Roman" w:cs="Times New Roman" w:eastAsia="PingFang SC" w:hAnsi="Times New Roman"/>
+          <w:rFonts w:ascii="Times New Roman" w:cs="Times New Roman" w:eastAsia="Noto Sans CJK SC" w:hAnsi="Times New Roman"/>
           <w:color w:val="333333"/>
           <w:sz w:val="18"/>
           <w:szCs w:val="18"/>
@@ -3418,7 +3418,7 @@
       </w:pPr>
       <w:r>
         <w:rPr>
-          <w:rFonts w:ascii="Times New Roman" w:cs="Times New Roman" w:eastAsia="PingFang SC" w:hAnsi="Times New Roman"/>
+          <w:rFonts w:ascii="Times New Roman" w:cs="Times New Roman" w:eastAsia="Noto Sans CJK SC" w:hAnsi="Times New Roman"/>
           <w:color w:val="333333"/>
           <w:sz w:val="18"/>
           <w:szCs w:val="18"/>
@@ -3479,7 +3479,7 @@
       </w:pPr>
       <w:r>
         <w:rPr>
-          <w:rFonts w:ascii="Times New Roman" w:cs="Times New Roman" w:eastAsia="PingFang SC" w:hAnsi="Times New Roman"/>
+          <w:rFonts w:ascii="Times New Roman" w:cs="Times New Roman" w:eastAsia="Noto Sans CJK SC" w:hAnsi="Times New Roman"/>
           <w:color w:val="333333"/>
           <w:sz w:val="18"/>
           <w:szCs w:val="18"/>
@@ -3558,7 +3558,7 @@
       </w:pPr>
       <w:r>
         <w:rPr>
-          <w:rFonts w:ascii="Times New Roman" w:cs="Times New Roman" w:eastAsia="PingFang SC" w:hAnsi="Times New Roman"/>
+          <w:rFonts w:ascii="Times New Roman" w:cs="Times New Roman" w:eastAsia="Noto Sans CJK SC" w:hAnsi="Times New Roman"/>
           <w:color w:val="333333"/>
           <w:sz w:val="18"/>
           <w:szCs w:val="18"/>
@@ -3619,7 +3619,7 @@
       </w:pPr>
       <w:r>
         <w:rPr>
-          <w:rFonts w:ascii="Times New Roman" w:cs="Times New Roman" w:eastAsia="PingFang SC" w:hAnsi="Times New Roman"/>
+          <w:rFonts w:ascii="Times New Roman" w:cs="Times New Roman" w:eastAsia="Noto Sans CJK SC" w:hAnsi="Times New Roman"/>
           <w:color w:val="333333"/>
           <w:sz w:val="18"/>
           <w:szCs w:val="18"/>
@@ -3652,7 +3652,7 @@
       </w:pPr>
       <w:r>
         <w:rPr>
-          <w:rFonts w:ascii="Times New Roman" w:cs="Times New Roman" w:eastAsia="PingFang SC" w:hAnsi="Times New Roman"/>
+          <w:rFonts w:ascii="Times New Roman" w:cs="Times New Roman" w:eastAsia="Noto Sans CJK SC" w:hAnsi="Times New Roman"/>
           <w:color w:val="333333"/>
           <w:sz w:val="18"/>
           <w:szCs w:val="18"/>
@@ -3705,7 +3705,7 @@
             </w:pPr>
             <w:r>
               <w:rPr>
-                <w:rFonts w:ascii="Times New Roman" w:cs="Times New Roman" w:eastAsia="Songti SC" w:hAnsi="Times New Roman"/>
+                <w:rFonts w:ascii="Times New Roman" w:cs="Times New Roman" w:eastAsia="Noto Serif CJK SC" w:hAnsi="Times New Roman"/>
                 <w:b/>
                 <w:bCs/>
                 <w:color w:val="FFFFFF"/>
@@ -3739,7 +3739,7 @@
             </w:pPr>
             <w:r>
               <w:rPr>
-                <w:rFonts w:ascii="Times New Roman" w:cs="Times New Roman" w:eastAsia="Songti SC" w:hAnsi="Times New Roman"/>
+                <w:rFonts w:ascii="Times New Roman" w:cs="Times New Roman" w:eastAsia="Noto Serif CJK SC" w:hAnsi="Times New Roman"/>
                 <w:b/>
                 <w:bCs/>
                 <w:color w:val="FFFFFF"/>
@@ -3773,7 +3773,7 @@
             </w:pPr>
             <w:r>
               <w:rPr>
-                <w:rFonts w:ascii="Times New Roman" w:cs="Times New Roman" w:eastAsia="Songti SC" w:hAnsi="Times New Roman"/>
+                <w:rFonts w:ascii="Times New Roman" w:cs="Times New Roman" w:eastAsia="Noto Serif CJK SC" w:hAnsi="Times New Roman"/>
                 <w:b/>
                 <w:bCs/>
                 <w:color w:val="FFFFFF"/>
@@ -3807,7 +3807,7 @@
             </w:pPr>
             <w:r>
               <w:rPr>
-                <w:rFonts w:ascii="Times New Roman" w:cs="Times New Roman" w:eastAsia="Songti SC" w:hAnsi="Times New Roman"/>
+                <w:rFonts w:ascii="Times New Roman" w:cs="Times New Roman" w:eastAsia="Noto Serif CJK SC" w:hAnsi="Times New Roman"/>
                 <w:b/>
                 <w:bCs/>
                 <w:color w:val="FFFFFF"/>
@@ -3843,7 +3843,7 @@
             </w:pPr>
             <w:r>
               <w:rPr>
-                <w:rFonts w:ascii="Times New Roman" w:cs="Times New Roman" w:eastAsia="Songti SC" w:hAnsi="Times New Roman"/>
+                <w:rFonts w:ascii="Times New Roman" w:cs="Times New Roman" w:eastAsia="Noto Serif CJK SC" w:hAnsi="Times New Roman"/>
                 <w:b w:val="false"/>
                 <w:bCs w:val="false"/>
                 <w:color w:val="000000"/>
@@ -3877,7 +3877,7 @@
             </w:pPr>
             <w:r>
               <w:rPr>
-                <w:rFonts w:ascii="Times New Roman" w:cs="Times New Roman" w:eastAsia="Songti SC" w:hAnsi="Times New Roman"/>
+                <w:rFonts w:ascii="Times New Roman" w:cs="Times New Roman" w:eastAsia="Noto Serif CJK SC" w:hAnsi="Times New Roman"/>
                 <w:b w:val="false"/>
                 <w:bCs w:val="false"/>
                 <w:color w:val="000000"/>
@@ -3911,7 +3911,7 @@
             </w:pPr>
             <w:r>
               <w:rPr>
-                <w:rFonts w:ascii="Times New Roman" w:cs="Times New Roman" w:eastAsia="Songti SC" w:hAnsi="Times New Roman"/>
+                <w:rFonts w:ascii="Times New Roman" w:cs="Times New Roman" w:eastAsia="Noto Serif CJK SC" w:hAnsi="Times New Roman"/>
                 <w:b w:val="false"/>
                 <w:bCs w:val="false"/>
                 <w:color w:val="000000"/>
@@ -3945,7 +3945,7 @@
             </w:pPr>
             <w:r>
               <w:rPr>
-                <w:rFonts w:ascii="Times New Roman" w:cs="Times New Roman" w:eastAsia="Songti SC" w:hAnsi="Times New Roman"/>
+                <w:rFonts w:ascii="Times New Roman" w:cs="Times New Roman" w:eastAsia="Noto Serif CJK SC" w:hAnsi="Times New Roman"/>
                 <w:b w:val="false"/>
                 <w:bCs w:val="false"/>
                 <w:color w:val="000000"/>
@@ -3981,7 +3981,7 @@
             </w:pPr>
             <w:r>
               <w:rPr>
-                <w:rFonts w:ascii="Times New Roman" w:cs="Times New Roman" w:eastAsia="Songti SC" w:hAnsi="Times New Roman"/>
+                <w:rFonts w:ascii="Times New Roman" w:cs="Times New Roman" w:eastAsia="Noto Serif CJK SC" w:hAnsi="Times New Roman"/>
                 <w:b w:val="false"/>
                 <w:bCs w:val="false"/>
                 <w:color w:val="000000"/>
@@ -4015,7 +4015,7 @@
             </w:pPr>
             <w:r>
               <w:rPr>
-                <w:rFonts w:ascii="Times New Roman" w:cs="Times New Roman" w:eastAsia="Songti SC" w:hAnsi="Times New Roman"/>
+                <w:rFonts w:ascii="Times New Roman" w:cs="Times New Roman" w:eastAsia="Noto Serif CJK SC" w:hAnsi="Times New Roman"/>
                 <w:b w:val="false"/>
                 <w:bCs w:val="false"/>
                 <w:color w:val="000000"/>
@@ -4049,7 +4049,7 @@
             </w:pPr>
             <w:r>
               <w:rPr>
-                <w:rFonts w:ascii="Times New Roman" w:cs="Times New Roman" w:eastAsia="Songti SC" w:hAnsi="Times New Roman"/>
+                <w:rFonts w:ascii="Times New Roman" w:cs="Times New Roman" w:eastAsia="Noto Serif CJK SC" w:hAnsi="Times New Roman"/>
                 <w:b w:val="false"/>
                 <w:bCs w:val="false"/>
                 <w:color w:val="000000"/>
@@ -4083,7 +4083,7 @@
             </w:pPr>
             <w:r>
               <w:rPr>
-                <w:rFonts w:ascii="Times New Roman" w:cs="Times New Roman" w:eastAsia="Songti SC" w:hAnsi="Times New Roman"/>
+                <w:rFonts w:ascii="Times New Roman" w:cs="Times New Roman" w:eastAsia="Noto Serif CJK SC" w:hAnsi="Times New Roman"/>
                 <w:b w:val="false"/>
                 <w:bCs w:val="false"/>
                 <w:color w:val="000000"/>
@@ -4119,7 +4119,7 @@
             </w:pPr>
             <w:r>
               <w:rPr>
-                <w:rFonts w:ascii="Times New Roman" w:cs="Times New Roman" w:eastAsia="Songti SC" w:hAnsi="Times New Roman"/>
+                <w:rFonts w:ascii="Times New Roman" w:cs="Times New Roman" w:eastAsia="Noto Serif CJK SC" w:hAnsi="Times New Roman"/>
                 <w:b w:val="false"/>
                 <w:bCs w:val="false"/>
                 <w:color w:val="000000"/>
@@ -4153,7 +4153,7 @@
             </w:pPr>
             <w:r>
               <w:rPr>
-                <w:rFonts w:ascii="Times New Roman" w:cs="Times New Roman" w:eastAsia="Songti SC" w:hAnsi="Times New Roman"/>
+                <w:rFonts w:ascii="Times New Roman" w:cs="Times New Roman" w:eastAsia="Noto Serif CJK SC" w:hAnsi="Times New Roman"/>
                 <w:b w:val="false"/>
                 <w:bCs w:val="false"/>
                 <w:color w:val="000000"/>
@@ -4187,7 +4187,7 @@
             </w:pPr>
             <w:r>
               <w:rPr>
-                <w:rFonts w:ascii="Times New Roman" w:cs="Times New Roman" w:eastAsia="Songti SC" w:hAnsi="Times New Roman"/>
+                <w:rFonts w:ascii="Times New Roman" w:cs="Times New Roman" w:eastAsia="Noto Serif CJK SC" w:hAnsi="Times New Roman"/>
                 <w:b w:val="false"/>
                 <w:bCs w:val="false"/>
                 <w:color w:val="000000"/>
@@ -4221,7 +4221,7 @@
             </w:pPr>
             <w:r>
               <w:rPr>
-                <w:rFonts w:ascii="Times New Roman" w:cs="Times New Roman" w:eastAsia="Songti SC" w:hAnsi="Times New Roman"/>
+                <w:rFonts w:ascii="Times New Roman" w:cs="Times New Roman" w:eastAsia="Noto Serif CJK SC" w:hAnsi="Times New Roman"/>
                 <w:b w:val="false"/>
                 <w:bCs w:val="false"/>
                 <w:color w:val="000000"/>
@@ -4257,7 +4257,7 @@
             </w:pPr>
             <w:r>
               <w:rPr>
-                <w:rFonts w:ascii="Times New Roman" w:cs="Times New Roman" w:eastAsia="Songti SC" w:hAnsi="Times New Roman"/>
+                <w:rFonts w:ascii="Times New Roman" w:cs="Times New Roman" w:eastAsia="Noto Serif CJK SC" w:hAnsi="Times New Roman"/>
                 <w:b w:val="false"/>
                 <w:bCs w:val="false"/>
                 <w:color w:val="000000"/>
@@ -4291,7 +4291,7 @@
             </w:pPr>
             <w:r>
               <w:rPr>
-                <w:rFonts w:ascii="Times New Roman" w:cs="Times New Roman" w:eastAsia="Songti SC" w:hAnsi="Times New Roman"/>
+                <w:rFonts w:ascii="Times New Roman" w:cs="Times New Roman" w:eastAsia="Noto Serif CJK SC" w:hAnsi="Times New Roman"/>
                 <w:b w:val="false"/>
                 <w:bCs w:val="false"/>
                 <w:color w:val="000000"/>
@@ -4325,7 +4325,7 @@
             </w:pPr>
             <w:r>
               <w:rPr>
-                <w:rFonts w:ascii="Times New Roman" w:cs="Times New Roman" w:eastAsia="Songti SC" w:hAnsi="Times New Roman"/>
+                <w:rFonts w:ascii="Times New Roman" w:cs="Times New Roman" w:eastAsia="Noto Serif CJK SC" w:hAnsi="Times New Roman"/>
                 <w:b w:val="false"/>
                 <w:bCs w:val="false"/>
                 <w:color w:val="000000"/>
@@ -4359,7 +4359,7 @@
             </w:pPr>
             <w:r>
               <w:rPr>
-                <w:rFonts w:ascii="Times New Roman" w:cs="Times New Roman" w:eastAsia="Songti SC" w:hAnsi="Times New Roman"/>
+                <w:rFonts w:ascii="Times New Roman" w:cs="Times New Roman" w:eastAsia="Noto Serif CJK SC" w:hAnsi="Times New Roman"/>
                 <w:b w:val="false"/>
                 <w:bCs w:val="false"/>
                 <w:color w:val="000000"/>
@@ -4395,7 +4395,7 @@
             </w:pPr>
             <w:r>
               <w:rPr>
-                <w:rFonts w:ascii="Times New Roman" w:cs="Times New Roman" w:eastAsia="Songti SC" w:hAnsi="Times New Roman"/>
+                <w:rFonts w:ascii="Times New Roman" w:cs="Times New Roman" w:eastAsia="Noto Serif CJK SC" w:hAnsi="Times New Roman"/>
                 <w:b w:val="false"/>
                 <w:bCs w:val="false"/>
                 <w:color w:val="000000"/>
@@ -4429,7 +4429,7 @@
             </w:pPr>
             <w:r>
               <w:rPr>
-                <w:rFonts w:ascii="Times New Roman" w:cs="Times New Roman" w:eastAsia="Songti SC" w:hAnsi="Times New Roman"/>
+                <w:rFonts w:ascii="Times New Roman" w:cs="Times New Roman" w:eastAsia="Noto Serif CJK SC" w:hAnsi="Times New Roman"/>
                 <w:b w:val="false"/>
                 <w:bCs w:val="false"/>
                 <w:color w:val="000000"/>
@@ -4463,7 +4463,7 @@
             </w:pPr>
             <w:r>
               <w:rPr>
-                <w:rFonts w:ascii="Times New Roman" w:cs="Times New Roman" w:eastAsia="Songti SC" w:hAnsi="Times New Roman"/>
+                <w:rFonts w:ascii="Times New Roman" w:cs="Times New Roman" w:eastAsia="Noto Serif CJK SC" w:hAnsi="Times New Roman"/>
                 <w:b w:val="false"/>
                 <w:bCs w:val="false"/>
                 <w:color w:val="000000"/>
@@ -4497,7 +4497,7 @@
             </w:pPr>
             <w:r>
               <w:rPr>
-                <w:rFonts w:ascii="Times New Roman" w:cs="Times New Roman" w:eastAsia="Songti SC" w:hAnsi="Times New Roman"/>
+                <w:rFonts w:ascii="Times New Roman" w:cs="Times New Roman" w:eastAsia="Noto Serif CJK SC" w:hAnsi="Times New Roman"/>
                 <w:b w:val="false"/>
                 <w:bCs w:val="false"/>
                 <w:color w:val="000000"/>
@@ -4533,7 +4533,7 @@
             </w:pPr>
             <w:r>
               <w:rPr>
-                <w:rFonts w:ascii="Times New Roman" w:cs="Times New Roman" w:eastAsia="Songti SC" w:hAnsi="Times New Roman"/>
+                <w:rFonts w:ascii="Times New Roman" w:cs="Times New Roman" w:eastAsia="Noto Serif CJK SC" w:hAnsi="Times New Roman"/>
                 <w:b w:val="false"/>
                 <w:bCs w:val="false"/>
                 <w:color w:val="000000"/>
@@ -4567,7 +4567,7 @@
             </w:pPr>
             <w:r>
               <w:rPr>
-                <w:rFonts w:ascii="Times New Roman" w:cs="Times New Roman" w:eastAsia="Songti SC" w:hAnsi="Times New Roman"/>
+                <w:rFonts w:ascii="Times New Roman" w:cs="Times New Roman" w:eastAsia="Noto Serif CJK SC" w:hAnsi="Times New Roman"/>
                 <w:b w:val="false"/>
                 <w:bCs w:val="false"/>
                 <w:color w:val="000000"/>
@@ -4601,7 +4601,7 @@
             </w:pPr>
             <w:r>
               <w:rPr>
-                <w:rFonts w:ascii="Times New Roman" w:cs="Times New Roman" w:eastAsia="Songti SC" w:hAnsi="Times New Roman"/>
+                <w:rFonts w:ascii="Times New Roman" w:cs="Times New Roman" w:eastAsia="Noto Serif CJK SC" w:hAnsi="Times New Roman"/>
                 <w:b w:val="false"/>
                 <w:bCs w:val="false"/>
                 <w:color w:val="000000"/>
@@ -4635,7 +4635,7 @@
             </w:pPr>
             <w:r>
               <w:rPr>
-                <w:rFonts w:ascii="Times New Roman" w:cs="Times New Roman" w:eastAsia="Songti SC" w:hAnsi="Times New Roman"/>
+                <w:rFonts w:ascii="Times New Roman" w:cs="Times New Roman" w:eastAsia="Noto Serif CJK SC" w:hAnsi="Times New Roman"/>
                 <w:b w:val="false"/>
                 <w:bCs w:val="false"/>
                 <w:color w:val="000000"/>
@@ -4701,7 +4701,7 @@
       </w:pPr>
       <w:r>
         <w:rPr>
-          <w:rFonts w:ascii="Times New Roman" w:cs="Times New Roman" w:eastAsia="PingFang SC" w:hAnsi="Times New Roman"/>
+          <w:rFonts w:ascii="Times New Roman" w:cs="Times New Roman" w:eastAsia="Noto Sans CJK SC" w:hAnsi="Times New Roman"/>
           <w:color w:val="333333"/>
           <w:sz w:val="18"/>
           <w:szCs w:val="18"/>
@@ -4789,7 +4789,7 @@
       </w:pPr>
       <w:r>
         <w:rPr>
-          <w:rFonts w:ascii="Times New Roman" w:cs="Times New Roman" w:eastAsia="PingFang SC" w:hAnsi="Times New Roman"/>
+          <w:rFonts w:ascii="Times New Roman" w:cs="Times New Roman" w:eastAsia="Noto Sans CJK SC" w:hAnsi="Times New Roman"/>
           <w:color w:val="333333"/>
           <w:sz w:val="18"/>
           <w:szCs w:val="18"/>
@@ -4850,7 +4850,7 @@
       </w:pPr>
       <w:r>
         <w:rPr>
-          <w:rFonts w:ascii="Times New Roman" w:cs="Times New Roman" w:eastAsia="PingFang SC" w:hAnsi="Times New Roman"/>
+          <w:rFonts w:ascii="Times New Roman" w:cs="Times New Roman" w:eastAsia="Noto Sans CJK SC" w:hAnsi="Times New Roman"/>
           <w:color w:val="333333"/>
           <w:sz w:val="18"/>
           <w:szCs w:val="18"/>
@@ -4901,7 +4901,7 @@
       </w:pPr>
       <w:r>
         <w:rPr>
-          <w:rFonts w:ascii="Times New Roman" w:cs="Times New Roman" w:eastAsia="PingFang SC" w:hAnsi="Times New Roman"/>
+          <w:rFonts w:ascii="Times New Roman" w:cs="Times New Roman" w:eastAsia="Noto Sans CJK SC" w:hAnsi="Times New Roman"/>
           <w:color w:val="333333"/>
           <w:sz w:val="18"/>
           <w:szCs w:val="18"/>
@@ -4955,7 +4955,7 @@
             </w:pPr>
             <w:r>
               <w:rPr>
-                <w:rFonts w:ascii="Times New Roman" w:cs="Times New Roman" w:eastAsia="Songti SC" w:hAnsi="Times New Roman"/>
+                <w:rFonts w:ascii="Times New Roman" w:cs="Times New Roman" w:eastAsia="Noto Serif CJK SC" w:hAnsi="Times New Roman"/>
                 <w:b/>
                 <w:bCs/>
                 <w:color w:val="FFFFFF"/>
@@ -4989,7 +4989,7 @@
             </w:pPr>
             <w:r>
               <w:rPr>
-                <w:rFonts w:ascii="Times New Roman" w:cs="Times New Roman" w:eastAsia="Songti SC" w:hAnsi="Times New Roman"/>
+                <w:rFonts w:ascii="Times New Roman" w:cs="Times New Roman" w:eastAsia="Noto Serif CJK SC" w:hAnsi="Times New Roman"/>
                 <w:b/>
                 <w:bCs/>
                 <w:color w:val="FFFFFF"/>
@@ -5023,7 +5023,7 @@
             </w:pPr>
             <w:r>
               <w:rPr>
-                <w:rFonts w:ascii="Times New Roman" w:cs="Times New Roman" w:eastAsia="Songti SC" w:hAnsi="Times New Roman"/>
+                <w:rFonts w:ascii="Times New Roman" w:cs="Times New Roman" w:eastAsia="Noto Serif CJK SC" w:hAnsi="Times New Roman"/>
                 <w:b/>
                 <w:bCs/>
                 <w:color w:val="FFFFFF"/>
@@ -5057,7 +5057,7 @@
             </w:pPr>
             <w:r>
               <w:rPr>
-                <w:rFonts w:ascii="Times New Roman" w:cs="Times New Roman" w:eastAsia="Songti SC" w:hAnsi="Times New Roman"/>
+                <w:rFonts w:ascii="Times New Roman" w:cs="Times New Roman" w:eastAsia="Noto Serif CJK SC" w:hAnsi="Times New Roman"/>
                 <w:b/>
                 <w:bCs/>
                 <w:color w:val="FFFFFF"/>
@@ -5091,7 +5091,7 @@
             </w:pPr>
             <w:r>
               <w:rPr>
-                <w:rFonts w:ascii="Times New Roman" w:cs="Times New Roman" w:eastAsia="Songti SC" w:hAnsi="Times New Roman"/>
+                <w:rFonts w:ascii="Times New Roman" w:cs="Times New Roman" w:eastAsia="Noto Serif CJK SC" w:hAnsi="Times New Roman"/>
                 <w:b/>
                 <w:bCs/>
                 <w:color w:val="FFFFFF"/>
@@ -5127,7 +5127,7 @@
             </w:pPr>
             <w:r>
               <w:rPr>
-                <w:rFonts w:ascii="Times New Roman" w:cs="Times New Roman" w:eastAsia="Songti SC" w:hAnsi="Times New Roman"/>
+                <w:rFonts w:ascii="Times New Roman" w:cs="Times New Roman" w:eastAsia="Noto Serif CJK SC" w:hAnsi="Times New Roman"/>
                 <w:b w:val="false"/>
                 <w:bCs w:val="false"/>
                 <w:color w:val="000000"/>
@@ -5161,7 +5161,7 @@
             </w:pPr>
             <w:r>
               <w:rPr>
-                <w:rFonts w:ascii="Times New Roman" w:cs="Times New Roman" w:eastAsia="Songti SC" w:hAnsi="Times New Roman"/>
+                <w:rFonts w:ascii="Times New Roman" w:cs="Times New Roman" w:eastAsia="Noto Serif CJK SC" w:hAnsi="Times New Roman"/>
                 <w:b w:val="false"/>
                 <w:bCs w:val="false"/>
                 <w:color w:val="000000"/>
@@ -5195,7 +5195,7 @@
             </w:pPr>
             <w:r>
               <w:rPr>
-                <w:rFonts w:ascii="Times New Roman" w:cs="Times New Roman" w:eastAsia="Songti SC" w:hAnsi="Times New Roman"/>
+                <w:rFonts w:ascii="Times New Roman" w:cs="Times New Roman" w:eastAsia="Noto Serif CJK SC" w:hAnsi="Times New Roman"/>
                 <w:b w:val="false"/>
                 <w:bCs w:val="false"/>
                 <w:color w:val="000000"/>
@@ -5229,7 +5229,7 @@
             </w:pPr>
             <w:r>
               <w:rPr>
-                <w:rFonts w:ascii="Times New Roman" w:cs="Times New Roman" w:eastAsia="Songti SC" w:hAnsi="Times New Roman"/>
+                <w:rFonts w:ascii="Times New Roman" w:cs="Times New Roman" w:eastAsia="Noto Serif CJK SC" w:hAnsi="Times New Roman"/>
                 <w:b w:val="false"/>
                 <w:bCs w:val="false"/>
                 <w:color w:val="000000"/>
@@ -5263,7 +5263,7 @@
             </w:pPr>
             <w:r>
               <w:rPr>
-                <w:rFonts w:ascii="Times New Roman" w:cs="Times New Roman" w:eastAsia="Songti SC" w:hAnsi="Times New Roman"/>
+                <w:rFonts w:ascii="Times New Roman" w:cs="Times New Roman" w:eastAsia="Noto Serif CJK SC" w:hAnsi="Times New Roman"/>
                 <w:b w:val="false"/>
                 <w:bCs w:val="false"/>
                 <w:color w:val="000000"/>
@@ -5299,7 +5299,7 @@
             </w:pPr>
             <w:r>
               <w:rPr>
-                <w:rFonts w:ascii="Times New Roman" w:cs="Times New Roman" w:eastAsia="Songti SC" w:hAnsi="Times New Roman"/>
+                <w:rFonts w:ascii="Times New Roman" w:cs="Times New Roman" w:eastAsia="Noto Serif CJK SC" w:hAnsi="Times New Roman"/>
                 <w:b w:val="false"/>
                 <w:bCs w:val="false"/>
                 <w:color w:val="000000"/>
@@ -5333,7 +5333,7 @@
             </w:pPr>
             <w:r>
               <w:rPr>
-                <w:rFonts w:ascii="Times New Roman" w:cs="Times New Roman" w:eastAsia="Songti SC" w:hAnsi="Times New Roman"/>
+                <w:rFonts w:ascii="Times New Roman" w:cs="Times New Roman" w:eastAsia="Noto Serif CJK SC" w:hAnsi="Times New Roman"/>
                 <w:b w:val="false"/>
                 <w:bCs w:val="false"/>
                 <w:color w:val="000000"/>
@@ -5367,7 +5367,7 @@
             </w:pPr>
             <w:r>
               <w:rPr>
-                <w:rFonts w:ascii="Times New Roman" w:cs="Times New Roman" w:eastAsia="Songti SC" w:hAnsi="Times New Roman"/>
+                <w:rFonts w:ascii="Times New Roman" w:cs="Times New Roman" w:eastAsia="Noto Serif CJK SC" w:hAnsi="Times New Roman"/>
                 <w:b w:val="false"/>
                 <w:bCs w:val="false"/>
                 <w:color w:val="000000"/>
@@ -5401,7 +5401,7 @@
             </w:pPr>
             <w:r>
               <w:rPr>
-                <w:rFonts w:ascii="Times New Roman" w:cs="Times New Roman" w:eastAsia="Songti SC" w:hAnsi="Times New Roman"/>
+                <w:rFonts w:ascii="Times New Roman" w:cs="Times New Roman" w:eastAsia="Noto Serif CJK SC" w:hAnsi="Times New Roman"/>
                 <w:b w:val="false"/>
                 <w:bCs w:val="false"/>
                 <w:color w:val="000000"/>
@@ -5435,7 +5435,7 @@
             </w:pPr>
             <w:r>
               <w:rPr>
-                <w:rFonts w:ascii="Times New Roman" w:cs="Times New Roman" w:eastAsia="Songti SC" w:hAnsi="Times New Roman"/>
+                <w:rFonts w:ascii="Times New Roman" w:cs="Times New Roman" w:eastAsia="Noto Serif CJK SC" w:hAnsi="Times New Roman"/>
                 <w:b w:val="false"/>
                 <w:bCs w:val="false"/>
                 <w:color w:val="000000"/>
@@ -5471,7 +5471,7 @@
             </w:pPr>
             <w:r>
               <w:rPr>
-                <w:rFonts w:ascii="Times New Roman" w:cs="Times New Roman" w:eastAsia="Songti SC" w:hAnsi="Times New Roman"/>
+                <w:rFonts w:ascii="Times New Roman" w:cs="Times New Roman" w:eastAsia="Noto Serif CJK SC" w:hAnsi="Times New Roman"/>
                 <w:b w:val="false"/>
                 <w:bCs w:val="false"/>
                 <w:color w:val="000000"/>
@@ -5505,7 +5505,7 @@
             </w:pPr>
             <w:r>
               <w:rPr>
-                <w:rFonts w:ascii="Times New Roman" w:cs="Times New Roman" w:eastAsia="Songti SC" w:hAnsi="Times New Roman"/>
+                <w:rFonts w:ascii="Times New Roman" w:cs="Times New Roman" w:eastAsia="Noto Serif CJK SC" w:hAnsi="Times New Roman"/>
                 <w:b w:val="false"/>
                 <w:bCs w:val="false"/>
                 <w:color w:val="000000"/>
@@ -5539,7 +5539,7 @@
             </w:pPr>
             <w:r>
               <w:rPr>
-                <w:rFonts w:ascii="Times New Roman" w:cs="Times New Roman" w:eastAsia="Songti SC" w:hAnsi="Times New Roman"/>
+                <w:rFonts w:ascii="Times New Roman" w:cs="Times New Roman" w:eastAsia="Noto Serif CJK SC" w:hAnsi="Times New Roman"/>
                 <w:b w:val="false"/>
                 <w:bCs w:val="false"/>
                 <w:color w:val="000000"/>
@@ -5573,7 +5573,7 @@
             </w:pPr>
             <w:r>
               <w:rPr>
-                <w:rFonts w:ascii="Times New Roman" w:cs="Times New Roman" w:eastAsia="Songti SC" w:hAnsi="Times New Roman"/>
+                <w:rFonts w:ascii="Times New Roman" w:cs="Times New Roman" w:eastAsia="Noto Serif CJK SC" w:hAnsi="Times New Roman"/>
                 <w:b w:val="false"/>
                 <w:bCs w:val="false"/>
                 <w:color w:val="000000"/>
@@ -5607,7 +5607,7 @@
             </w:pPr>
             <w:r>
               <w:rPr>
-                <w:rFonts w:ascii="Times New Roman" w:cs="Times New Roman" w:eastAsia="Songti SC" w:hAnsi="Times New Roman"/>
+                <w:rFonts w:ascii="Times New Roman" w:cs="Times New Roman" w:eastAsia="Noto Serif CJK SC" w:hAnsi="Times New Roman"/>
                 <w:b w:val="false"/>
                 <w:bCs w:val="false"/>
                 <w:color w:val="000000"/>
@@ -5643,7 +5643,7 @@
             </w:pPr>
             <w:r>
               <w:rPr>
-                <w:rFonts w:ascii="Times New Roman" w:cs="Times New Roman" w:eastAsia="Songti SC" w:hAnsi="Times New Roman"/>
+                <w:rFonts w:ascii="Times New Roman" w:cs="Times New Roman" w:eastAsia="Noto Serif CJK SC" w:hAnsi="Times New Roman"/>
                 <w:b w:val="false"/>
                 <w:bCs w:val="false"/>
                 <w:color w:val="000000"/>
@@ -5677,7 +5677,7 @@
             </w:pPr>
             <w:r>
               <w:rPr>
-                <w:rFonts w:ascii="Times New Roman" w:cs="Times New Roman" w:eastAsia="Songti SC" w:hAnsi="Times New Roman"/>
+                <w:rFonts w:ascii="Times New Roman" w:cs="Times New Roman" w:eastAsia="Noto Serif CJK SC" w:hAnsi="Times New Roman"/>
                 <w:b w:val="false"/>
                 <w:bCs w:val="false"/>
                 <w:color w:val="000000"/>
@@ -5711,7 +5711,7 @@
             </w:pPr>
             <w:r>
               <w:rPr>
-                <w:rFonts w:ascii="Times New Roman" w:cs="Times New Roman" w:eastAsia="Songti SC" w:hAnsi="Times New Roman"/>
+                <w:rFonts w:ascii="Times New Roman" w:cs="Times New Roman" w:eastAsia="Noto Serif CJK SC" w:hAnsi="Times New Roman"/>
                 <w:b w:val="false"/>
                 <w:bCs w:val="false"/>
                 <w:color w:val="000000"/>
@@ -5745,7 +5745,7 @@
             </w:pPr>
             <w:r>
               <w:rPr>
-                <w:rFonts w:ascii="Times New Roman" w:cs="Times New Roman" w:eastAsia="Songti SC" w:hAnsi="Times New Roman"/>
+                <w:rFonts w:ascii="Times New Roman" w:cs="Times New Roman" w:eastAsia="Noto Serif CJK SC" w:hAnsi="Times New Roman"/>
                 <w:b w:val="false"/>
                 <w:bCs w:val="false"/>
                 <w:color w:val="000000"/>
@@ -5779,7 +5779,7 @@
             </w:pPr>
             <w:r>
               <w:rPr>
-                <w:rFonts w:ascii="Times New Roman" w:cs="Times New Roman" w:eastAsia="Songti SC" w:hAnsi="Times New Roman"/>
+                <w:rFonts w:ascii="Times New Roman" w:cs="Times New Roman" w:eastAsia="Noto Serif CJK SC" w:hAnsi="Times New Roman"/>
                 <w:b w:val="false"/>
                 <w:bCs w:val="false"/>
                 <w:color w:val="000000"/>
@@ -5815,7 +5815,7 @@
             </w:pPr>
             <w:r>
               <w:rPr>
-                <w:rFonts w:ascii="Times New Roman" w:cs="Times New Roman" w:eastAsia="Songti SC" w:hAnsi="Times New Roman"/>
+                <w:rFonts w:ascii="Times New Roman" w:cs="Times New Roman" w:eastAsia="Noto Serif CJK SC" w:hAnsi="Times New Roman"/>
                 <w:b w:val="false"/>
                 <w:bCs w:val="false"/>
                 <w:color w:val="000000"/>
@@ -5849,7 +5849,7 @@
             </w:pPr>
             <w:r>
               <w:rPr>
-                <w:rFonts w:ascii="Times New Roman" w:cs="Times New Roman" w:eastAsia="Songti SC" w:hAnsi="Times New Roman"/>
+                <w:rFonts w:ascii="Times New Roman" w:cs="Times New Roman" w:eastAsia="Noto Serif CJK SC" w:hAnsi="Times New Roman"/>
                 <w:b w:val="false"/>
                 <w:bCs w:val="false"/>
                 <w:color w:val="000000"/>
@@ -5883,7 +5883,7 @@
             </w:pPr>
             <w:r>
               <w:rPr>
-                <w:rFonts w:ascii="Times New Roman" w:cs="Times New Roman" w:eastAsia="Songti SC" w:hAnsi="Times New Roman"/>
+                <w:rFonts w:ascii="Times New Roman" w:cs="Times New Roman" w:eastAsia="Noto Serif CJK SC" w:hAnsi="Times New Roman"/>
                 <w:b w:val="false"/>
                 <w:bCs w:val="false"/>
                 <w:color w:val="000000"/>
@@ -5917,7 +5917,7 @@
             </w:pPr>
             <w:r>
               <w:rPr>
-                <w:rFonts w:ascii="Times New Roman" w:cs="Times New Roman" w:eastAsia="Songti SC" w:hAnsi="Times New Roman"/>
+                <w:rFonts w:ascii="Times New Roman" w:cs="Times New Roman" w:eastAsia="Noto Serif CJK SC" w:hAnsi="Times New Roman"/>
                 <w:b w:val="false"/>
                 <w:bCs w:val="false"/>
                 <w:color w:val="000000"/>
@@ -5951,7 +5951,7 @@
             </w:pPr>
             <w:r>
               <w:rPr>
-                <w:rFonts w:ascii="Times New Roman" w:cs="Times New Roman" w:eastAsia="Songti SC" w:hAnsi="Times New Roman"/>
+                <w:rFonts w:ascii="Times New Roman" w:cs="Times New Roman" w:eastAsia="Noto Serif CJK SC" w:hAnsi="Times New Roman"/>
                 <w:b w:val="false"/>
                 <w:bCs w:val="false"/>
                 <w:color w:val="000000"/>
@@ -5987,7 +5987,7 @@
             </w:pPr>
             <w:r>
               <w:rPr>
-                <w:rFonts w:ascii="Times New Roman" w:cs="Times New Roman" w:eastAsia="Songti SC" w:hAnsi="Times New Roman"/>
+                <w:rFonts w:ascii="Times New Roman" w:cs="Times New Roman" w:eastAsia="Noto Serif CJK SC" w:hAnsi="Times New Roman"/>
                 <w:b w:val="false"/>
                 <w:bCs w:val="false"/>
                 <w:color w:val="000000"/>
@@ -6021,7 +6021,7 @@
             </w:pPr>
             <w:r>
               <w:rPr>
-                <w:rFonts w:ascii="Times New Roman" w:cs="Times New Roman" w:eastAsia="Songti SC" w:hAnsi="Times New Roman"/>
+                <w:rFonts w:ascii="Times New Roman" w:cs="Times New Roman" w:eastAsia="Noto Serif CJK SC" w:hAnsi="Times New Roman"/>
                 <w:b w:val="false"/>
                 <w:bCs w:val="false"/>
                 <w:color w:val="000000"/>
@@ -6055,7 +6055,7 @@
             </w:pPr>
             <w:r>
               <w:rPr>
-                <w:rFonts w:ascii="Times New Roman" w:cs="Times New Roman" w:eastAsia="Songti SC" w:hAnsi="Times New Roman"/>
+                <w:rFonts w:ascii="Times New Roman" w:cs="Times New Roman" w:eastAsia="Noto Serif CJK SC" w:hAnsi="Times New Roman"/>
                 <w:b w:val="false"/>
                 <w:bCs w:val="false"/>
                 <w:color w:val="000000"/>
@@ -6089,7 +6089,7 @@
             </w:pPr>
             <w:r>
               <w:rPr>
-                <w:rFonts w:ascii="Times New Roman" w:cs="Times New Roman" w:eastAsia="Songti SC" w:hAnsi="Times New Roman"/>
+                <w:rFonts w:ascii="Times New Roman" w:cs="Times New Roman" w:eastAsia="Noto Serif CJK SC" w:hAnsi="Times New Roman"/>
                 <w:b w:val="false"/>
                 <w:bCs w:val="false"/>
                 <w:color w:val="000000"/>
@@ -6123,7 +6123,7 @@
             </w:pPr>
             <w:r>
               <w:rPr>
-                <w:rFonts w:ascii="Times New Roman" w:cs="Times New Roman" w:eastAsia="Songti SC" w:hAnsi="Times New Roman"/>
+                <w:rFonts w:ascii="Times New Roman" w:cs="Times New Roman" w:eastAsia="Noto Serif CJK SC" w:hAnsi="Times New Roman"/>
                 <w:b w:val="false"/>
                 <w:bCs w:val="false"/>
                 <w:color w:val="000000"/>
@@ -6159,7 +6159,7 @@
             </w:pPr>
             <w:r>
               <w:rPr>
-                <w:rFonts w:ascii="Times New Roman" w:cs="Times New Roman" w:eastAsia="Songti SC" w:hAnsi="Times New Roman"/>
+                <w:rFonts w:ascii="Times New Roman" w:cs="Times New Roman" w:eastAsia="Noto Serif CJK SC" w:hAnsi="Times New Roman"/>
                 <w:b w:val="false"/>
                 <w:bCs w:val="false"/>
                 <w:color w:val="000000"/>
@@ -6193,7 +6193,7 @@
             </w:pPr>
             <w:r>
               <w:rPr>
-                <w:rFonts w:ascii="Times New Roman" w:cs="Times New Roman" w:eastAsia="Songti SC" w:hAnsi="Times New Roman"/>
+                <w:rFonts w:ascii="Times New Roman" w:cs="Times New Roman" w:eastAsia="Noto Serif CJK SC" w:hAnsi="Times New Roman"/>
                 <w:b w:val="false"/>
                 <w:bCs w:val="false"/>
                 <w:color w:val="000000"/>
@@ -6227,7 +6227,7 @@
             </w:pPr>
             <w:r>
               <w:rPr>
-                <w:rFonts w:ascii="Times New Roman" w:cs="Times New Roman" w:eastAsia="Songti SC" w:hAnsi="Times New Roman"/>
+                <w:rFonts w:ascii="Times New Roman" w:cs="Times New Roman" w:eastAsia="Noto Serif CJK SC" w:hAnsi="Times New Roman"/>
                 <w:b w:val="false"/>
                 <w:bCs w:val="false"/>
                 <w:color w:val="000000"/>
@@ -6261,7 +6261,7 @@
             </w:pPr>
             <w:r>
               <w:rPr>
-                <w:rFonts w:ascii="Times New Roman" w:cs="Times New Roman" w:eastAsia="Songti SC" w:hAnsi="Times New Roman"/>
+                <w:rFonts w:ascii="Times New Roman" w:cs="Times New Roman" w:eastAsia="Noto Serif CJK SC" w:hAnsi="Times New Roman"/>
                 <w:b w:val="false"/>
                 <w:bCs w:val="false"/>
                 <w:color w:val="000000"/>
@@ -6295,7 +6295,7 @@
             </w:pPr>
             <w:r>
               <w:rPr>
-                <w:rFonts w:ascii="Times New Roman" w:cs="Times New Roman" w:eastAsia="Songti SC" w:hAnsi="Times New Roman"/>
+                <w:rFonts w:ascii="Times New Roman" w:cs="Times New Roman" w:eastAsia="Noto Serif CJK SC" w:hAnsi="Times New Roman"/>
                 <w:b w:val="false"/>
                 <w:bCs w:val="false"/>
                 <w:color w:val="000000"/>
@@ -6331,7 +6331,7 @@
             </w:pPr>
             <w:r>
               <w:rPr>
-                <w:rFonts w:ascii="Times New Roman" w:cs="Times New Roman" w:eastAsia="Songti SC" w:hAnsi="Times New Roman"/>
+                <w:rFonts w:ascii="Times New Roman" w:cs="Times New Roman" w:eastAsia="Noto Serif CJK SC" w:hAnsi="Times New Roman"/>
                 <w:b w:val="false"/>
                 <w:bCs w:val="false"/>
                 <w:color w:val="000000"/>
@@ -6365,7 +6365,7 @@
             </w:pPr>
             <w:r>
               <w:rPr>
-                <w:rFonts w:ascii="Times New Roman" w:cs="Times New Roman" w:eastAsia="Songti SC" w:hAnsi="Times New Roman"/>
+                <w:rFonts w:ascii="Times New Roman" w:cs="Times New Roman" w:eastAsia="Noto Serif CJK SC" w:hAnsi="Times New Roman"/>
                 <w:b w:val="false"/>
                 <w:bCs w:val="false"/>
                 <w:color w:val="000000"/>
@@ -6399,7 +6399,7 @@
             </w:pPr>
             <w:r>
               <w:rPr>
-                <w:rFonts w:ascii="Times New Roman" w:cs="Times New Roman" w:eastAsia="Songti SC" w:hAnsi="Times New Roman"/>
+                <w:rFonts w:ascii="Times New Roman" w:cs="Times New Roman" w:eastAsia="Noto Serif CJK SC" w:hAnsi="Times New Roman"/>
                 <w:b w:val="false"/>
                 <w:bCs w:val="false"/>
                 <w:color w:val="000000"/>
@@ -6433,7 +6433,7 @@
             </w:pPr>
             <w:r>
               <w:rPr>
-                <w:rFonts w:ascii="Times New Roman" w:cs="Times New Roman" w:eastAsia="Songti SC" w:hAnsi="Times New Roman"/>
+                <w:rFonts w:ascii="Times New Roman" w:cs="Times New Roman" w:eastAsia="Noto Serif CJK SC" w:hAnsi="Times New Roman"/>
                 <w:b w:val="false"/>
                 <w:bCs w:val="false"/>
                 <w:color w:val="000000"/>
@@ -6467,7 +6467,7 @@
             </w:pPr>
             <w:r>
               <w:rPr>
-                <w:rFonts w:ascii="Times New Roman" w:cs="Times New Roman" w:eastAsia="Songti SC" w:hAnsi="Times New Roman"/>
+                <w:rFonts w:ascii="Times New Roman" w:cs="Times New Roman" w:eastAsia="Noto Serif CJK SC" w:hAnsi="Times New Roman"/>
                 <w:b w:val="false"/>
                 <w:bCs w:val="false"/>
                 <w:color w:val="000000"/>
@@ -6533,7 +6533,7 @@
       </w:pPr>
       <w:r>
         <w:rPr>
-          <w:rFonts w:ascii="Times New Roman" w:cs="Times New Roman" w:eastAsia="PingFang SC" w:hAnsi="Times New Roman"/>
+          <w:rFonts w:ascii="Times New Roman" w:cs="Times New Roman" w:eastAsia="Noto Sans CJK SC" w:hAnsi="Times New Roman"/>
           <w:color w:val="333333"/>
           <w:sz w:val="18"/>
           <w:szCs w:val="18"/>
@@ -6594,7 +6594,7 @@
       </w:pPr>
       <w:r>
         <w:rPr>
-          <w:rFonts w:ascii="Times New Roman" w:cs="Times New Roman" w:eastAsia="PingFang SC" w:hAnsi="Times New Roman"/>
+          <w:rFonts w:ascii="Times New Roman" w:cs="Times New Roman" w:eastAsia="Noto Sans CJK SC" w:hAnsi="Times New Roman"/>
           <w:color w:val="333333"/>
           <w:sz w:val="18"/>
           <w:szCs w:val="18"/>
@@ -6767,7 +6767,7 @@
       </w:pPr>
       <w:r>
         <w:rPr>
-          <w:rFonts w:ascii="Times New Roman" w:cs="Times New Roman" w:eastAsia="Songti SC" w:hAnsi="Times New Roman"/>
+          <w:rFonts w:ascii="Times New Roman" w:cs="Times New Roman" w:eastAsia="Noto Serif CJK SC" w:hAnsi="Times New Roman"/>
           <w:sz w:val="18"/>
           <w:szCs w:val="18"/>
         </w:rPr>
@@ -6781,7 +6781,7 @@
       </w:pPr>
       <w:r>
         <w:rPr>
-          <w:rFonts w:ascii="Times New Roman" w:cs="Times New Roman" w:eastAsia="Songti SC" w:hAnsi="Times New Roman"/>
+          <w:rFonts w:ascii="Times New Roman" w:cs="Times New Roman" w:eastAsia="Noto Serif CJK SC" w:hAnsi="Times New Roman"/>
           <w:sz w:val="18"/>
           <w:szCs w:val="18"/>
         </w:rPr>
@@ -6795,7 +6795,7 @@
       </w:pPr>
       <w:r>
         <w:rPr>
-          <w:rFonts w:ascii="Times New Roman" w:cs="Times New Roman" w:eastAsia="Songti SC" w:hAnsi="Times New Roman"/>
+          <w:rFonts w:ascii="Times New Roman" w:cs="Times New Roman" w:eastAsia="Noto Serif CJK SC" w:hAnsi="Times New Roman"/>
           <w:sz w:val="18"/>
           <w:szCs w:val="18"/>
         </w:rPr>
@@ -6809,7 +6809,7 @@
       </w:pPr>
       <w:r>
         <w:rPr>
-          <w:rFonts w:ascii="Times New Roman" w:cs="Times New Roman" w:eastAsia="Songti SC" w:hAnsi="Times New Roman"/>
+          <w:rFonts w:ascii="Times New Roman" w:cs="Times New Roman" w:eastAsia="Noto Serif CJK SC" w:hAnsi="Times New Roman"/>
           <w:sz w:val="18"/>
           <w:szCs w:val="18"/>
         </w:rPr>
@@ -6823,7 +6823,7 @@
       </w:pPr>
       <w:r>
         <w:rPr>
-          <w:rFonts w:ascii="Times New Roman" w:cs="Times New Roman" w:eastAsia="Songti SC" w:hAnsi="Times New Roman"/>
+          <w:rFonts w:ascii="Times New Roman" w:cs="Times New Roman" w:eastAsia="Noto Serif CJK SC" w:hAnsi="Times New Roman"/>
           <w:sz w:val="18"/>
           <w:szCs w:val="18"/>
         </w:rPr>
@@ -6837,7 +6837,7 @@
       </w:pPr>
       <w:r>
         <w:rPr>
-          <w:rFonts w:ascii="Times New Roman" w:cs="Times New Roman" w:eastAsia="Songti SC" w:hAnsi="Times New Roman"/>
+          <w:rFonts w:ascii="Times New Roman" w:cs="Times New Roman" w:eastAsia="Noto Serif CJK SC" w:hAnsi="Times New Roman"/>
           <w:sz w:val="18"/>
           <w:szCs w:val="18"/>
         </w:rPr>
@@ -6851,7 +6851,7 @@
       </w:pPr>
       <w:r>
         <w:rPr>
-          <w:rFonts w:ascii="Times New Roman" w:cs="Times New Roman" w:eastAsia="Songti SC" w:hAnsi="Times New Roman"/>
+          <w:rFonts w:ascii="Times New Roman" w:cs="Times New Roman" w:eastAsia="Noto Serif CJK SC" w:hAnsi="Times New Roman"/>
           <w:sz w:val="18"/>
           <w:szCs w:val="18"/>
         </w:rPr>
@@ -6865,7 +6865,7 @@
       </w:pPr>
       <w:r>
         <w:rPr>
-          <w:rFonts w:ascii="Times New Roman" w:cs="Times New Roman" w:eastAsia="Songti SC" w:hAnsi="Times New Roman"/>
+          <w:rFonts w:ascii="Times New Roman" w:cs="Times New Roman" w:eastAsia="Noto Serif CJK SC" w:hAnsi="Times New Roman"/>
           <w:sz w:val="18"/>
           <w:szCs w:val="18"/>
         </w:rPr>
@@ -6879,7 +6879,7 @@
       </w:pPr>
       <w:r>
         <w:rPr>
-          <w:rFonts w:ascii="Times New Roman" w:cs="Times New Roman" w:eastAsia="Songti SC" w:hAnsi="Times New Roman"/>
+          <w:rFonts w:ascii="Times New Roman" w:cs="Times New Roman" w:eastAsia="Noto Serif CJK SC" w:hAnsi="Times New Roman"/>
           <w:sz w:val="18"/>
           <w:szCs w:val="18"/>
         </w:rPr>
@@ -6893,7 +6893,7 @@
       </w:pPr>
       <w:r>
         <w:rPr>
-          <w:rFonts w:ascii="Times New Roman" w:cs="Times New Roman" w:eastAsia="Songti SC" w:hAnsi="Times New Roman"/>
+          <w:rFonts w:ascii="Times New Roman" w:cs="Times New Roman" w:eastAsia="Noto Serif CJK SC" w:hAnsi="Times New Roman"/>
           <w:sz w:val="18"/>
           <w:szCs w:val="18"/>
         </w:rPr>
@@ -6907,7 +6907,7 @@
       </w:pPr>
       <w:r>
         <w:rPr>
-          <w:rFonts w:ascii="Times New Roman" w:cs="Times New Roman" w:eastAsia="Songti SC" w:hAnsi="Times New Roman"/>
+          <w:rFonts w:ascii="Times New Roman" w:cs="Times New Roman" w:eastAsia="Noto Serif CJK SC" w:hAnsi="Times New Roman"/>
           <w:sz w:val="18"/>
           <w:szCs w:val="18"/>
         </w:rPr>
@@ -6921,7 +6921,7 @@
       </w:pPr>
       <w:r>
         <w:rPr>
-          <w:rFonts w:ascii="Times New Roman" w:cs="Times New Roman" w:eastAsia="Songti SC" w:hAnsi="Times New Roman"/>
+          <w:rFonts w:ascii="Times New Roman" w:cs="Times New Roman" w:eastAsia="Noto Serif CJK SC" w:hAnsi="Times New Roman"/>
           <w:sz w:val="18"/>
           <w:szCs w:val="18"/>
         </w:rPr>
@@ -6935,7 +6935,7 @@
       </w:pPr>
       <w:r>
         <w:rPr>
-          <w:rFonts w:ascii="Times New Roman" w:cs="Times New Roman" w:eastAsia="Songti SC" w:hAnsi="Times New Roman"/>
+          <w:rFonts w:ascii="Times New Roman" w:cs="Times New Roman" w:eastAsia="Noto Serif CJK SC" w:hAnsi="Times New Roman"/>
           <w:sz w:val="18"/>
           <w:szCs w:val="18"/>
         </w:rPr>
@@ -6949,7 +6949,7 @@
       </w:pPr>
       <w:r>
         <w:rPr>
-          <w:rFonts w:ascii="Times New Roman" w:cs="Times New Roman" w:eastAsia="Songti SC" w:hAnsi="Times New Roman"/>
+          <w:rFonts w:ascii="Times New Roman" w:cs="Times New Roman" w:eastAsia="Noto Serif CJK SC" w:hAnsi="Times New Roman"/>
           <w:sz w:val="18"/>
           <w:szCs w:val="18"/>
         </w:rPr>
@@ -6963,7 +6963,7 @@
       </w:pPr>
       <w:r>
         <w:rPr>
-          <w:rFonts w:ascii="Times New Roman" w:cs="Times New Roman" w:eastAsia="Songti SC" w:hAnsi="Times New Roman"/>
+          <w:rFonts w:ascii="Times New Roman" w:cs="Times New Roman" w:eastAsia="Noto Serif CJK SC" w:hAnsi="Times New Roman"/>
           <w:sz w:val="18"/>
           <w:szCs w:val="18"/>
         </w:rPr>
@@ -7057,7 +7057,7 @@
             </w:pPr>
             <w:r>
               <w:rPr>
-                <w:rFonts w:ascii="Times New Roman" w:cs="Times New Roman" w:eastAsia="Songti SC" w:hAnsi="Times New Roman"/>
+                <w:rFonts w:ascii="Times New Roman" w:cs="Times New Roman" w:eastAsia="Noto Serif CJK SC" w:hAnsi="Times New Roman"/>
                 <w:b/>
                 <w:bCs/>
                 <w:color w:val="FFFFFF"/>
@@ -7091,7 +7091,7 @@
             </w:pPr>
             <w:r>
               <w:rPr>
-                <w:rFonts w:ascii="Times New Roman" w:cs="Times New Roman" w:eastAsia="Songti SC" w:hAnsi="Times New Roman"/>
+                <w:rFonts w:ascii="Times New Roman" w:cs="Times New Roman" w:eastAsia="Noto Serif CJK SC" w:hAnsi="Times New Roman"/>
                 <w:b/>
                 <w:bCs/>
                 <w:color w:val="FFFFFF"/>
@@ -7125,7 +7125,7 @@
             </w:pPr>
             <w:r>
               <w:rPr>
-                <w:rFonts w:ascii="Times New Roman" w:cs="Times New Roman" w:eastAsia="Songti SC" w:hAnsi="Times New Roman"/>
+                <w:rFonts w:ascii="Times New Roman" w:cs="Times New Roman" w:eastAsia="Noto Serif CJK SC" w:hAnsi="Times New Roman"/>
                 <w:b/>
                 <w:bCs/>
                 <w:color w:val="FFFFFF"/>
@@ -7159,7 +7159,7 @@
             </w:pPr>
             <w:r>
               <w:rPr>
-                <w:rFonts w:ascii="Times New Roman" w:cs="Times New Roman" w:eastAsia="Songti SC" w:hAnsi="Times New Roman"/>
+                <w:rFonts w:ascii="Times New Roman" w:cs="Times New Roman" w:eastAsia="Noto Serif CJK SC" w:hAnsi="Times New Roman"/>
                 <w:b/>
                 <w:bCs/>
                 <w:color w:val="FFFFFF"/>
@@ -7193,7 +7193,7 @@
             </w:pPr>
             <w:r>
               <w:rPr>
-                <w:rFonts w:ascii="Times New Roman" w:cs="Times New Roman" w:eastAsia="Songti SC" w:hAnsi="Times New Roman"/>
+                <w:rFonts w:ascii="Times New Roman" w:cs="Times New Roman" w:eastAsia="Noto Serif CJK SC" w:hAnsi="Times New Roman"/>
                 <w:b/>
                 <w:bCs/>
                 <w:color w:val="FFFFFF"/>
@@ -7229,7 +7229,7 @@
             </w:pPr>
             <w:r>
               <w:rPr>
-                <w:rFonts w:ascii="Times New Roman" w:cs="Times New Roman" w:eastAsia="Songti SC" w:hAnsi="Times New Roman"/>
+                <w:rFonts w:ascii="Times New Roman" w:cs="Times New Roman" w:eastAsia="Noto Serif CJK SC" w:hAnsi="Times New Roman"/>
                 <w:b w:val="false"/>
                 <w:bCs w:val="false"/>
                 <w:color w:val="000000"/>
@@ -7263,7 +7263,7 @@
             </w:pPr>
             <w:r>
               <w:rPr>
-                <w:rFonts w:ascii="Times New Roman" w:cs="Times New Roman" w:eastAsia="Songti SC" w:hAnsi="Times New Roman"/>
+                <w:rFonts w:ascii="Times New Roman" w:cs="Times New Roman" w:eastAsia="Noto Serif CJK SC" w:hAnsi="Times New Roman"/>
                 <w:b w:val="false"/>
                 <w:bCs w:val="false"/>
                 <w:color w:val="000000"/>
@@ -7297,7 +7297,7 @@
             </w:pPr>
             <w:r>
               <w:rPr>
-                <w:rFonts w:ascii="Times New Roman" w:cs="Times New Roman" w:eastAsia="Songti SC" w:hAnsi="Times New Roman"/>
+                <w:rFonts w:ascii="Times New Roman" w:cs="Times New Roman" w:eastAsia="Noto Serif CJK SC" w:hAnsi="Times New Roman"/>
                 <w:b w:val="false"/>
                 <w:bCs w:val="false"/>
                 <w:color w:val="000000"/>
@@ -7331,7 +7331,7 @@
             </w:pPr>
             <w:r>
               <w:rPr>
-                <w:rFonts w:ascii="Times New Roman" w:cs="Times New Roman" w:eastAsia="Songti SC" w:hAnsi="Times New Roman"/>
+                <w:rFonts w:ascii="Times New Roman" w:cs="Times New Roman" w:eastAsia="Noto Serif CJK SC" w:hAnsi="Times New Roman"/>
                 <w:b w:val="false"/>
                 <w:bCs w:val="false"/>
                 <w:color w:val="000000"/>
@@ -7365,7 +7365,7 @@
             </w:pPr>
             <w:r>
               <w:rPr>
-                <w:rFonts w:ascii="Times New Roman" w:cs="Times New Roman" w:eastAsia="Songti SC" w:hAnsi="Times New Roman"/>
+                <w:rFonts w:ascii="Times New Roman" w:cs="Times New Roman" w:eastAsia="Noto Serif CJK SC" w:hAnsi="Times New Roman"/>
                 <w:b w:val="false"/>
                 <w:bCs w:val="false"/>
                 <w:color w:val="000000"/>
@@ -7401,7 +7401,7 @@
             </w:pPr>
             <w:r>
               <w:rPr>
-                <w:rFonts w:ascii="Times New Roman" w:cs="Times New Roman" w:eastAsia="Songti SC" w:hAnsi="Times New Roman"/>
+                <w:rFonts w:ascii="Times New Roman" w:cs="Times New Roman" w:eastAsia="Noto Serif CJK SC" w:hAnsi="Times New Roman"/>
                 <w:b w:val="false"/>
                 <w:bCs w:val="false"/>
                 <w:color w:val="000000"/>
@@ -7435,7 +7435,7 @@
             </w:pPr>
             <w:r>
               <w:rPr>
-                <w:rFonts w:ascii="Times New Roman" w:cs="Times New Roman" w:eastAsia="Songti SC" w:hAnsi="Times New Roman"/>
+                <w:rFonts w:ascii="Times New Roman" w:cs="Times New Roman" w:eastAsia="Noto Serif CJK SC" w:hAnsi="Times New Roman"/>
                 <w:b w:val="false"/>
                 <w:bCs w:val="false"/>
                 <w:color w:val="000000"/>
@@ -7469,7 +7469,7 @@
             </w:pPr>
             <w:r>
               <w:rPr>
-                <w:rFonts w:ascii="Times New Roman" w:cs="Times New Roman" w:eastAsia="Songti SC" w:hAnsi="Times New Roman"/>
+                <w:rFonts w:ascii="Times New Roman" w:cs="Times New Roman" w:eastAsia="Noto Serif CJK SC" w:hAnsi="Times New Roman"/>
                 <w:b w:val="false"/>
                 <w:bCs w:val="false"/>
                 <w:color w:val="000000"/>
@@ -7503,7 +7503,7 @@
             </w:pPr>
             <w:r>
               <w:rPr>
-                <w:rFonts w:ascii="Times New Roman" w:cs="Times New Roman" w:eastAsia="Songti SC" w:hAnsi="Times New Roman"/>
+                <w:rFonts w:ascii="Times New Roman" w:cs="Times New Roman" w:eastAsia="Noto Serif CJK SC" w:hAnsi="Times New Roman"/>
                 <w:b w:val="false"/>
                 <w:bCs w:val="false"/>
                 <w:color w:val="000000"/>
@@ -7537,7 +7537,7 @@
             </w:pPr>
             <w:r>
               <w:rPr>
-                <w:rFonts w:ascii="Times New Roman" w:cs="Times New Roman" w:eastAsia="Songti SC" w:hAnsi="Times New Roman"/>
+                <w:rFonts w:ascii="Times New Roman" w:cs="Times New Roman" w:eastAsia="Noto Serif CJK SC" w:hAnsi="Times New Roman"/>
                 <w:b w:val="false"/>
                 <w:bCs w:val="false"/>
                 <w:color w:val="000000"/>
@@ -7573,7 +7573,7 @@
             </w:pPr>
             <w:r>
               <w:rPr>
-                <w:rFonts w:ascii="Times New Roman" w:cs="Times New Roman" w:eastAsia="Songti SC" w:hAnsi="Times New Roman"/>
+                <w:rFonts w:ascii="Times New Roman" w:cs="Times New Roman" w:eastAsia="Noto Serif CJK SC" w:hAnsi="Times New Roman"/>
                 <w:b w:val="false"/>
                 <w:bCs w:val="false"/>
                 <w:color w:val="000000"/>
@@ -7607,7 +7607,7 @@
             </w:pPr>
             <w:r>
               <w:rPr>
-                <w:rFonts w:ascii="Times New Roman" w:cs="Times New Roman" w:eastAsia="Songti SC" w:hAnsi="Times New Roman"/>
+                <w:rFonts w:ascii="Times New Roman" w:cs="Times New Roman" w:eastAsia="Noto Serif CJK SC" w:hAnsi="Times New Roman"/>
                 <w:b w:val="false"/>
                 <w:bCs w:val="false"/>
                 <w:color w:val="000000"/>
@@ -7641,7 +7641,7 @@
             </w:pPr>
             <w:r>
               <w:rPr>
-                <w:rFonts w:ascii="Times New Roman" w:cs="Times New Roman" w:eastAsia="Songti SC" w:hAnsi="Times New Roman"/>
+                <w:rFonts w:ascii="Times New Roman" w:cs="Times New Roman" w:eastAsia="Noto Serif CJK SC" w:hAnsi="Times New Roman"/>
                 <w:b w:val="false"/>
                 <w:bCs w:val="false"/>
                 <w:color w:val="000000"/>
@@ -7675,7 +7675,7 @@
             </w:pPr>
             <w:r>
               <w:rPr>
-                <w:rFonts w:ascii="Times New Roman" w:cs="Times New Roman" w:eastAsia="Songti SC" w:hAnsi="Times New Roman"/>
+                <w:rFonts w:ascii="Times New Roman" w:cs="Times New Roman" w:eastAsia="Noto Serif CJK SC" w:hAnsi="Times New Roman"/>
                 <w:b w:val="false"/>
                 <w:bCs w:val="false"/>
                 <w:color w:val="000000"/>
@@ -7709,7 +7709,7 @@
             </w:pPr>
             <w:r>
               <w:rPr>
-                <w:rFonts w:ascii="Times New Roman" w:cs="Times New Roman" w:eastAsia="Songti SC" w:hAnsi="Times New Roman"/>
+                <w:rFonts w:ascii="Times New Roman" w:cs="Times New Roman" w:eastAsia="Noto Serif CJK SC" w:hAnsi="Times New Roman"/>
                 <w:b w:val="false"/>
                 <w:bCs w:val="false"/>
                 <w:color w:val="000000"/>
@@ -7745,7 +7745,7 @@
             </w:pPr>
             <w:r>
               <w:rPr>
-                <w:rFonts w:ascii="Times New Roman" w:cs="Times New Roman" w:eastAsia="Songti SC" w:hAnsi="Times New Roman"/>
+                <w:rFonts w:ascii="Times New Roman" w:cs="Times New Roman" w:eastAsia="Noto Serif CJK SC" w:hAnsi="Times New Roman"/>
                 <w:b w:val="false"/>
                 <w:bCs w:val="false"/>
                 <w:color w:val="000000"/>
@@ -7779,7 +7779,7 @@
             </w:pPr>
             <w:r>
               <w:rPr>
-                <w:rFonts w:ascii="Times New Roman" w:cs="Times New Roman" w:eastAsia="Songti SC" w:hAnsi="Times New Roman"/>
+                <w:rFonts w:ascii="Times New Roman" w:cs="Times New Roman" w:eastAsia="Noto Serif CJK SC" w:hAnsi="Times New Roman"/>
                 <w:b w:val="false"/>
                 <w:bCs w:val="false"/>
                 <w:color w:val="000000"/>
@@ -7813,7 +7813,7 @@
             </w:pPr>
             <w:r>
               <w:rPr>
-                <w:rFonts w:ascii="Times New Roman" w:cs="Times New Roman" w:eastAsia="Songti SC" w:hAnsi="Times New Roman"/>
+                <w:rFonts w:ascii="Times New Roman" w:cs="Times New Roman" w:eastAsia="Noto Serif CJK SC" w:hAnsi="Times New Roman"/>
                 <w:b w:val="false"/>
                 <w:bCs w:val="false"/>
                 <w:color w:val="000000"/>
@@ -7847,7 +7847,7 @@
             </w:pPr>
             <w:r>
               <w:rPr>
-                <w:rFonts w:ascii="Times New Roman" w:cs="Times New Roman" w:eastAsia="Songti SC" w:hAnsi="Times New Roman"/>
+                <w:rFonts w:ascii="Times New Roman" w:cs="Times New Roman" w:eastAsia="Noto Serif CJK SC" w:hAnsi="Times New Roman"/>
                 <w:b w:val="false"/>
                 <w:bCs w:val="false"/>
                 <w:color w:val="000000"/>
@@ -7881,7 +7881,7 @@
             </w:pPr>
             <w:r>
               <w:rPr>
-                <w:rFonts w:ascii="Times New Roman" w:cs="Times New Roman" w:eastAsia="Songti SC" w:hAnsi="Times New Roman"/>
+                <w:rFonts w:ascii="Times New Roman" w:cs="Times New Roman" w:eastAsia="Noto Serif CJK SC" w:hAnsi="Times New Roman"/>
                 <w:b w:val="false"/>
                 <w:bCs w:val="false"/>
                 <w:color w:val="000000"/>
@@ -7917,7 +7917,7 @@
             </w:pPr>
             <w:r>
               <w:rPr>
-                <w:rFonts w:ascii="Times New Roman" w:cs="Times New Roman" w:eastAsia="Songti SC" w:hAnsi="Times New Roman"/>
+                <w:rFonts w:ascii="Times New Roman" w:cs="Times New Roman" w:eastAsia="Noto Serif CJK SC" w:hAnsi="Times New Roman"/>
                 <w:b w:val="false"/>
                 <w:bCs w:val="false"/>
                 <w:color w:val="000000"/>
@@ -7951,7 +7951,7 @@
             </w:pPr>
             <w:r>
               <w:rPr>
-                <w:rFonts w:ascii="Times New Roman" w:cs="Times New Roman" w:eastAsia="Songti SC" w:hAnsi="Times New Roman"/>
+                <w:rFonts w:ascii="Times New Roman" w:cs="Times New Roman" w:eastAsia="Noto Serif CJK SC" w:hAnsi="Times New Roman"/>
                 <w:b w:val="false"/>
                 <w:bCs w:val="false"/>
                 <w:color w:val="000000"/>
@@ -7985,7 +7985,7 @@
             </w:pPr>
             <w:r>
               <w:rPr>
-                <w:rFonts w:ascii="Times New Roman" w:cs="Times New Roman" w:eastAsia="Songti SC" w:hAnsi="Times New Roman"/>
+                <w:rFonts w:ascii="Times New Roman" w:cs="Times New Roman" w:eastAsia="Noto Serif CJK SC" w:hAnsi="Times New Roman"/>
                 <w:b w:val="false"/>
                 <w:bCs w:val="false"/>
                 <w:color w:val="000000"/>
@@ -8019,7 +8019,7 @@
             </w:pPr>
             <w:r>
               <w:rPr>
-                <w:rFonts w:ascii="Times New Roman" w:cs="Times New Roman" w:eastAsia="Songti SC" w:hAnsi="Times New Roman"/>
+                <w:rFonts w:ascii="Times New Roman" w:cs="Times New Roman" w:eastAsia="Noto Serif CJK SC" w:hAnsi="Times New Roman"/>
                 <w:b w:val="false"/>
                 <w:bCs w:val="false"/>
                 <w:color w:val="000000"/>
@@ -8053,7 +8053,7 @@
             </w:pPr>
             <w:r>
               <w:rPr>
-                <w:rFonts w:ascii="Times New Roman" w:cs="Times New Roman" w:eastAsia="Songti SC" w:hAnsi="Times New Roman"/>
+                <w:rFonts w:ascii="Times New Roman" w:cs="Times New Roman" w:eastAsia="Noto Serif CJK SC" w:hAnsi="Times New Roman"/>
                 <w:b w:val="false"/>
                 <w:bCs w:val="false"/>
                 <w:color w:val="000000"/>
@@ -8089,7 +8089,7 @@
             </w:pPr>
             <w:r>
               <w:rPr>
-                <w:rFonts w:ascii="Times New Roman" w:cs="Times New Roman" w:eastAsia="Songti SC" w:hAnsi="Times New Roman"/>
+                <w:rFonts w:ascii="Times New Roman" w:cs="Times New Roman" w:eastAsia="Noto Serif CJK SC" w:hAnsi="Times New Roman"/>
                 <w:b w:val="false"/>
                 <w:bCs w:val="false"/>
                 <w:color w:val="000000"/>
@@ -8123,7 +8123,7 @@
             </w:pPr>
             <w:r>
               <w:rPr>
-                <w:rFonts w:ascii="Times New Roman" w:cs="Times New Roman" w:eastAsia="Songti SC" w:hAnsi="Times New Roman"/>
+                <w:rFonts w:ascii="Times New Roman" w:cs="Times New Roman" w:eastAsia="Noto Serif CJK SC" w:hAnsi="Times New Roman"/>
                 <w:b w:val="false"/>
                 <w:bCs w:val="false"/>
                 <w:color w:val="000000"/>
@@ -8157,7 +8157,7 @@
             </w:pPr>
             <w:r>
               <w:rPr>
-                <w:rFonts w:ascii="Times New Roman" w:cs="Times New Roman" w:eastAsia="Songti SC" w:hAnsi="Times New Roman"/>
+                <w:rFonts w:ascii="Times New Roman" w:cs="Times New Roman" w:eastAsia="Noto Serif CJK SC" w:hAnsi="Times New Roman"/>
                 <w:b w:val="false"/>
                 <w:bCs w:val="false"/>
                 <w:color w:val="000000"/>
@@ -8191,7 +8191,7 @@
             </w:pPr>
             <w:r>
               <w:rPr>
-                <w:rFonts w:ascii="Times New Roman" w:cs="Times New Roman" w:eastAsia="Songti SC" w:hAnsi="Times New Roman"/>
+                <w:rFonts w:ascii="Times New Roman" w:cs="Times New Roman" w:eastAsia="Noto Serif CJK SC" w:hAnsi="Times New Roman"/>
                 <w:b w:val="false"/>
                 <w:bCs w:val="false"/>
                 <w:color w:val="000000"/>
@@ -8225,7 +8225,7 @@
             </w:pPr>
             <w:r>
               <w:rPr>
-                <w:rFonts w:ascii="Times New Roman" w:cs="Times New Roman" w:eastAsia="Songti SC" w:hAnsi="Times New Roman"/>
+                <w:rFonts w:ascii="Times New Roman" w:cs="Times New Roman" w:eastAsia="Noto Serif CJK SC" w:hAnsi="Times New Roman"/>
                 <w:b w:val="false"/>
                 <w:bCs w:val="false"/>
                 <w:color w:val="000000"/>
@@ -8261,7 +8261,7 @@
             </w:pPr>
             <w:r>
               <w:rPr>
-                <w:rFonts w:ascii="Times New Roman" w:cs="Times New Roman" w:eastAsia="Songti SC" w:hAnsi="Times New Roman"/>
+                <w:rFonts w:ascii="Times New Roman" w:cs="Times New Roman" w:eastAsia="Noto Serif CJK SC" w:hAnsi="Times New Roman"/>
                 <w:b w:val="false"/>
                 <w:bCs w:val="false"/>
                 <w:color w:val="000000"/>
@@ -8295,7 +8295,7 @@
             </w:pPr>
             <w:r>
               <w:rPr>
-                <w:rFonts w:ascii="Times New Roman" w:cs="Times New Roman" w:eastAsia="Songti SC" w:hAnsi="Times New Roman"/>
+                <w:rFonts w:ascii="Times New Roman" w:cs="Times New Roman" w:eastAsia="Noto Serif CJK SC" w:hAnsi="Times New Roman"/>
                 <w:b w:val="false"/>
                 <w:bCs w:val="false"/>
                 <w:color w:val="000000"/>
@@ -8329,7 +8329,7 @@
             </w:pPr>
             <w:r>
               <w:rPr>
-                <w:rFonts w:ascii="Times New Roman" w:cs="Times New Roman" w:eastAsia="Songti SC" w:hAnsi="Times New Roman"/>
+                <w:rFonts w:ascii="Times New Roman" w:cs="Times New Roman" w:eastAsia="Noto Serif CJK SC" w:hAnsi="Times New Roman"/>
                 <w:b w:val="false"/>
                 <w:bCs w:val="false"/>
                 <w:color w:val="000000"/>
@@ -8363,7 +8363,7 @@
             </w:pPr>
             <w:r>
               <w:rPr>
-                <w:rFonts w:ascii="Times New Roman" w:cs="Times New Roman" w:eastAsia="Songti SC" w:hAnsi="Times New Roman"/>
+                <w:rFonts w:ascii="Times New Roman" w:cs="Times New Roman" w:eastAsia="Noto Serif CJK SC" w:hAnsi="Times New Roman"/>
                 <w:b w:val="false"/>
                 <w:bCs w:val="false"/>
                 <w:color w:val="000000"/>
@@ -8397,7 +8397,7 @@
             </w:pPr>
             <w:r>
               <w:rPr>
-                <w:rFonts w:ascii="Times New Roman" w:cs="Times New Roman" w:eastAsia="Songti SC" w:hAnsi="Times New Roman"/>
+                <w:rFonts w:ascii="Times New Roman" w:cs="Times New Roman" w:eastAsia="Noto Serif CJK SC" w:hAnsi="Times New Roman"/>
                 <w:b w:val="false"/>
                 <w:bCs w:val="false"/>
                 <w:color w:val="000000"/>
@@ -8433,7 +8433,7 @@
             </w:pPr>
             <w:r>
               <w:rPr>
-                <w:rFonts w:ascii="Times New Roman" w:cs="Times New Roman" w:eastAsia="Songti SC" w:hAnsi="Times New Roman"/>
+                <w:rFonts w:ascii="Times New Roman" w:cs="Times New Roman" w:eastAsia="Noto Serif CJK SC" w:hAnsi="Times New Roman"/>
                 <w:b w:val="false"/>
                 <w:bCs w:val="false"/>
                 <w:color w:val="000000"/>
@@ -8467,7 +8467,7 @@
             </w:pPr>
             <w:r>
               <w:rPr>
-                <w:rFonts w:ascii="Times New Roman" w:cs="Times New Roman" w:eastAsia="Songti SC" w:hAnsi="Times New Roman"/>
+                <w:rFonts w:ascii="Times New Roman" w:cs="Times New Roman" w:eastAsia="Noto Serif CJK SC" w:hAnsi="Times New Roman"/>
                 <w:b w:val="false"/>
                 <w:bCs w:val="false"/>
                 <w:color w:val="000000"/>
@@ -8501,7 +8501,7 @@
             </w:pPr>
             <w:r>
               <w:rPr>
-                <w:rFonts w:ascii="Times New Roman" w:cs="Times New Roman" w:eastAsia="Songti SC" w:hAnsi="Times New Roman"/>
+                <w:rFonts w:ascii="Times New Roman" w:cs="Times New Roman" w:eastAsia="Noto Serif CJK SC" w:hAnsi="Times New Roman"/>
                 <w:b w:val="false"/>
                 <w:bCs w:val="false"/>
                 <w:color w:val="000000"/>
@@ -8535,7 +8535,7 @@
             </w:pPr>
             <w:r>
               <w:rPr>
-                <w:rFonts w:ascii="Times New Roman" w:cs="Times New Roman" w:eastAsia="Songti SC" w:hAnsi="Times New Roman"/>
+                <w:rFonts w:ascii="Times New Roman" w:cs="Times New Roman" w:eastAsia="Noto Serif CJK SC" w:hAnsi="Times New Roman"/>
                 <w:b w:val="false"/>
                 <w:bCs w:val="false"/>
                 <w:color w:val="000000"/>
@@ -8569,7 +8569,7 @@
             </w:pPr>
             <w:r>
               <w:rPr>
-                <w:rFonts w:ascii="Times New Roman" w:cs="Times New Roman" w:eastAsia="Songti SC" w:hAnsi="Times New Roman"/>
+                <w:rFonts w:ascii="Times New Roman" w:cs="Times New Roman" w:eastAsia="Noto Serif CJK SC" w:hAnsi="Times New Roman"/>
                 <w:b w:val="false"/>
                 <w:bCs w:val="false"/>
                 <w:color w:val="000000"/>
@@ -8674,7 +8674,7 @@
     </w:pPr>
     <w:r>
       <w:rPr>
-        <w:rFonts w:ascii="Times New Roman" w:cs="Times New Roman" w:eastAsia="Songti SC" w:hAnsi="Times New Roman"/>
+        <w:rFonts w:ascii="Times New Roman" w:cs="Times New Roman" w:eastAsia="Noto Serif CJK SC" w:hAnsi="Times New Roman"/>
         <w:sz w:val="18"/>
         <w:szCs w:val="18"/>
       </w:rPr>
@@ -8842,7 +8842,7 @@
   <w:docDefaults>
     <w:rPrDefault>
       <w:rPr>
-        <w:rFonts w:ascii="Times New Roman" w:cs="Times New Roman" w:eastAsia="Songti SC" w:hAnsi="Times New Roman"/>
+        <w:rFonts w:ascii="Times New Roman" w:cs="Times New Roman" w:eastAsia="Noto Serif CJK SC" w:hAnsi="Times New Roman"/>
         <w:sz w:val="21"/>
         <w:szCs w:val="21"/>
       </w:rPr>
@@ -9030,7 +9030,7 @@
       <w:outlineLvl w:val="0"/>
     </w:pPr>
     <w:rPr>
-      <w:rFonts w:ascii="Times New Roman" w:cs="Times New Roman" w:eastAsia="PingFang SC" w:hAnsi="Times New Roman"/>
+      <w:rFonts w:ascii="Times New Roman" w:cs="Times New Roman" w:eastAsia="Noto Sans CJK SC" w:hAnsi="Times New Roman"/>
       <w:b/>
       <w:bCs/>
       <w:color w:val="1F3864"/>
@@ -9048,7 +9048,7 @@
       <w:outlineLvl w:val="1"/>
     </w:pPr>
     <w:rPr>
-      <w:rFonts w:ascii="Times New Roman" w:cs="Times New Roman" w:eastAsia="PingFang SC" w:hAnsi="Times New Roman"/>
+      <w:rFonts w:ascii="Times New Roman" w:cs="Times New Roman" w:eastAsia="Noto Sans CJK SC" w:hAnsi="Times New Roman"/>
       <w:b/>
       <w:bCs/>
       <w:color w:val="2E5496"/>

</xml_diff>

<commit_message>
report: add brief JCIM-appendix forward reference at end of 实验目的
A simplified one-sentence pointer to the companion JCIM manuscript (full
version stays in appendix D), placed as the closing paragraph of the
objectives section. Rebuild docx + PDF.

Assisted-by: Claude
</commit_message>
<xml_diff>
--- a/report/课程实验报告_BACE.docx
+++ b/report/课程实验报告_BACE.docx
@@ -1076,6 +1076,15 @@
         </w:tc>
       </w:tr>
     </w:tbl>
+    <w:p>
+      <w:pPr>
+        <w:spacing w:after="120" w:line="300"/>
+        <w:jc w:val="both"/>
+      </w:pPr>
+      <w:r>
+        <w:t xml:space="preserve">此外，本项目中跨分子基础模型的 conformal 预测区间评估已扩展为一篇面向《Journal of Chemical Information and Modeling》（JCIM, ACS）的英文论文，系统比较各分子基础模型预测区间的宽度与条件覆盖；其正文与补充材料作为附录 D 全文附于本报告之后。</w:t>
+      </w:r>
+    </w:p>
     <w:p>
       <w:pPr>
         <w:pStyle w:val="Heading1"/>

</xml_diff>